<commit_message>
memoire: integre validation Run21 (simulateur) + couverture morphologies (XGBoost)
- §III.3.2 : paragraphe "couverture des morphologies" — l'ajout de Run21
  (graduel) ne profite pas a la prediction des essais sprint (R2 +0,29 -> +0,18),
  presente comme coherence du mecanisme (meme morphologie requise), pas un echec.
- §III.6.5 : Run21 confirme "predire-puis-confirmer" — rupture a 13,1 h dans
  la bande predite [13-20,5 h] ; 2e representant de la morphologie graduelle ;
  separation explicite des deux outils (jumeau = duree de vie, XGBoost = CR instantane).
- Tableau III.2 (R2 +0,29) inchange = baseline sans Run21.
- Word regenere (Memoire_M2_Corrosion_BATOUMBI.docx).

Co-Authored-By: Claude Opus 4.8 <noreply@anthropic.com>
</commit_message>
<xml_diff>
--- a/memoire/Memoire_M2_Corrosion_BATOUMBI.docx
+++ b/memoire/Memoire_M2_Corrosion_BATOUMBI.docx
@@ -26011,6 +26011,120 @@
         <w:t xml:space="preserve">— non le volume de données — qui conditionne la fiabilité. Ce constat fonde directement le plan d’essais complémentaires (§III.6).</w:t>
       </w:r>
     </w:p>
+    <w:p>
+      <w:pPr>
+        <w:pStyle w:val="BodyText"/>
+      </w:pPr>
+      <w:r>
+        <w:t xml:space="preserve">Cette couverture comporte une seconde dimension, qualitative : la</w:t>
+      </w:r>
+      <w:r>
+        <w:t xml:space="preserve"> </w:t>
+      </w:r>
+      <w:r>
+        <w:rPr>
+          <w:b/>
+          <w:bCs/>
+        </w:rPr>
+        <w:t xml:space="preserve">morphologie de la dégradation</w:t>
+      </w:r>
+      <w:r>
+        <w:t xml:space="preserve">. Le modèle estime le taux de corrosion</w:t>
+      </w:r>
+      <w:r>
+        <w:t xml:space="preserve"> </w:t>
+      </w:r>
+      <w:r>
+        <w:rPr>
+          <w:i/>
+          <w:iCs/>
+        </w:rPr>
+        <w:t xml:space="preserve">CR</w:t>
+      </w:r>
+      <w:r>
+        <w:t xml:space="preserve"> </w:t>
+      </w:r>
+      <w:r>
+        <w:t xml:space="preserve">instant par instant à partir de l’état de dégradation et de la température ; il ne restitue donc fidèlement un essai que s’il a été entraîné sur des essais dont la</w:t>
+      </w:r>
+      <w:r>
+        <w:t xml:space="preserve"> </w:t>
+      </w:r>
+      <w:r>
+        <w:rPr>
+          <w:i/>
+          <w:iCs/>
+        </w:rPr>
+        <w:t xml:space="preserve">forme</w:t>
+      </w:r>
+      <w:r>
+        <w:t xml:space="preserve"> </w:t>
+      </w:r>
+      <w:r>
+        <w:t xml:space="preserve">d’évolution est comparable. Or, même à 30 °C régulé, deux morphologies coexistent (§III.4) : une dégradation</w:t>
+      </w:r>
+      <w:r>
+        <w:t xml:space="preserve"> </w:t>
+      </w:r>
+      <w:r>
+        <w:rPr>
+          <w:b/>
+          <w:bCs/>
+        </w:rPr>
+        <w:t xml:space="preserve">graduelle</w:t>
+      </w:r>
+      <w:r>
+        <w:t xml:space="preserve">, précoce (Run #1), et une dégradation par</w:t>
+      </w:r>
+      <w:r>
+        <w:t xml:space="preserve"> </w:t>
+      </w:r>
+      <w:r>
+        <w:rPr>
+          <w:b/>
+          <w:bCs/>
+        </w:rPr>
+        <w:t xml:space="preserve">induction puis emballement</w:t>
+      </w:r>
+      <w:r>
+        <w:t xml:space="preserve"> </w:t>
+      </w:r>
+      <w:r>
+        <w:t xml:space="preserve">(Run #12, Run #16). L’essai Run #21 (§III.6), de type graduel, l’illustre : son ajout à l’entraînement n’améliore pas la prédiction des deux essais de test — lesquels relèvent de la morphologie</w:t>
+      </w:r>
+      <w:r>
+        <w:t xml:space="preserve"> </w:t>
+      </w:r>
+      <w:r>
+        <w:rPr>
+          <w:i/>
+          <w:iCs/>
+        </w:rPr>
+        <w:t xml:space="preserve">induction-emballement</w:t>
+      </w:r>
+      <w:r>
+        <w:t xml:space="preserve"> </w:t>
+      </w:r>
+      <w:r>
+        <w:t xml:space="preserve">— et la dégrade même légèrement (R² moyen de +0,29 à +0,18). Loin d’infirmer le modèle, ce résultat en confirme le mécanisme : enrichir l’entraînement n’est profitable que si l’essai ajouté</w:t>
+      </w:r>
+      <w:r>
+        <w:t xml:space="preserve"> </w:t>
+      </w:r>
+      <w:r>
+        <w:rPr>
+          <w:b/>
+          <w:bCs/>
+        </w:rPr>
+        <w:t xml:space="preserve">partage la morphologie</w:t>
+      </w:r>
+      <w:r>
+        <w:t xml:space="preserve"> </w:t>
+      </w:r>
+      <w:r>
+        <w:t xml:space="preserve">de l’essai à prédire — transposition, au registre de la forme de corrosion, du constat établi pour la couverture thermique. La métrique demeure néanmoins bruitée au vu du faible effectif d’essais ; seule la répétition au sein de chaque morphologie (§III.6) permettra de la stabiliser.</w:t>
+      </w:r>
+    </w:p>
     <w:bookmarkEnd w:id="139"/>
     <w:bookmarkStart w:id="143" w:name="iii.3.3.-variables-dinfluence"/>
     <w:p>
@@ -27167,7 +27281,81 @@
         <w:t xml:space="preserve">une morphologie de corrosion n’est prédictible qu’à partir du moment où elle a été observée au moins deux fois</w:t>
       </w:r>
       <w:r>
-        <w:t xml:space="preserve">, ce qui quantifie le besoin de répétition. L’essai Run #21, en cours d’acquisition, constitue un premier test « prédire puis confirmer » : sa rupture est attendue dans l’intervalle prédit (≈ 13–20 h). Ces travaux, encore préliminaires, seront validés et étendus dans la suite de la campagne.</w:t>
+        <w:t xml:space="preserve">, ce qui quantifie le besoin de répétition. L’essai Run #21 a depuis fourni un premier test « prédire puis confirmer » concluant : annoncée</w:t>
+      </w:r>
+      <w:r>
+        <w:t xml:space="preserve"> </w:t>
+      </w:r>
+      <w:r>
+        <w:rPr>
+          <w:i/>
+          <w:iCs/>
+        </w:rPr>
+        <w:t xml:space="preserve">avant</w:t>
+      </w:r>
+      <w:r>
+        <w:t xml:space="preserve"> </w:t>
+      </w:r>
+      <w:r>
+        <w:t xml:space="preserve">l’essai dans l’intervalle 13–20,5 h (médiane 16 h), la rupture est survenue à</w:t>
+      </w:r>
+      <w:r>
+        <w:t xml:space="preserve"> </w:t>
+      </w:r>
+      <w:r>
+        <w:rPr>
+          <w:b/>
+          <w:bCs/>
+        </w:rPr>
+        <w:t xml:space="preserve">13,1 h</w:t>
+      </w:r>
+      <w:r>
+        <w:t xml:space="preserve">, soit à l’intérieur de la bande prédite (à sa borne inférieure). Run #21 fournit en outre un</w:t>
+      </w:r>
+      <w:r>
+        <w:t xml:space="preserve"> </w:t>
+      </w:r>
+      <w:r>
+        <w:rPr>
+          <w:b/>
+          <w:bCs/>
+        </w:rPr>
+        <w:t xml:space="preserve">second représentant de la morphologie graduelle</w:t>
+      </w:r>
+      <w:r>
+        <w:t xml:space="preserve">, précisément ce que le critère de prédictibilité (au moins deux observations par morphologie) appelait. Il importe enfin de souligner que le jumeau numérique et le modèle XGBoost (§III.3) répondent à deux questions distinctes — le premier estime la</w:t>
+      </w:r>
+      <w:r>
+        <w:t xml:space="preserve"> </w:t>
+      </w:r>
+      <w:r>
+        <w:rPr>
+          <w:b/>
+          <w:bCs/>
+        </w:rPr>
+        <w:t xml:space="preserve">durée de vie</w:t>
+      </w:r>
+      <w:r>
+        <w:t xml:space="preserve"> </w:t>
+      </w:r>
+      <w:r>
+        <w:t xml:space="preserve">(l’instant de rupture), le second le</w:t>
+      </w:r>
+      <w:r>
+        <w:t xml:space="preserve"> </w:t>
+      </w:r>
+      <w:r>
+        <w:rPr>
+          <w:b/>
+          <w:bCs/>
+        </w:rPr>
+        <w:t xml:space="preserve">taux de corrosion instantané</w:t>
+      </w:r>
+      <w:r>
+        <w:t xml:space="preserve"> </w:t>
+      </w:r>
+      <w:r>
+        <w:t xml:space="preserve">— et convergent vers un même enseignement : une prédiction n’est fiable qu’au sein d’une morphologie déjà observée et répétée. Ces travaux, encore préliminaires, seront validés et étendus dans la suite de la campagne.</w:t>
       </w:r>
     </w:p>
     <w:p>

</xml_diff>

<commit_message>
figure II.1: regenere l'architecture sans GLPI (module GMAO maison + flux Supabase)
L'ancienne figure montrait encore GLPI + "POST /apirest.php/Ticket". Corrigee :
ESP32 ->(HTTPS POST)-> Supabase ; Supabase <-> Streamlit (REST Supabase :
lecture mesures / ecriture OT) ; module GMAO maison dans Streamlit ; -> Technicien.
Aucun CMMS externe. Word regenere.

Co-Authored-By: Claude Opus 4.8 <noreply@anthropic.com>
</commit_message>
<xml_diff>
--- a/memoire/Memoire_M2_Corrosion_BATOUMBI.docx
+++ b/memoire/Memoire_M2_Corrosion_BATOUMBI.docx
@@ -23758,7 +23758,7 @@
       <w:r>
         <w:drawing>
           <wp:inline>
-            <wp:extent cx="4460240" cy="5723041"/>
+            <wp:extent cx="4460240" cy="4961672"/>
             <wp:effectExtent b="0" l="0" r="0" t="0"/>
             <wp:docPr descr="Figure II.1 — Architecture de la boucle intégrée Sonde ER → Supabase → Streamlit (module GMAO)" title="" id="109" name="Picture"/>
             <a:graphic>
@@ -23779,7 +23779,7 @@
                   <pic:spPr bwMode="auto">
                     <a:xfrm>
                       <a:off x="0" y="0"/>
-                      <a:ext cx="4460240" cy="5723041"/>
+                      <a:ext cx="4460240" cy="4961672"/>
                     </a:xfrm>
                     <a:prstGeom prst="rect">
                       <a:avLst/>

</xml_diff>

<commit_message>
memoire: Word regenere avec champ Liste des figures/tableaux corrige (separateur ;)
Co-Authored-By: Claude Opus 4.8 <noreply@anthropic.com>
</commit_message>
<xml_diff>
--- a/memoire/Memoire_M2_Corrosion_BATOUMBI.docx
+++ b/memoire/Memoire_M2_Corrosion_BATOUMBI.docx
@@ -2006,7 +2006,7 @@
         <w:fldChar w:fldCharType="begin" w:dirty="true"/>
       </w:r>
       <w:r>
-        <w:instrText xml:space="preserve"> TOC \h \z \t "Image Caption,1" </w:instrText>
+        <w:instrText xml:space="preserve"> TOC \h \z \t "Image Caption;1" </w:instrText>
       </w:r>
       <w:r>
         <w:fldChar w:fldCharType="separate"/>
@@ -2038,7 +2038,7 @@
         <w:fldChar w:fldCharType="begin" w:dirty="true"/>
       </w:r>
       <w:r>
-        <w:instrText xml:space="preserve"> TOC \h \z \t "Table Caption,1" </w:instrText>
+        <w:instrText xml:space="preserve"> TOC \h \z \t "Table Caption;1" </w:instrText>
       </w:r>
       <w:r>
         <w:fldChar w:fldCharType="separate"/>

</xml_diff>

<commit_message>
build_word: corrige le sommaire/TOC justifie (espacement disproportionne)
- SOMMAIRE (liste manuelle = 1 paragraphe justifie avec sauts de ligne) : aligne
  a gauche en post-traitement -> plus d'etirement des lignes sur toute la largeur.
- Styles TOC 1..9 pre-definis (styleId TOC1..TOC9) alignes a gauche, bases sur Normal :
  la Table des matieres (champ) ne herite plus du justifie de Normal.
- Word regenere.

Co-Authored-By: Claude Opus 4.8 <noreply@anthropic.com>
</commit_message>
<xml_diff>
--- a/memoire/Memoire_M2_Corrosion_BATOUMBI.docx
+++ b/memoire/Memoire_M2_Corrosion_BATOUMBI.docx
@@ -2068,6 +2068,7 @@
     <w:p>
       <w:pPr>
         <w:pStyle w:val="FirstParagraph"/>
+        <w:jc w:val="left"/>
       </w:pPr>
       <w:r>
         <w:t xml:space="preserve">DÉDICACE</w:t>
@@ -2170,6 +2171,9 @@
       </w:r>
     </w:p>
     <w:p>
+      <w:pPr>
+        <w:jc w:val="left"/>
+      </w:pPr>
       <w:r>
         <w:br w:type="page"/>
       </w:r>
@@ -38241,6 +38245,123 @@
       <w:color w:themeColor="accent1" w:themeShade="BF" w:val="365F91"/>
     </w:rPr>
   </w:style>
+  <w:style w:customStyle="1" w:styleId="TOC1" w:type="paragraph">
+    <w:name w:val="toc 1"/>
+    <w:basedOn w:val="Normal"/>
+    <w:pPr>
+      <w:spacing w:after="40" w:line="240" w:lineRule="auto"/>
+      <w:jc w:val="left"/>
+    </w:pPr>
+    <w:rPr>
+      <w:rFonts w:ascii="Times New Roman" w:cs="Times New Roman" w:hAnsi="Times New Roman"/>
+      <w:color w:val="000000"/>
+      <w:sz w:val="24"/>
+    </w:rPr>
+  </w:style>
+  <w:style w:customStyle="1" w:styleId="TOC2" w:type="paragraph">
+    <w:name w:val="toc 2"/>
+    <w:basedOn w:val="Normal"/>
+    <w:pPr>
+      <w:spacing w:after="40" w:line="240" w:lineRule="auto"/>
+      <w:jc w:val="left"/>
+    </w:pPr>
+    <w:rPr>
+      <w:rFonts w:ascii="Times New Roman" w:cs="Times New Roman" w:hAnsi="Times New Roman"/>
+      <w:color w:val="000000"/>
+      <w:sz w:val="24"/>
+    </w:rPr>
+  </w:style>
+  <w:style w:customStyle="1" w:styleId="TOC3" w:type="paragraph">
+    <w:name w:val="toc 3"/>
+    <w:basedOn w:val="Normal"/>
+    <w:pPr>
+      <w:spacing w:after="40" w:line="240" w:lineRule="auto"/>
+      <w:jc w:val="left"/>
+    </w:pPr>
+    <w:rPr>
+      <w:rFonts w:ascii="Times New Roman" w:cs="Times New Roman" w:hAnsi="Times New Roman"/>
+      <w:color w:val="000000"/>
+      <w:sz w:val="24"/>
+    </w:rPr>
+  </w:style>
+  <w:style w:customStyle="1" w:styleId="TOC4" w:type="paragraph">
+    <w:name w:val="toc 4"/>
+    <w:basedOn w:val="Normal"/>
+    <w:pPr>
+      <w:spacing w:after="40" w:line="240" w:lineRule="auto"/>
+      <w:jc w:val="left"/>
+    </w:pPr>
+    <w:rPr>
+      <w:rFonts w:ascii="Times New Roman" w:cs="Times New Roman" w:hAnsi="Times New Roman"/>
+      <w:color w:val="000000"/>
+      <w:sz w:val="24"/>
+    </w:rPr>
+  </w:style>
+  <w:style w:customStyle="1" w:styleId="TOC5" w:type="paragraph">
+    <w:name w:val="toc 5"/>
+    <w:basedOn w:val="Normal"/>
+    <w:pPr>
+      <w:spacing w:after="40" w:line="240" w:lineRule="auto"/>
+      <w:jc w:val="left"/>
+    </w:pPr>
+    <w:rPr>
+      <w:rFonts w:ascii="Times New Roman" w:cs="Times New Roman" w:hAnsi="Times New Roman"/>
+      <w:color w:val="000000"/>
+      <w:sz w:val="24"/>
+    </w:rPr>
+  </w:style>
+  <w:style w:customStyle="1" w:styleId="TOC6" w:type="paragraph">
+    <w:name w:val="toc 6"/>
+    <w:basedOn w:val="Normal"/>
+    <w:pPr>
+      <w:spacing w:after="40" w:line="240" w:lineRule="auto"/>
+      <w:jc w:val="left"/>
+    </w:pPr>
+    <w:rPr>
+      <w:rFonts w:ascii="Times New Roman" w:cs="Times New Roman" w:hAnsi="Times New Roman"/>
+      <w:color w:val="000000"/>
+      <w:sz w:val="24"/>
+    </w:rPr>
+  </w:style>
+  <w:style w:customStyle="1" w:styleId="TOC7" w:type="paragraph">
+    <w:name w:val="toc 7"/>
+    <w:basedOn w:val="Normal"/>
+    <w:pPr>
+      <w:spacing w:after="40" w:line="240" w:lineRule="auto"/>
+      <w:jc w:val="left"/>
+    </w:pPr>
+    <w:rPr>
+      <w:rFonts w:ascii="Times New Roman" w:cs="Times New Roman" w:hAnsi="Times New Roman"/>
+      <w:color w:val="000000"/>
+      <w:sz w:val="24"/>
+    </w:rPr>
+  </w:style>
+  <w:style w:customStyle="1" w:styleId="TOC8" w:type="paragraph">
+    <w:name w:val="toc 8"/>
+    <w:basedOn w:val="Normal"/>
+    <w:pPr>
+      <w:spacing w:after="40" w:line="240" w:lineRule="auto"/>
+      <w:jc w:val="left"/>
+    </w:pPr>
+    <w:rPr>
+      <w:rFonts w:ascii="Times New Roman" w:cs="Times New Roman" w:hAnsi="Times New Roman"/>
+      <w:color w:val="000000"/>
+      <w:sz w:val="24"/>
+    </w:rPr>
+  </w:style>
+  <w:style w:customStyle="1" w:styleId="TOC9" w:type="paragraph">
+    <w:name w:val="toc 9"/>
+    <w:basedOn w:val="Normal"/>
+    <w:pPr>
+      <w:spacing w:after="40" w:line="240" w:lineRule="auto"/>
+      <w:jc w:val="left"/>
+    </w:pPr>
+    <w:rPr>
+      <w:rFonts w:ascii="Times New Roman" w:cs="Times New Roman" w:hAnsi="Times New Roman"/>
+      <w:color w:val="000000"/>
+      <w:sz w:val="24"/>
+    </w:rPr>
+  </w:style>
   <w:style w:customStyle="1" w:styleId="PageTitre" w:type="paragraph">
     <w:name w:val="PageTitre"/>
     <w:basedOn w:val="Normal"/>

</xml_diff>

<commit_message>
memoire: audit biblio + suppression de 6 references inventees + corrections (credibilite)
Verification en ligne de chaque reference (fichier memoire/VERIFICATION_REFERENCES.md).
- RETIRE 6 references INVENTEES : Murphy 2021, Mayer/LEROY 2023, Cheng & Niu 2018,
  Lu & Luo 2016, Ma 2021, Xu D 2020 (introuvables en ligne).
- CORRIGE auteurs/details (vrais papiers, mauvaise attribution) : Yan & Yan -> Kuang & Long ;
  Heydari & Talebpour -> Ma et al. ; Bagheri 2024 J.Manuf.Syst -> 2015 IFAC-PapersOnLine ;
  Liu 2025 -> Zheng et al. (vol/art corriges) ; Hu 2024 n art ; Tan Y. -> Tan L.
- RETIRE Next.js + Vercel (hors stack) ; Annexe G + prose I.7 realignees sur Streamlit.
- Citations in-texte mises a jour partout (I.1.3, I.7, III.6.2, choix XGBoost, Annexe H).
- 74 references restantes (>= 60). Word regenere ; fausses refs absentes du .docx (verifie).

Co-Authored-By: Claude Opus 4.8 <noreply@anthropic.com>
</commit_message>
<xml_diff>
--- a/memoire/Memoire_M2_Corrosion_BATOUMBI.docx
+++ b/memoire/Memoire_M2_Corrosion_BATOUMBI.docx
@@ -2818,7 +2818,7 @@
         <w:t xml:space="preserve"> </w:t>
       </w:r>
       <w:r>
-        <w:t xml:space="preserve">: forêts aléatoires (Cheng et Niu, 2018),</w:t>
+        <w:t xml:space="preserve">: forêts aléatoires,</w:t>
       </w:r>
       <w:r>
         <w:t xml:space="preserve"> </w:t>
@@ -2834,7 +2834,7 @@
         <w:t xml:space="preserve"> </w:t>
       </w:r>
       <w:r>
-        <w:t xml:space="preserve">(Chen et Guestrin, 2016 ; Ma, Zhao et Wang, 2021), LightGBM, AdaBoost et Gradient Boosting (Yan et Yan, 2024). Ces méthodes obtiennent typiquement des erreurs RMSE comprises entre 0,031 et 0,052 mm/an avec des coefficients de détermination R² supérieurs à 0,95 sur des jeux de données de pipelines (Wei et al., 2024).</w:t>
+        <w:t xml:space="preserve">(Chen et Guestrin, 2016), LightGBM, AdaBoost et Gradient Boosting (Kuang et Long, 2024). Ces méthodes obtiennent typiquement des erreurs RMSE comprises entre 0,031 et 0,052 mm/an avec des coefficients de détermination R² supérieurs à 0,95 sur des jeux de données de pipelines (Wei et al., 2024).</w:t>
       </w:r>
     </w:p>
     <w:p>
@@ -2856,7 +2856,7 @@
         <w:t xml:space="preserve"> </w:t>
       </w:r>
       <w:r>
-        <w:t xml:space="preserve">: MLP (Ossai, Boswell et Davies, 2017), réseaux de neurones convolutifs et LSTM pour les séries temporelles (Xu, Xia et Wang, 2020), réseaux résiduels (ResNet) avec analyse d’interprétabilité (Liu et al., 2025), et architectures Transformer pour la prédiction de corrosion interne (Tan et al., 2025).</w:t>
+        <w:t xml:space="preserve">: MLP (Ossai, Boswell et Davies, 2017), réseaux de neurones convolutifs et LSTM pour les séries temporelles, réseaux résiduels (ResNet) avec analyse d’interprétabilité (Zheng et al., 2025), et architectures Transformer pour la prédiction de corrosion interne (Tan et al., 2025).</w:t>
       </w:r>
     </w:p>
     <w:p>
@@ -2894,7 +2894,7 @@
         <w:t xml:space="preserve"> </w:t>
       </w:r>
       <w:r>
-        <w:t xml:space="preserve">pour quantifier la contribution de chaque variable d’entrée aux prédictions (Hu et al., 2024 ; Yan et Yan, 2024). Ces analyses identifient typiquement la température, la pression partielle de CO₂ et la pression totale comme les trois variables dominantes pour la corrosion interne des pipelines O&amp;G.</w:t>
+        <w:t xml:space="preserve">pour quantifier la contribution de chaque variable d’entrée aux prédictions (Hu et al., 2024 ; Kuang et Long, 2024). Ces analyses identifient typiquement la température, la pression partielle de CO₂ et la pression totale comme les trois variables dominantes pour la corrosion interne des pipelines O&amp;G.</w:t>
       </w:r>
     </w:p>
     <w:p>
@@ -3028,7 +3028,7 @@
         <w:t xml:space="preserve"> </w:t>
       </w:r>
       <w:r>
-        <w:t xml:space="preserve">: les milieux industriels réels combinent souvent plusieurs acides ou agents agressifs dont l’interaction n’est pas modélisable analytiquement par les approches classiques (Heydari et Talebpour, 2024). C’est typiquement le cas des détartrants industriels qui mélangent HCl et H₃PO₄, créant une cinétique multi-mécanismes attaque/passivation difficile à prédire (Persian Utab, 2023 ; Schweitzer, 2010).</w:t>
+        <w:t xml:space="preserve">: les milieux industriels réels combinent souvent plusieurs acides ou agents agressifs dont l’interaction n’est pas modélisable analytiquement par les approches classiques (Ma et al., 2024). C’est typiquement le cas des détartrants industriels qui mélangent HCl et H₃PO₄, créant une cinétique multi-mécanismes attaque/passivation difficile à prédire (Persian Utab, 2023 ; Schweitzer, 2010).</w:t>
       </w:r>
     </w:p>
     <w:bookmarkEnd w:id="31"/>
@@ -8142,7 +8142,7 @@
         <w:pStyle w:val="FirstParagraph"/>
       </w:pPr>
       <w:r>
-        <w:t xml:space="preserve">Les performances rapportées dans la littérature récente sur la corrosion sont remarquables (Wei et al., 2024 ; Yan et Yan, 2024) :</w:t>
+        <w:t xml:space="preserve">Les performances rapportées dans la littérature récente sur la corrosion sont remarquables (Wei et al., 2024 ; Kuang et Long, 2024) :</w:t>
       </w:r>
     </w:p>
     <w:p>
@@ -8212,13 +8212,13 @@
           <w:b/>
           <w:bCs/>
         </w:rPr>
-        <w:t xml:space="preserve">Yan et Yan (2024)</w:t>
-      </w:r>
-      <w:r>
-        <w:t xml:space="preserve"> </w:t>
-      </w:r>
-      <w:r>
-        <w:t xml:space="preserve">: XGBoost et AdaBoost obtiennent</w:t>
+        <w:t xml:space="preserve">Kuang et Long (2024)</w:t>
+      </w:r>
+      <w:r>
+        <w:t xml:space="preserve"> </w:t>
+      </w:r>
+      <w:r>
+        <w:t xml:space="preserve">: XGBoost obtient</w:t>
       </w:r>
       <w:r>
         <w:t xml:space="preserve"> </w:t>
@@ -9136,7 +9136,7 @@
         <w:t xml:space="preserve">CMMS (Computerized Maintenance Management System)</w:t>
       </w:r>
       <w:r>
-        <w:t xml:space="preserve">, est une application logicielle dédiée à la planification, au suivi et à l’optimisation des activités de maintenance d’une organisation industrielle (Lopes et al., 2016 ; Roda et Macchi, 2018). Une GMAO moderne intègre typiquement les fonctions suivantes (ISO 14224, 2016 ; Bagheri et al., 2024) :</w:t>
+        <w:t xml:space="preserve">, est une application logicielle dédiée à la planification, au suivi et à l’optimisation des activités de maintenance d’une organisation industrielle (Lopes et al., 2016 ; Roda et Macchi, 2018). Une GMAO moderne intègre typiquement les fonctions suivantes (ISO 14224, 2016 ; Bagheri et al., 2015) :</w:t>
       </w:r>
     </w:p>
     <w:p>
@@ -9338,7 +9338,7 @@
         <w:t xml:space="preserve"> </w:t>
       </w:r>
       <w:r>
-        <w:t xml:space="preserve">existent (CMMS Wikipedia, 2024 ; Murphy, 2021) : GLPI, OpenMaint (CMDBuild), Snipe-IT, Fiix Free, MaintainX, Hippo CMMS Free, Limble. Ces solutions offrent un périmètre fonctionnel comparable aux GMAO propriétaires (gestion d’actifs, ordres de travail, ITIL) avec des API REST documentées qui permettent une intégration tierce. Néanmoins, leur adoption dans le contexte africain présente quelques limites résiduelles : (i) absence de modules de prédiction par apprentissage automatique embarqués (la couche ML reste à raccorder par intégration externe) ; (ii) interfaces parfois en anglais uniquement (GLPI fait exception avec une localisation francophone native) ; (iii) hébergement self-hosted exigeant une compétence IT minimale pour l’administration, ce qui peut être un frein pour les PME sans équipe IT dédiée — frein partiellement levé par les distributions Docker prêtes à déployer.</w:t>
+        <w:t xml:space="preserve">existent (CMMS Wikipedia, 2024) : GLPI, OpenMaint (CMDBuild), Snipe-IT, Fiix Free, MaintainX, Hippo CMMS Free, Limble. Ces solutions offrent un périmètre fonctionnel comparable aux GMAO propriétaires (gestion d’actifs, ordres de travail, ITIL) avec des API REST documentées qui permettent une intégration tierce. Néanmoins, leur adoption dans le contexte africain présente quelques limites résiduelles : (i) absence de modules de prédiction par apprentissage automatique embarqués (la couche ML reste à raccorder par intégration externe) ; (ii) interfaces parfois en anglais uniquement (GLPI fait exception avec une localisation francophone native) ; (iii) hébergement self-hosted exigeant une compétence IT minimale pour l’administration, ce qui peut être un frein pour les PME sans équipe IT dédiée — frein partiellement levé par les distributions Docker prêtes à déployer.</w:t>
       </w:r>
     </w:p>
     <w:p>
@@ -9378,17 +9378,17 @@
         <w:t xml:space="preserve"> </w:t>
       </w:r>
       <w:r>
-        <w:t xml:space="preserve">(alternative open-source à Firebase) couplée à des frameworks frontend modernes comme</w:t>
-      </w:r>
-      <w:r>
-        <w:t xml:space="preserve"> </w:t>
-      </w:r>
-      <w:r>
-        <w:rPr>
-          <w:b/>
-          <w:bCs/>
-        </w:rPr>
-        <w:t xml:space="preserve">Next.js</w:t>
+        <w:t xml:space="preserve">(alternative open-source à Firebase) couplée à des frameworks applicatifs Python comme</w:t>
+      </w:r>
+      <w:r>
+        <w:t xml:space="preserve"> </w:t>
+      </w:r>
+      <w:r>
+        <w:rPr>
+          <w:b/>
+          <w:bCs/>
+        </w:rPr>
+        <w:t xml:space="preserve">Streamlit</w:t>
       </w:r>
       <w:r>
         <w:t xml:space="preserve"> </w:t>
@@ -11906,7 +11906,7 @@
         <w:t xml:space="preserve"> </w:t>
       </w:r>
       <w:r>
-        <w:t xml:space="preserve">Critère décisif : performance reconnue en time-series sur faibles volumes (Chen et Guestrin, 2016 ; Ma et al., 2021 ; Wei et al., 2024), interprétabilité native par SHAP (Lundberg et Lee, 2017), régularisation L1/L2 limitant le sur-apprentissage.</w:t>
+        <w:t xml:space="preserve">Critère décisif : performance reconnue en time-series sur faibles volumes (Chen et Guestrin, 2016 ; Wei et al., 2024), interprétabilité native par SHAP (Lundberg et Lee, 2017), régularisation L1/L2 limitant le sur-apprentissage.</w:t>
       </w:r>
       <w:r>
         <w:t xml:space="preserve"> </w:t>
@@ -28927,7 +28927,7 @@
         <w:t xml:space="preserve"> </w:t>
       </w:r>
       <w:r>
-        <w:t xml:space="preserve">(Wei et al., 2024 ; Yan et Yan, 2024 ; Hu et al., 2024, avec des R² &gt; 0,96). Nos résultats, plus modestes en valeur absolue, s’expliquent par un nombre d’essais réduit et, surtout, par le caractère</w:t>
+        <w:t xml:space="preserve">(Wei et al., 2024 ; Kuang et Long, 2024 ; Hu et al., 2024, avec des R² &gt; 0,96). Nos résultats, plus modestes en valeur absolue, s’expliquent par un nombre d’essais réduit et, surtout, par le caractère</w:t>
       </w:r>
       <w:r>
         <w:t xml:space="preserve"> </w:t>
@@ -30211,7 +30211,7 @@
         </w:numPr>
       </w:pPr>
       <w:r>
-        <w:t xml:space="preserve">Cheng, Y. F., &amp; Niu, L. (2018). Predicting corrosion rates of steel pipelines using machine learning.</w:t>
+        <w:t xml:space="preserve">Coelho, L. B. (2022). Reviewing machine learning of corrosion prediction in a data-oriented perspective.</w:t>
       </w:r>
       <w:r>
         <w:t xml:space="preserve"> </w:t>
@@ -30221,10 +30221,10 @@
           <w:i/>
           <w:iCs/>
         </w:rPr>
-        <w:t xml:space="preserve">Corrosion Science</w:t>
-      </w:r>
-      <w:r>
-        <w:t xml:space="preserve">, 145, 170–182.</w:t>
+        <w:t xml:space="preserve">npj Materials Degradation</w:t>
+      </w:r>
+      <w:r>
+        <w:t xml:space="preserve">, 6, 8. https://doi.org/10.1038/s41529-022-00218-4</w:t>
       </w:r>
     </w:p>
     <w:p>
@@ -30235,7 +30235,7 @@
         </w:numPr>
       </w:pPr>
       <w:r>
-        <w:t xml:space="preserve">Coelho, L. B. (2022). Reviewing machine learning of corrosion prediction in a data-oriented perspective.</w:t>
+        <w:t xml:space="preserve">Cosasco. (2024).</w:t>
       </w:r>
       <w:r>
         <w:t xml:space="preserve"> </w:t>
@@ -30245,10 +30245,10 @@
           <w:i/>
           <w:iCs/>
         </w:rPr>
-        <w:t xml:space="preserve">npj Materials Degradation</w:t>
-      </w:r>
-      <w:r>
-        <w:t xml:space="preserve">, 6, 8. https://doi.org/10.1038/s41529-022-00218-4</w:t>
+        <w:t xml:space="preserve">Dual Sensor Electrical Resistance (ER) Temperature Probes</w:t>
+      </w:r>
+      <w:r>
+        <w:t xml:space="preserve">. https://www.cosasco.com/product/dual-sensor-electrical-resistance-er-temperature-probes</w:t>
       </w:r>
     </w:p>
     <w:p>
@@ -30259,7 +30259,7 @@
         </w:numPr>
       </w:pPr>
       <w:r>
-        <w:t xml:space="preserve">Cosasco. (2024).</w:t>
+        <w:t xml:space="preserve">COTCO. (2024).</w:t>
       </w:r>
       <w:r>
         <w:t xml:space="preserve"> </w:t>
@@ -30269,10 +30269,10 @@
           <w:i/>
           <w:iCs/>
         </w:rPr>
-        <w:t xml:space="preserve">Dual Sensor Electrical Resistance (ER) Temperature Probes</w:t>
-      </w:r>
-      <w:r>
-        <w:t xml:space="preserve">. https://www.cosasco.com/product/dual-sensor-electrical-resistance-er-temperature-probes</w:t>
+        <w:t xml:space="preserve">Cameroon Oil Transportation Company — COTCO in brief</w:t>
+      </w:r>
+      <w:r>
+        <w:t xml:space="preserve">. https://cotco-sa.cm/en/cotco-in-brief/</w:t>
       </w:r>
     </w:p>
     <w:p>
@@ -30283,7 +30283,7 @@
         </w:numPr>
       </w:pPr>
       <w:r>
-        <w:t xml:space="preserve">COTCO. (2024).</w:t>
+        <w:t xml:space="preserve">de Waard, C., &amp; Milliams, D. E. (1975). Carbonic acid corrosion of steel.</w:t>
       </w:r>
       <w:r>
         <w:t xml:space="preserve"> </w:t>
@@ -30293,10 +30293,10 @@
           <w:i/>
           <w:iCs/>
         </w:rPr>
-        <w:t xml:space="preserve">Cameroon Oil Transportation Company — COTCO in brief</w:t>
-      </w:r>
-      <w:r>
-        <w:t xml:space="preserve">. https://cotco-sa.cm/en/cotco-in-brief/</w:t>
+        <w:t xml:space="preserve">Corrosion</w:t>
+      </w:r>
+      <w:r>
+        <w:t xml:space="preserve">, 31(5), 177–181.</w:t>
       </w:r>
     </w:p>
     <w:p>
@@ -30307,7 +30307,7 @@
         </w:numPr>
       </w:pPr>
       <w:r>
-        <w:t xml:space="preserve">de Waard, C., &amp; Milliams, D. E. (1975). Carbonic acid corrosion of steel.</w:t>
+        <w:t xml:space="preserve">de Waard, C., Lotz, U., &amp; Milliams, D. E. (1991). Predictive model for CO₂ corrosion engineering in wet natural gas pipelines.</w:t>
       </w:r>
       <w:r>
         <w:t xml:space="preserve"> </w:t>
@@ -30320,7 +30320,7 @@
         <w:t xml:space="preserve">Corrosion</w:t>
       </w:r>
       <w:r>
-        <w:t xml:space="preserve">, 31(5), 177–181.</w:t>
+        <w:t xml:space="preserve">, 47(12), 976–985.</w:t>
       </w:r>
     </w:p>
     <w:p>
@@ -30331,7 +30331,7 @@
         </w:numPr>
       </w:pPr>
       <w:r>
-        <w:t xml:space="preserve">de Waard, C., Lotz, U., &amp; Milliams, D. E. (1991). Predictive model for CO₂ corrosion engineering in wet natural gas pipelines.</w:t>
+        <w:t xml:space="preserve">Egbule, P. E., et al. (2018). Pipeline corrosion control in oil and gas industry: A case study of NNPC/PPMC pipelines.</w:t>
       </w:r>
       <w:r>
         <w:t xml:space="preserve"> </w:t>
@@ -30341,10 +30341,10 @@
           <w:i/>
           <w:iCs/>
         </w:rPr>
-        <w:t xml:space="preserve">Corrosion</w:t>
-      </w:r>
-      <w:r>
-        <w:t xml:space="preserve">, 47(12), 976–985.</w:t>
+        <w:t xml:space="preserve">Academia.edu</w:t>
+      </w:r>
+      <w:r>
+        <w:t xml:space="preserve">.</w:t>
       </w:r>
     </w:p>
     <w:p>
@@ -30355,7 +30355,7 @@
         </w:numPr>
       </w:pPr>
       <w:r>
-        <w:t xml:space="preserve">Egbule, P. E., et al. (2018). Pipeline corrosion control in oil and gas industry: A case study of NNPC/PPMC pipelines.</w:t>
+        <w:t xml:space="preserve">Espressif Systems. (2024).</w:t>
       </w:r>
       <w:r>
         <w:t xml:space="preserve"> </w:t>
@@ -30365,10 +30365,10 @@
           <w:i/>
           <w:iCs/>
         </w:rPr>
-        <w:t xml:space="preserve">Academia.edu</w:t>
-      </w:r>
-      <w:r>
-        <w:t xml:space="preserve">.</w:t>
+        <w:t xml:space="preserve">ESP32 Datasheet — Version 4.4</w:t>
+      </w:r>
+      <w:r>
+        <w:t xml:space="preserve">. https://www.espressif.com/en/products/socs/esp32</w:t>
       </w:r>
     </w:p>
     <w:p>
@@ -30379,7 +30379,7 @@
         </w:numPr>
       </w:pPr>
       <w:r>
-        <w:t xml:space="preserve">Espressif Systems. (2024).</w:t>
+        <w:t xml:space="preserve">ExxonMobil. (2011).</w:t>
       </w:r>
       <w:r>
         <w:t xml:space="preserve"> </w:t>
@@ -30389,10 +30389,10 @@
           <w:i/>
           <w:iCs/>
         </w:rPr>
-        <w:t xml:space="preserve">ESP32 Datasheet — Version 4.4</w:t>
-      </w:r>
-      <w:r>
-        <w:t xml:space="preserve">. https://www.espressif.com/en/products/socs/esp32</w:t>
+        <w:t xml:space="preserve">Chad/Cameroon Development Project — Project Update No. 30 — Mid-Year Report 2011</w:t>
+      </w:r>
+      <w:r>
+        <w:t xml:space="preserve">.</w:t>
       </w:r>
     </w:p>
     <w:p>
@@ -30403,7 +30403,7 @@
         </w:numPr>
       </w:pPr>
       <w:r>
-        <w:t xml:space="preserve">ExxonMobil. (2011).</w:t>
+        <w:t xml:space="preserve">Faraday, M. (1834). On electrical decomposition.</w:t>
       </w:r>
       <w:r>
         <w:t xml:space="preserve"> </w:t>
@@ -30413,10 +30413,10 @@
           <w:i/>
           <w:iCs/>
         </w:rPr>
-        <w:t xml:space="preserve">Chad/Cameroon Development Project — Project Update No. 30 — Mid-Year Report 2011</w:t>
-      </w:r>
-      <w:r>
-        <w:t xml:space="preserve">.</w:t>
+        <w:t xml:space="preserve">Philosophical Transactions of the Royal Society</w:t>
+      </w:r>
+      <w:r>
+        <w:t xml:space="preserve">, 124, 77–122.</w:t>
       </w:r>
     </w:p>
     <w:p>
@@ -30427,7 +30427,7 @@
         </w:numPr>
       </w:pPr>
       <w:r>
-        <w:t xml:space="preserve">Faraday, M. (1834). On electrical decomposition.</w:t>
+        <w:t xml:space="preserve">Hassanzadeh, S., et al. (2024). Application of electrical resistance probes for corrosion monitoring and cathodic protection assessment of offshore structures.</w:t>
       </w:r>
       <w:r>
         <w:t xml:space="preserve"> </w:t>
@@ -30437,10 +30437,10 @@
           <w:i/>
           <w:iCs/>
         </w:rPr>
-        <w:t xml:space="preserve">Philosophical Transactions of the Royal Society</w:t>
-      </w:r>
-      <w:r>
-        <w:t xml:space="preserve">, 124, 77–122.</w:t>
+        <w:t xml:space="preserve">Materials and Corrosion (Wiley)</w:t>
+      </w:r>
+      <w:r>
+        <w:t xml:space="preserve">. https://doi.org/10.1002/maco.70138</w:t>
       </w:r>
     </w:p>
     <w:p>
@@ -30451,7 +30451,7 @@
         </w:numPr>
       </w:pPr>
       <w:r>
-        <w:t xml:space="preserve">Hassanzadeh, S., et al. (2024). Application of electrical resistance probes for corrosion monitoring and cathodic protection assessment of offshore structures.</w:t>
+        <w:t xml:space="preserve">Ma, Y., Qi, W., Yu, M., Huang, N., Li, R., Tan, J., &amp; Zhu, X. (2024). Synthesis of Gemini-type imidazoline quaternary ammonium salt using by-product fatty acid as corrosion inhibitor for Q235 steel.</w:t>
       </w:r>
       <w:r>
         <w:t xml:space="preserve"> </w:t>
@@ -30461,10 +30461,10 @@
           <w:i/>
           <w:iCs/>
         </w:rPr>
-        <w:t xml:space="preserve">Materials and Corrosion (Wiley)</w:t>
-      </w:r>
-      <w:r>
-        <w:t xml:space="preserve">. https://doi.org/10.1002/maco.70138</w:t>
+        <w:t xml:space="preserve">Scientific Reports</w:t>
+      </w:r>
+      <w:r>
+        <w:t xml:space="preserve">, 14, 13687. https://www.nature.com/articles/s41598-024-64671-8</w:t>
       </w:r>
     </w:p>
     <w:p>
@@ -30475,7 +30475,7 @@
         </w:numPr>
       </w:pPr>
       <w:r>
-        <w:t xml:space="preserve">Heydari, M., &amp; Talebpour, A. (2024). Synthesis of Gemini-type imidazoline quaternary ammonium salt using by-product fatty acid as corrosion inhibitor for Q235 steel.</w:t>
+        <w:t xml:space="preserve">HSPublishing. (2023).</w:t>
       </w:r>
       <w:r>
         <w:t xml:space="preserve"> </w:t>
@@ -30485,10 +30485,23 @@
           <w:i/>
           <w:iCs/>
         </w:rPr>
-        <w:t xml:space="preserve">Scientific Reports</w:t>
-      </w:r>
-      <w:r>
-        <w:t xml:space="preserve">, 14, article 64671.</w:t>
+        <w:t xml:space="preserve">Oil and gas pipeline corrosion monitoring and prevention</w:t>
+      </w:r>
+      <w:r>
+        <w:t xml:space="preserve">.</w:t>
+      </w:r>
+      <w:r>
+        <w:t xml:space="preserve"> </w:t>
+      </w:r>
+      <w:r>
+        <w:rPr>
+          <w:i/>
+          <w:iCs/>
+        </w:rPr>
+        <w:t xml:space="preserve">Journal of Research in Engineering and Computer Sciences</w:t>
+      </w:r>
+      <w:r>
+        <w:t xml:space="preserve">, https://hspublishing.org/JRECS/article/download/114/105</w:t>
       </w:r>
     </w:p>
     <w:p>
@@ -30499,7 +30512,7 @@
         </w:numPr>
       </w:pPr>
       <w:r>
-        <w:t xml:space="preserve">HSPublishing. (2023).</w:t>
+        <w:t xml:space="preserve">Hu, J., et al. (2024). Prediction of the internal corrosion rate for oil and gas pipelines and influence factor analysis with interpretable ensemble learning.</w:t>
       </w:r>
       <w:r>
         <w:t xml:space="preserve"> </w:t>
@@ -30509,23 +30522,10 @@
           <w:i/>
           <w:iCs/>
         </w:rPr>
-        <w:t xml:space="preserve">Oil and gas pipeline corrosion monitoring and prevention</w:t>
-      </w:r>
-      <w:r>
-        <w:t xml:space="preserve">.</w:t>
-      </w:r>
-      <w:r>
-        <w:t xml:space="preserve"> </w:t>
-      </w:r>
-      <w:r>
-        <w:rPr>
-          <w:i/>
-          <w:iCs/>
-        </w:rPr>
-        <w:t xml:space="preserve">Journal of Research in Engineering and Computer Sciences</w:t>
-      </w:r>
-      <w:r>
-        <w:t xml:space="preserve">, https://hspublishing.org/JRECS/article/download/114/105</w:t>
+        <w:t xml:space="preserve">International Journal of Pressure Vessels and Piping</w:t>
+      </w:r>
+      <w:r>
+        <w:t xml:space="preserve">, 212, 105329. https://www.sciencedirect.com/science/article/abs/pii/S0308016124002060</w:t>
       </w:r>
     </w:p>
     <w:p>
@@ -30536,7 +30536,7 @@
         </w:numPr>
       </w:pPr>
       <w:r>
-        <w:t xml:space="preserve">Hu, J., et al. (2024). Prediction of the internal corrosion rate for oil and gas pipelines and influence factor analysis with interpretable ensemble learning.</w:t>
+        <w:t xml:space="preserve">Hyndman, R. J., &amp; Koehler, A. B. (2006). Another look at measures of forecast accuracy.</w:t>
       </w:r>
       <w:r>
         <w:t xml:space="preserve"> </w:t>
@@ -30546,10 +30546,10 @@
           <w:i/>
           <w:iCs/>
         </w:rPr>
-        <w:t xml:space="preserve">International Journal of Pressure Vessels and Piping</w:t>
-      </w:r>
-      <w:r>
-        <w:t xml:space="preserve">. https://doi.org/10.1016/j.ijpvp.2024.105400</w:t>
+        <w:t xml:space="preserve">International Journal of Forecasting</w:t>
+      </w:r>
+      <w:r>
+        <w:t xml:space="preserve">, 22(4), 679–688.</w:t>
       </w:r>
     </w:p>
     <w:p>
@@ -30560,7 +30560,7 @@
         </w:numPr>
       </w:pPr>
       <w:r>
-        <w:t xml:space="preserve">Hyndman, R. J., &amp; Koehler, A. B. (2006). Another look at measures of forecast accuracy.</w:t>
+        <w:t xml:space="preserve">Inspectioneering. (2016, March 8). NACE study estimates global cost of corrosion at $2.5 trillion annually.</w:t>
       </w:r>
       <w:r>
         <w:t xml:space="preserve"> </w:t>
@@ -30570,10 +30570,10 @@
           <w:i/>
           <w:iCs/>
         </w:rPr>
-        <w:t xml:space="preserve">International Journal of Forecasting</w:t>
-      </w:r>
-      <w:r>
-        <w:t xml:space="preserve">, 22(4), 679–688.</w:t>
+        <w:t xml:space="preserve">Inspectioneering</w:t>
+      </w:r>
+      <w:r>
+        <w:t xml:space="preserve">. https://inspectioneering.com/news/2016-03-08/5202</w:t>
       </w:r>
     </w:p>
     <w:p>
@@ -30584,7 +30584,7 @@
         </w:numPr>
       </w:pPr>
       <w:r>
-        <w:t xml:space="preserve">Inspectioneering. (2016, March 8). NACE study estimates global cost of corrosion at $2.5 trillion annually.</w:t>
+        <w:t xml:space="preserve">ISO. (2024).</w:t>
       </w:r>
       <w:r>
         <w:t xml:space="preserve"> </w:t>
@@ -30594,10 +30594,10 @@
           <w:i/>
           <w:iCs/>
         </w:rPr>
-        <w:t xml:space="preserve">Inspectioneering</w:t>
-      </w:r>
-      <w:r>
-        <w:t xml:space="preserve">. https://inspectioneering.com/news/2016-03-08/5202</w:t>
+        <w:t xml:space="preserve">ISO 8044:2024 — Corrosion of metals and alloys — Vocabulary</w:t>
+      </w:r>
+      <w:r>
+        <w:t xml:space="preserve">.</w:t>
       </w:r>
     </w:p>
     <w:p>
@@ -30608,7 +30608,7 @@
         </w:numPr>
       </w:pPr>
       <w:r>
-        <w:t xml:space="preserve">ISO. (2024).</w:t>
+        <w:t xml:space="preserve">ISO. (2025).</w:t>
       </w:r>
       <w:r>
         <w:t xml:space="preserve"> </w:t>
@@ -30618,7 +30618,7 @@
           <w:i/>
           <w:iCs/>
         </w:rPr>
-        <w:t xml:space="preserve">ISO 8044:2024 — Corrosion of metals and alloys — Vocabulary</w:t>
+        <w:t xml:space="preserve">ISO 13381-1:2025 — Condition monitoring and diagnostics of machine systems — Prognostics — Part 1: General guidelines and requirements</w:t>
       </w:r>
       <w:r>
         <w:t xml:space="preserve">.</w:t>
@@ -30632,7 +30632,7 @@
         </w:numPr>
       </w:pPr>
       <w:r>
-        <w:t xml:space="preserve">ISO. (2025).</w:t>
+        <w:t xml:space="preserve">ISO. (2020).</w:t>
       </w:r>
       <w:r>
         <w:t xml:space="preserve"> </w:t>
@@ -30642,7 +30642,7 @@
           <w:i/>
           <w:iCs/>
         </w:rPr>
-        <w:t xml:space="preserve">ISO 13381-1:2025 — Condition monitoring and diagnostics of machine systems — Prognostics — Part 1: General guidelines and requirements</w:t>
+        <w:t xml:space="preserve">ISO 15156-1:2020 — Petroleum and natural gas industries — Materials for use in H₂S-containing environments in oil and gas production</w:t>
       </w:r>
       <w:r>
         <w:t xml:space="preserve">.</w:t>
@@ -30656,7 +30656,7 @@
         </w:numPr>
       </w:pPr>
       <w:r>
-        <w:t xml:space="preserve">ISO. (2020).</w:t>
+        <w:t xml:space="preserve">Khadom, A. A., Yaro, A. S., Kadhum, A. A. H., AlTaie, A. S., &amp; Musa, A. Y. (2009). The effect of temperature and acid concentration on corrosion of low carbon steel in hydrochloric acid media.</w:t>
       </w:r>
       <w:r>
         <w:t xml:space="preserve"> </w:t>
@@ -30666,10 +30666,10 @@
           <w:i/>
           <w:iCs/>
         </w:rPr>
-        <w:t xml:space="preserve">ISO 15156-1:2020 — Petroleum and natural gas industries — Materials for use in H₂S-containing environments in oil and gas production</w:t>
-      </w:r>
-      <w:r>
-        <w:t xml:space="preserve">.</w:t>
+        <w:t xml:space="preserve">American Journal of Applied Sciences</w:t>
+      </w:r>
+      <w:r>
+        <w:t xml:space="preserve">, 6(8), 1403–1409.</w:t>
       </w:r>
     </w:p>
     <w:p>
@@ -30680,7 +30680,7 @@
         </w:numPr>
       </w:pPr>
       <w:r>
-        <w:t xml:space="preserve">Khadom, A. A., Yaro, A. S., Kadhum, A. A. H., AlTaie, A. S., &amp; Musa, A. Y. (2009). The effect of temperature and acid concentration on corrosion of low carbon steel in hydrochloric acid media.</w:t>
+        <w:t xml:space="preserve">Koch, G. H., Brongers, M. P. H., Thompson, N. G., Virmani, Y. P., &amp; Payer, J. H. (2016).</w:t>
       </w:r>
       <w:r>
         <w:t xml:space="preserve"> </w:t>
@@ -30690,10 +30690,10 @@
           <w:i/>
           <w:iCs/>
         </w:rPr>
-        <w:t xml:space="preserve">American Journal of Applied Sciences</w:t>
-      </w:r>
-      <w:r>
-        <w:t xml:space="preserve">, 6(8), 1403–1409.</w:t>
+        <w:t xml:space="preserve">International Measures of Prevention, Application, and Economics of Corrosion Technology (IMPACT) Study</w:t>
+      </w:r>
+      <w:r>
+        <w:t xml:space="preserve">. NACE International. http://impact.nace.org/</w:t>
       </w:r>
     </w:p>
     <w:p>
@@ -30704,7 +30704,7 @@
         </w:numPr>
       </w:pPr>
       <w:r>
-        <w:t xml:space="preserve">Koch, G. H., Brongers, M. P. H., Thompson, N. G., Virmani, Y. P., &amp; Payer, J. H. (2016).</w:t>
+        <w:t xml:space="preserve">Zheng, Q., Zhang, H., Liu, H., Xu, H., Xu, B., &amp; Zhu, Z. (2025). Intelligent prediction model for pitting corrosion risk in pipelines using developed ResNet and feature reconstruction with interpretability analysis.</w:t>
       </w:r>
       <w:r>
         <w:t xml:space="preserve"> </w:t>
@@ -30714,10 +30714,10 @@
           <w:i/>
           <w:iCs/>
         </w:rPr>
-        <w:t xml:space="preserve">International Measures of Prevention, Application, and Economics of Corrosion Technology (IMPACT) Study</w:t>
-      </w:r>
-      <w:r>
-        <w:t xml:space="preserve">. NACE International. http://impact.nace.org/</w:t>
+        <w:t xml:space="preserve">Reliability Engineering &amp; System Safety</w:t>
+      </w:r>
+      <w:r>
+        <w:t xml:space="preserve">, 264, 111347. https://www.sciencedirect.com/science/article/abs/pii/S0951832025005484</w:t>
       </w:r>
     </w:p>
     <w:p>
@@ -30728,7 +30728,7 @@
         </w:numPr>
       </w:pPr>
       <w:r>
-        <w:t xml:space="preserve">Liu, J., et al. (2025). Intelligent prediction model for pitting corrosion risk in pipelines using developed ResNet and feature reconstruction with interpretability analysis.</w:t>
+        <w:t xml:space="preserve">Liu, Y., et al. (2022). A review: Prediction method for the remaining useful life of the mechanical system.</w:t>
       </w:r>
       <w:r>
         <w:t xml:space="preserve"> </w:t>
@@ -30738,10 +30738,10 @@
           <w:i/>
           <w:iCs/>
         </w:rPr>
-        <w:t xml:space="preserve">Reliability Engineering &amp; System Safety</w:t>
-      </w:r>
-      <w:r>
-        <w:t xml:space="preserve">, 257, 110548.</w:t>
+        <w:t xml:space="preserve">Journal of Failure Analysis and Prevention</w:t>
+      </w:r>
+      <w:r>
+        <w:t xml:space="preserve">, 22, 2119–2137. https://doi.org/10.1007/s11668-022-01532-4</w:t>
       </w:r>
     </w:p>
     <w:p>
@@ -30752,7 +30752,7 @@
         </w:numPr>
       </w:pPr>
       <w:r>
-        <w:t xml:space="preserve">Liu, Y., et al. (2022). A review: Prediction method for the remaining useful life of the mechanical system.</w:t>
+        <w:t xml:space="preserve">Lundberg, S. M., &amp; Lee, S. I. (2017). A unified approach to interpreting model predictions.</w:t>
       </w:r>
       <w:r>
         <w:t xml:space="preserve"> </w:t>
@@ -30762,10 +30762,10 @@
           <w:i/>
           <w:iCs/>
         </w:rPr>
-        <w:t xml:space="preserve">Journal of Failure Analysis and Prevention</w:t>
-      </w:r>
-      <w:r>
-        <w:t xml:space="preserve">, 22, 2119–2137. https://doi.org/10.1007/s11668-022-01532-4</w:t>
+        <w:t xml:space="preserve">Advances in Neural Information Processing Systems (NeurIPS)</w:t>
+      </w:r>
+      <w:r>
+        <w:t xml:space="preserve">, 30, 4768–4777.</w:t>
       </w:r>
     </w:p>
     <w:p>
@@ -30776,7 +30776,7 @@
         </w:numPr>
       </w:pPr>
       <w:r>
-        <w:t xml:space="preserve">Lu, B. T., &amp; Luo, J. L. (2016). Electrochemical study of corrosion inhibition of imidazoline derivatives on mild steel.</w:t>
+        <w:t xml:space="preserve">Mansfeld, F. (2014). Recent developments in corrosion measurement techniques.</w:t>
       </w:r>
       <w:r>
         <w:t xml:space="preserve"> </w:t>
@@ -30786,10 +30786,10 @@
           <w:i/>
           <w:iCs/>
         </w:rPr>
-        <w:t xml:space="preserve">Corrosion Science</w:t>
-      </w:r>
-      <w:r>
-        <w:t xml:space="preserve">, 105, 1–10.</w:t>
+        <w:t xml:space="preserve">Materials and Corrosion</w:t>
+      </w:r>
+      <w:r>
+        <w:t xml:space="preserve">, 65(7), 631–638.</w:t>
       </w:r>
     </w:p>
     <w:p>
@@ -30800,7 +30800,7 @@
         </w:numPr>
       </w:pPr>
       <w:r>
-        <w:t xml:space="preserve">Lundberg, S. M., &amp; Lee, S. I. (2017). A unified approach to interpreting model predictions.</w:t>
+        <w:t xml:space="preserve">Lasi, H., Fettke, P., Kemper, H. G., Feld, T., et Hoffmann, M. (2014). Industry 4.0.</w:t>
       </w:r>
       <w:r>
         <w:t xml:space="preserve"> </w:t>
@@ -30810,10 +30810,10 @@
           <w:i/>
           <w:iCs/>
         </w:rPr>
-        <w:t xml:space="preserve">Advances in Neural Information Processing Systems (NeurIPS)</w:t>
-      </w:r>
-      <w:r>
-        <w:t xml:space="preserve">, 30, 4768–4777.</w:t>
+        <w:t xml:space="preserve">Business &amp; Information Systems Engineering</w:t>
+      </w:r>
+      <w:r>
+        <w:t xml:space="preserve">, 6(4), 239-242. https://doi.org/10.1007/s12599-014-0334-4</w:t>
       </w:r>
     </w:p>
     <w:p>
@@ -30824,7 +30824,7 @@
         </w:numPr>
       </w:pPr>
       <w:r>
-        <w:t xml:space="preserve">Ma, Z., Zhao, Y., &amp; Wang, L. (2021). Predicting pipeline corrosion rate using gradient boosting algorithms.</w:t>
+        <w:t xml:space="preserve">Lu, Y. (2017). Industry 4.0: A survey on technologies, applications and open research issues.</w:t>
       </w:r>
       <w:r>
         <w:t xml:space="preserve"> </w:t>
@@ -30834,10 +30834,10 @@
           <w:i/>
           <w:iCs/>
         </w:rPr>
-        <w:t xml:space="preserve">International Journal of Pressure Vessels and Piping</w:t>
-      </w:r>
-      <w:r>
-        <w:t xml:space="preserve">, 192, 104396.</w:t>
+        <w:t xml:space="preserve">Journal of Industrial Information Integration</w:t>
+      </w:r>
+      <w:r>
+        <w:t xml:space="preserve">, 6, 1-10. https://doi.org/10.1016/j.jii.2017.04.005</w:t>
       </w:r>
     </w:p>
     <w:p>
@@ -30848,7 +30848,7 @@
         </w:numPr>
       </w:pPr>
       <w:r>
-        <w:t xml:space="preserve">Mansfeld, F. (2014). Recent developments in corrosion measurement techniques.</w:t>
+        <w:t xml:space="preserve">Xu, L. D., Xu, E. L., et Li, L. (2018). Industry 4.0: state of the art and future trends.</w:t>
       </w:r>
       <w:r>
         <w:t xml:space="preserve"> </w:t>
@@ -30858,10 +30858,10 @@
           <w:i/>
           <w:iCs/>
         </w:rPr>
-        <w:t xml:space="preserve">Materials and Corrosion</w:t>
-      </w:r>
-      <w:r>
-        <w:t xml:space="preserve">, 65(7), 631–638.</w:t>
+        <w:t xml:space="preserve">International Journal of Production Research</w:t>
+      </w:r>
+      <w:r>
+        <w:t xml:space="preserve">, 56(8), 2941-2962. https://doi.org/10.1080/00207543.2018.1444806</w:t>
       </w:r>
     </w:p>
     <w:p>
@@ -30872,7 +30872,7 @@
         </w:numPr>
       </w:pPr>
       <w:r>
-        <w:t xml:space="preserve">Lasi, H., Fettke, P., Kemper, H. G., Feld, T., et Hoffmann, M. (2014). Industry 4.0.</w:t>
+        <w:t xml:space="preserve">GLPI Project. (2024).</w:t>
       </w:r>
       <w:r>
         <w:t xml:space="preserve"> </w:t>
@@ -30882,10 +30882,10 @@
           <w:i/>
           <w:iCs/>
         </w:rPr>
-        <w:t xml:space="preserve">Business &amp; Information Systems Engineering</w:t>
-      </w:r>
-      <w:r>
-        <w:t xml:space="preserve">, 6(4), 239-242. https://doi.org/10.1007/s12599-014-0334-4</w:t>
+        <w:t xml:space="preserve">GLPI — Free IT and Asset Management Software — REST API documentation</w:t>
+      </w:r>
+      <w:r>
+        <w:t xml:space="preserve">. https://glpi-project.org/</w:t>
       </w:r>
     </w:p>
     <w:p>
@@ -30896,7 +30896,7 @@
         </w:numPr>
       </w:pPr>
       <w:r>
-        <w:t xml:space="preserve">Lu, Y. (2017). Industry 4.0: A survey on technologies, applications and open research issues.</w:t>
+        <w:t xml:space="preserve">Streamlit. (2024).</w:t>
       </w:r>
       <w:r>
         <w:t xml:space="preserve"> </w:t>
@@ -30906,10 +30906,10 @@
           <w:i/>
           <w:iCs/>
         </w:rPr>
-        <w:t xml:space="preserve">Journal of Industrial Information Integration</w:t>
-      </w:r>
-      <w:r>
-        <w:t xml:space="preserve">, 6, 1-10. https://doi.org/10.1016/j.jii.2017.04.005</w:t>
+        <w:t xml:space="preserve">Streamlit Documentation — A faster way to build and share data apps</w:t>
+      </w:r>
+      <w:r>
+        <w:t xml:space="preserve">. https://docs.streamlit.io/</w:t>
       </w:r>
     </w:p>
     <w:p>
@@ -30920,7 +30920,7 @@
         </w:numPr>
       </w:pPr>
       <w:r>
-        <w:t xml:space="preserve">Xu, L. D., Xu, E. L., et Li, L. (2018). Industry 4.0: state of the art and future trends.</w:t>
+        <w:t xml:space="preserve">NACE International. (2016).</w:t>
       </w:r>
       <w:r>
         <w:t xml:space="preserve"> </w:t>
@@ -30930,10 +30930,10 @@
           <w:i/>
           <w:iCs/>
         </w:rPr>
-        <w:t xml:space="preserve">International Journal of Production Research</w:t>
-      </w:r>
-      <w:r>
-        <w:t xml:space="preserve">, 56(8), 2941-2962. https://doi.org/10.1080/00207543.2018.1444806</w:t>
+        <w:t xml:space="preserve">IMPACT Study Press Release — CORROSION 2016 conference</w:t>
+      </w:r>
+      <w:r>
+        <w:t xml:space="preserve">.</w:t>
       </w:r>
     </w:p>
     <w:p>
@@ -30944,7 +30944,7 @@
         </w:numPr>
       </w:pPr>
       <w:r>
-        <w:t xml:space="preserve">GLPI Project. (2024).</w:t>
+        <w:t xml:space="preserve">Onyebuchi, V., et al. (2018). Internal corrosion behaviour of Nigerian gas pipelines.</w:t>
       </w:r>
       <w:r>
         <w:t xml:space="preserve"> </w:t>
@@ -30954,10 +30954,10 @@
           <w:i/>
           <w:iCs/>
         </w:rPr>
-        <w:t xml:space="preserve">GLPI — Free IT and Asset Management Software — REST API documentation</w:t>
-      </w:r>
-      <w:r>
-        <w:t xml:space="preserve">. https://glpi-project.org/</w:t>
+        <w:t xml:space="preserve">Unizik Journal of Engineering and Applied Sciences</w:t>
+      </w:r>
+      <w:r>
+        <w:t xml:space="preserve">.</w:t>
       </w:r>
     </w:p>
     <w:p>
@@ -30968,7 +30968,7 @@
         </w:numPr>
       </w:pPr>
       <w:r>
-        <w:t xml:space="preserve">Streamlit. (2024).</w:t>
+        <w:t xml:space="preserve">Ossai, C. I., Boswell, B., &amp; Davies, I. J. (2017). Use of artificial neural network for prediction of pipeline corrosion defect growth rate.</w:t>
       </w:r>
       <w:r>
         <w:t xml:space="preserve"> </w:t>
@@ -30978,10 +30978,10 @@
           <w:i/>
           <w:iCs/>
         </w:rPr>
-        <w:t xml:space="preserve">Streamlit Documentation — A faster way to build and share data apps</w:t>
-      </w:r>
-      <w:r>
-        <w:t xml:space="preserve">. https://docs.streamlit.io/</w:t>
+        <w:t xml:space="preserve">Engineering Failure Analysis</w:t>
+      </w:r>
+      <w:r>
+        <w:t xml:space="preserve">, 82, 1–12.</w:t>
       </w:r>
     </w:p>
     <w:p>
@@ -30992,7 +30992,7 @@
         </w:numPr>
       </w:pPr>
       <w:r>
-        <w:t xml:space="preserve">Mayer, A., et al. (2023). LEROY: A low-cost Arduino-based, IoT-enabled device for atmospheric corrosion monitoring.</w:t>
+        <w:t xml:space="preserve">Persian Utab. (2023).</w:t>
       </w:r>
       <w:r>
         <w:t xml:space="preserve"> </w:t>
@@ -31002,10 +31002,10 @@
           <w:i/>
           <w:iCs/>
         </w:rPr>
-        <w:t xml:space="preserve">Sensors</w:t>
-      </w:r>
-      <w:r>
-        <w:t xml:space="preserve">. https://www.mdpi.com/1424-8220/</w:t>
+        <w:t xml:space="preserve">Phosphoric acid and iron oxide — passivation mechanism</w:t>
+      </w:r>
+      <w:r>
+        <w:t xml:space="preserve">. https://persianutab.com/en/phosphoric-acid-and-iron-oxide/</w:t>
       </w:r>
     </w:p>
     <w:p>
@@ -31016,7 +31016,7 @@
         </w:numPr>
       </w:pPr>
       <w:r>
-        <w:t xml:space="preserve">NACE International. (2016).</w:t>
+        <w:t xml:space="preserve">Pollock, D. D. (1991).</w:t>
       </w:r>
       <w:r>
         <w:t xml:space="preserve"> </w:t>
@@ -31026,10 +31026,13 @@
           <w:i/>
           <w:iCs/>
         </w:rPr>
-        <w:t xml:space="preserve">IMPACT Study Press Release — CORROSION 2016 conference</w:t>
-      </w:r>
-      <w:r>
-        <w:t xml:space="preserve">.</w:t>
+        <w:t xml:space="preserve">Physical Properties of Materials for Engineers</w:t>
+      </w:r>
+      <w:r>
+        <w:t xml:space="preserve"> </w:t>
+      </w:r>
+      <w:r>
+        <w:t xml:space="preserve">(2nd ed.). CRC Press.</w:t>
       </w:r>
     </w:p>
     <w:p>
@@ -31040,7 +31043,7 @@
         </w:numPr>
       </w:pPr>
       <w:r>
-        <w:t xml:space="preserve">Onyebuchi, V., et al. (2018). Internal corrosion behaviour of Nigerian gas pipelines.</w:t>
+        <w:t xml:space="preserve">Pumps Africa. (2024).</w:t>
       </w:r>
       <w:r>
         <w:t xml:space="preserve"> </w:t>
@@ -31050,10 +31053,10 @@
           <w:i/>
           <w:iCs/>
         </w:rPr>
-        <w:t xml:space="preserve">Unizik Journal of Engineering and Applied Sciences</w:t>
-      </w:r>
-      <w:r>
-        <w:t xml:space="preserve">.</w:t>
+        <w:t xml:space="preserve">Advanced pipeline monitoring systems for safer oil &amp; gas operations in Africa</w:t>
+      </w:r>
+      <w:r>
+        <w:t xml:space="preserve">. https://pumps-africa.com/advanced-pipeline-monitoring-systems-for-safer-oil-gas-operations-in-africa/</w:t>
       </w:r>
     </w:p>
     <w:p>
@@ -31064,7 +31067,7 @@
         </w:numPr>
       </w:pPr>
       <w:r>
-        <w:t xml:space="preserve">Ossai, C. I., Boswell, B., &amp; Davies, I. J. (2017). Use of artificial neural network for prediction of pipeline corrosion defect growth rate.</w:t>
+        <w:t xml:space="preserve">Roberge, P. R. (2008).</w:t>
       </w:r>
       <w:r>
         <w:t xml:space="preserve"> </w:t>
@@ -31074,10 +31077,10 @@
           <w:i/>
           <w:iCs/>
         </w:rPr>
-        <w:t xml:space="preserve">Engineering Failure Analysis</w:t>
-      </w:r>
-      <w:r>
-        <w:t xml:space="preserve">, 82, 1–12.</w:t>
+        <w:t xml:space="preserve">Corrosion Engineering: Principles and Practice</w:t>
+      </w:r>
+      <w:r>
+        <w:t xml:space="preserve">. McGraw-Hill.</w:t>
       </w:r>
     </w:p>
     <w:p>
@@ -31088,7 +31091,7 @@
         </w:numPr>
       </w:pPr>
       <w:r>
-        <w:t xml:space="preserve">Persian Utab. (2023).</w:t>
+        <w:t xml:space="preserve">Savitzky, A., &amp; Golay, M. J. E. (1964). Smoothing and differentiation of data by simplified least squares procedures.</w:t>
       </w:r>
       <w:r>
         <w:t xml:space="preserve"> </w:t>
@@ -31098,10 +31101,10 @@
           <w:i/>
           <w:iCs/>
         </w:rPr>
-        <w:t xml:space="preserve">Phosphoric acid and iron oxide — passivation mechanism</w:t>
-      </w:r>
-      <w:r>
-        <w:t xml:space="preserve">. https://persianutab.com/en/phosphoric-acid-and-iron-oxide/</w:t>
+        <w:t xml:space="preserve">Analytical Chemistry</w:t>
+      </w:r>
+      <w:r>
+        <w:t xml:space="preserve">, 36(8), 1627–1639.</w:t>
       </w:r>
     </w:p>
     <w:p>
@@ -31112,7 +31115,7 @@
         </w:numPr>
       </w:pPr>
       <w:r>
-        <w:t xml:space="preserve">Pollock, D. D. (1991).</w:t>
+        <w:t xml:space="preserve">Schweitzer, P. A. (2010).</w:t>
       </w:r>
       <w:r>
         <w:t xml:space="preserve"> </w:t>
@@ -31122,13 +31125,10 @@
           <w:i/>
           <w:iCs/>
         </w:rPr>
-        <w:t xml:space="preserve">Physical Properties of Materials for Engineers</w:t>
-      </w:r>
-      <w:r>
-        <w:t xml:space="preserve"> </w:t>
-      </w:r>
-      <w:r>
-        <w:t xml:space="preserve">(2nd ed.). CRC Press.</w:t>
+        <w:t xml:space="preserve">Fundamentals of Corrosion: Mechanisms, Causes, and Preventive Methods</w:t>
+      </w:r>
+      <w:r>
+        <w:t xml:space="preserve">. CRC Press.</w:t>
       </w:r>
     </w:p>
     <w:p>
@@ -31139,7 +31139,7 @@
         </w:numPr>
       </w:pPr>
       <w:r>
-        <w:t xml:space="preserve">Pumps Africa. (2024).</w:t>
+        <w:t xml:space="preserve">Standards Norway. (2017).</w:t>
       </w:r>
       <w:r>
         <w:t xml:space="preserve"> </w:t>
@@ -31149,10 +31149,13 @@
           <w:i/>
           <w:iCs/>
         </w:rPr>
-        <w:t xml:space="preserve">Advanced pipeline monitoring systems for safer oil &amp; gas operations in Africa</w:t>
-      </w:r>
-      <w:r>
-        <w:t xml:space="preserve">. https://pumps-africa.com/advanced-pipeline-monitoring-systems-for-safer-oil-gas-operations-in-africa/</w:t>
+        <w:t xml:space="preserve">NORSOK M-506 — CO₂ corrosion rate calculation model</w:t>
+      </w:r>
+      <w:r>
+        <w:t xml:space="preserve"> </w:t>
+      </w:r>
+      <w:r>
+        <w:t xml:space="preserve">(3rd ed.).</w:t>
       </w:r>
     </w:p>
     <w:p>
@@ -31163,7 +31166,7 @@
         </w:numPr>
       </w:pPr>
       <w:r>
-        <w:t xml:space="preserve">Roberge, P. R. (2008).</w:t>
+        <w:t xml:space="preserve">Tan, L., et al. (2025). Prediction of internal corrosion rate for gas pipeline: A new method based on transformer architecture.</w:t>
       </w:r>
       <w:r>
         <w:t xml:space="preserve"> </w:t>
@@ -31173,10 +31176,10 @@
           <w:i/>
           <w:iCs/>
         </w:rPr>
-        <w:t xml:space="preserve">Corrosion Engineering: Principles and Practice</w:t>
-      </w:r>
-      <w:r>
-        <w:t xml:space="preserve">. McGraw-Hill.</w:t>
+        <w:t xml:space="preserve">Computers &amp; Chemical Engineering</w:t>
+      </w:r>
+      <w:r>
+        <w:t xml:space="preserve">. https://www.sciencedirect.com/science/article/abs/pii/S0098135425000882</w:t>
       </w:r>
     </w:p>
     <w:p>
@@ -31187,7 +31190,7 @@
         </w:numPr>
       </w:pPr>
       <w:r>
-        <w:t xml:space="preserve">Savitzky, A., &amp; Golay, M. J. E. (1964). Smoothing and differentiation of data by simplified least squares procedures.</w:t>
+        <w:t xml:space="preserve">Tukey, J. W. (1977).</w:t>
       </w:r>
       <w:r>
         <w:t xml:space="preserve"> </w:t>
@@ -31197,10 +31200,10 @@
           <w:i/>
           <w:iCs/>
         </w:rPr>
-        <w:t xml:space="preserve">Analytical Chemistry</w:t>
-      </w:r>
-      <w:r>
-        <w:t xml:space="preserve">, 36(8), 1627–1639.</w:t>
+        <w:t xml:space="preserve">Exploratory Data Analysis</w:t>
+      </w:r>
+      <w:r>
+        <w:t xml:space="preserve">. Addison-Wesley.</w:t>
       </w:r>
     </w:p>
     <w:p>
@@ -31211,7 +31214,7 @@
         </w:numPr>
       </w:pPr>
       <w:r>
-        <w:t xml:space="preserve">Schweitzer, P. A. (2010).</w:t>
+        <w:t xml:space="preserve">Wagner, C., &amp; Traud, W. (1938). On the interpretation of corrosion phenomena by superposition of electrochemical partial reactions.</w:t>
       </w:r>
       <w:r>
         <w:t xml:space="preserve"> </w:t>
@@ -31221,10 +31224,10 @@
           <w:i/>
           <w:iCs/>
         </w:rPr>
-        <w:t xml:space="preserve">Fundamentals of Corrosion: Mechanisms, Causes, and Preventive Methods</w:t>
-      </w:r>
-      <w:r>
-        <w:t xml:space="preserve">. CRC Press.</w:t>
+        <w:t xml:space="preserve">Zeitschrift für Elektrochemie</w:t>
+      </w:r>
+      <w:r>
+        <w:t xml:space="preserve">, 44(7), 391–402.</w:t>
       </w:r>
     </w:p>
     <w:p>
@@ -31235,7 +31238,7 @@
         </w:numPr>
       </w:pPr>
       <w:r>
-        <w:t xml:space="preserve">Standards Norway. (2017).</w:t>
+        <w:t xml:space="preserve">Wang, Y., et al. (2023). Corrosion inhibition mechanism of water-soluble imidazoline on A572 Gr.65 steel in 3.5 wt % NaCl solution.</w:t>
       </w:r>
       <w:r>
         <w:t xml:space="preserve"> </w:t>
@@ -31245,13 +31248,10 @@
           <w:i/>
           <w:iCs/>
         </w:rPr>
-        <w:t xml:space="preserve">NORSOK M-506 — CO₂ corrosion rate calculation model</w:t>
-      </w:r>
-      <w:r>
-        <w:t xml:space="preserve"> </w:t>
-      </w:r>
-      <w:r>
-        <w:t xml:space="preserve">(3rd ed.).</w:t>
+        <w:t xml:space="preserve">Langmuir</w:t>
+      </w:r>
+      <w:r>
+        <w:t xml:space="preserve">, 39(45), 16108–16119. https://doi.org/10.1021/acs.langmuir.3c02781</w:t>
       </w:r>
     </w:p>
     <w:p>
@@ -31262,7 +31262,7 @@
         </w:numPr>
       </w:pPr>
       <w:r>
-        <w:t xml:space="preserve">Tan, Y., et al. (2025). Prediction of internal corrosion rate for gas pipeline: A new method based on transformer architecture.</w:t>
+        <w:t xml:space="preserve">Webster, J. G. (Ed.). (2014).</w:t>
       </w:r>
       <w:r>
         <w:t xml:space="preserve"> </w:t>
@@ -31272,10 +31272,13 @@
           <w:i/>
           <w:iCs/>
         </w:rPr>
-        <w:t xml:space="preserve">Computers &amp; Chemical Engineering</w:t>
-      </w:r>
-      <w:r>
-        <w:t xml:space="preserve">, 192, 108600.</w:t>
+        <w:t xml:space="preserve">The Measurement, Instrumentation, and Sensors Handbook</w:t>
+      </w:r>
+      <w:r>
+        <w:t xml:space="preserve"> </w:t>
+      </w:r>
+      <w:r>
+        <w:t xml:space="preserve">(2nd ed.). CRC Press.</w:t>
       </w:r>
     </w:p>
     <w:p>
@@ -31286,7 +31289,7 @@
         </w:numPr>
       </w:pPr>
       <w:r>
-        <w:t xml:space="preserve">Tukey, J. W. (1977).</w:t>
+        <w:t xml:space="preserve">Wei, X., et al. (2024). Advanced machine learning techniques for corrosion rate estimation and prediction in industrial cooling water pipelines.</w:t>
       </w:r>
       <w:r>
         <w:t xml:space="preserve"> </w:t>
@@ -31296,10 +31299,10 @@
           <w:i/>
           <w:iCs/>
         </w:rPr>
-        <w:t xml:space="preserve">Exploratory Data Analysis</w:t>
-      </w:r>
-      <w:r>
-        <w:t xml:space="preserve">. Addison-Wesley.</w:t>
+        <w:t xml:space="preserve">Sensors</w:t>
+      </w:r>
+      <w:r>
+        <w:t xml:space="preserve">, 24(11), 3564. https://doi.org/10.3390/s24113564</w:t>
       </w:r>
     </w:p>
     <w:p>
@@ -31310,7 +31313,7 @@
         </w:numPr>
       </w:pPr>
       <w:r>
-        <w:t xml:space="preserve">Wagner, C., &amp; Traud, W. (1938). On the interpretation of corrosion phenomena by superposition of electrochemical partial reactions.</w:t>
+        <w:t xml:space="preserve">Kuang, J., &amp; Long, Z. (2024). Prediction model for corrosion rate of low-alloy steels under atmospheric conditions using machine learning algorithms.</w:t>
       </w:r>
       <w:r>
         <w:t xml:space="preserve"> </w:t>
@@ -31320,10 +31323,10 @@
           <w:i/>
           <w:iCs/>
         </w:rPr>
-        <w:t xml:space="preserve">Zeitschrift für Elektrochemie</w:t>
-      </w:r>
-      <w:r>
-        <w:t xml:space="preserve">, 44(7), 391–402.</w:t>
+        <w:t xml:space="preserve">International Journal of Minerals, Metallurgy and Materials</w:t>
+      </w:r>
+      <w:r>
+        <w:t xml:space="preserve">, 31(2), 337–350. https://doi.org/10.1007/s12613-023-2679-5</w:t>
       </w:r>
     </w:p>
     <w:p>
@@ -31334,7 +31337,7 @@
         </w:numPr>
       </w:pPr>
       <w:r>
-        <w:t xml:space="preserve">Wang, Y., et al. (2023). Corrosion inhibition mechanism of water-soluble imidazoline on A572 Gr.65 steel in 3.5 wt % NaCl solution.</w:t>
+        <w:t xml:space="preserve">XGBoost. (2024).</w:t>
       </w:r>
       <w:r>
         <w:t xml:space="preserve"> </w:t>
@@ -31344,10 +31347,10 @@
           <w:i/>
           <w:iCs/>
         </w:rPr>
-        <w:t xml:space="preserve">Langmuir</w:t>
-      </w:r>
-      <w:r>
-        <w:t xml:space="preserve">, 39(45), 16108–16119. https://doi.org/10.1021/acs.langmuir.3c02781</w:t>
+        <w:t xml:space="preserve">XGBoost Documentation</w:t>
+      </w:r>
+      <w:r>
+        <w:t xml:space="preserve">. https://xgboost.readthedocs.io/</w:t>
       </w:r>
     </w:p>
     <w:p>
@@ -31358,7 +31361,7 @@
         </w:numPr>
       </w:pPr>
       <w:r>
-        <w:t xml:space="preserve">Webster, J. G. (Ed.). (2014).</w:t>
+        <w:t xml:space="preserve">Bagheri, B., Yang, S., Kao, H.-A., &amp; Lee, J. (2015). Cyber-physical systems architecture for self-aware machines in industry 4.0 environment.</w:t>
       </w:r>
       <w:r>
         <w:t xml:space="preserve"> </w:t>
@@ -31368,13 +31371,10 @@
           <w:i/>
           <w:iCs/>
         </w:rPr>
-        <w:t xml:space="preserve">The Measurement, Instrumentation, and Sensors Handbook</w:t>
-      </w:r>
-      <w:r>
-        <w:t xml:space="preserve"> </w:t>
-      </w:r>
-      <w:r>
-        <w:t xml:space="preserve">(2nd ed.). CRC Press.</w:t>
+        <w:t xml:space="preserve">IFAC-PapersOnLine</w:t>
+      </w:r>
+      <w:r>
+        <w:t xml:space="preserve">, 48(3), 1622–1627. https://www.sciencedirect.com/science/article/pii/S2405896315005571</w:t>
       </w:r>
     </w:p>
     <w:p>
@@ -31385,7 +31385,7 @@
         </w:numPr>
       </w:pPr>
       <w:r>
-        <w:t xml:space="preserve">Wei, X., et al. (2024). Advanced machine learning techniques for corrosion rate estimation and prediction in industrial cooling water pipelines.</w:t>
+        <w:t xml:space="preserve">CMMS Wikipedia. (2024).</w:t>
       </w:r>
       <w:r>
         <w:t xml:space="preserve"> </w:t>
@@ -31395,10 +31395,10 @@
           <w:i/>
           <w:iCs/>
         </w:rPr>
-        <w:t xml:space="preserve">Sensors</w:t>
-      </w:r>
-      <w:r>
-        <w:t xml:space="preserve">, 24(11), 3564. https://doi.org/10.3390/s24113564</w:t>
+        <w:t xml:space="preserve">Computerized Maintenance Management System</w:t>
+      </w:r>
+      <w:r>
+        <w:t xml:space="preserve">. https://en.wikipedia.org/wiki/Computerized_maintenance_management_system</w:t>
       </w:r>
     </w:p>
     <w:p>
@@ -31409,7 +31409,7 @@
         </w:numPr>
       </w:pPr>
       <w:r>
-        <w:t xml:space="preserve">Xu, D., Xia, Y., &amp; Wang, X. (2020). Deep learning for corrosion rate prediction in oil and gas pipelines.</w:t>
+        <w:t xml:space="preserve">ISO. (2016).</w:t>
       </w:r>
       <w:r>
         <w:t xml:space="preserve"> </w:t>
@@ -31419,10 +31419,10 @@
           <w:i/>
           <w:iCs/>
         </w:rPr>
-        <w:t xml:space="preserve">Corrosion</w:t>
-      </w:r>
-      <w:r>
-        <w:t xml:space="preserve">, 76(8), 789–798.</w:t>
+        <w:t xml:space="preserve">ISO 14224:2016 — Petroleum, petrochemical and natural gas industries — Collection and exchange of reliability and maintenance data for equipment</w:t>
+      </w:r>
+      <w:r>
+        <w:t xml:space="preserve">. International Organization for Standardization.</w:t>
       </w:r>
     </w:p>
     <w:p>
@@ -31433,7 +31433,7 @@
         </w:numPr>
       </w:pPr>
       <w:r>
-        <w:t xml:space="preserve">Yan, J., &amp; Yan, X. (2024). Prediction model for corrosion rate of low-alloy steels under atmospheric conditions using machine learning algorithms.</w:t>
+        <w:t xml:space="preserve">Lopes, I., Senra, P., Vilarinho, S., Sá, V., Teixeira, C., Lopes, J., Alves, A., Oliveira, J. A., &amp; Figueiredo, M. (2016). Requirements specification of a computerized maintenance management system — A case study.</w:t>
       </w:r>
       <w:r>
         <w:t xml:space="preserve"> </w:t>
@@ -31443,10 +31443,10 @@
           <w:i/>
           <w:iCs/>
         </w:rPr>
-        <w:t xml:space="preserve">International Journal of Minerals, Metallurgy and Materials</w:t>
-      </w:r>
-      <w:r>
-        <w:t xml:space="preserve">, 31, 1109–1119. https://doi.org/10.1007/s12613-023-2679-5</w:t>
+        <w:t xml:space="preserve">Procedia CIRP</w:t>
+      </w:r>
+      <w:r>
+        <w:t xml:space="preserve">, 52, 268–273.</w:t>
       </w:r>
     </w:p>
     <w:p>
@@ -31457,7 +31457,7 @@
         </w:numPr>
       </w:pPr>
       <w:r>
-        <w:t xml:space="preserve">XGBoost. (2024).</w:t>
+        <w:t xml:space="preserve">Roda, I., &amp; Macchi, M. (2018). A framework to embed asset management in production companies.</w:t>
       </w:r>
       <w:r>
         <w:t xml:space="preserve"> </w:t>
@@ -31467,10 +31467,10 @@
           <w:i/>
           <w:iCs/>
         </w:rPr>
-        <w:t xml:space="preserve">XGBoost Documentation</w:t>
-      </w:r>
-      <w:r>
-        <w:t xml:space="preserve">. https://xgboost.readthedocs.io/</w:t>
+        <w:t xml:space="preserve">Proceedings of the Institution of Mechanical Engineers, Part O: Journal of Risk and Reliability</w:t>
+      </w:r>
+      <w:r>
+        <w:t xml:space="preserve">, 232(4), 368–378.</w:t>
       </w:r>
     </w:p>
     <w:p>
@@ -31481,7 +31481,7 @@
         </w:numPr>
       </w:pPr>
       <w:r>
-        <w:t xml:space="preserve">Bagheri, B., Yang, S., Kao, H. A., &amp; Lee, J. (2024). Cyber-physical systems architecture for self-aware machines in industry 4.0 environment: A CMMS perspective.</w:t>
+        <w:t xml:space="preserve">Supabase. (2024).</w:t>
       </w:r>
       <w:r>
         <w:t xml:space="preserve"> </w:t>
@@ -31491,205 +31491,10 @@
           <w:i/>
           <w:iCs/>
         </w:rPr>
-        <w:t xml:space="preserve">Journal of Manufacturing Systems</w:t>
-      </w:r>
-      <w:r>
-        <w:t xml:space="preserve">, 72, 234–248.</w:t>
-      </w:r>
-    </w:p>
-    <w:p>
-      <w:pPr>
-        <w:numPr>
-          <w:ilvl w:val="0"/>
-          <w:numId w:val="1032"/>
-        </w:numPr>
-      </w:pPr>
-      <w:r>
-        <w:t xml:space="preserve">CMMS Wikipedia. (2024).</w:t>
-      </w:r>
-      <w:r>
-        <w:t xml:space="preserve"> </w:t>
-      </w:r>
-      <w:r>
-        <w:rPr>
-          <w:i/>
-          <w:iCs/>
-        </w:rPr>
-        <w:t xml:space="preserve">Computerized Maintenance Management System</w:t>
-      </w:r>
-      <w:r>
-        <w:t xml:space="preserve">. https://en.wikipedia.org/wiki/Computerized_maintenance_management_system</w:t>
-      </w:r>
-    </w:p>
-    <w:p>
-      <w:pPr>
-        <w:numPr>
-          <w:ilvl w:val="0"/>
-          <w:numId w:val="1032"/>
-        </w:numPr>
-      </w:pPr>
-      <w:r>
-        <w:t xml:space="preserve">ISO. (2016).</w:t>
-      </w:r>
-      <w:r>
-        <w:t xml:space="preserve"> </w:t>
-      </w:r>
-      <w:r>
-        <w:rPr>
-          <w:i/>
-          <w:iCs/>
-        </w:rPr>
-        <w:t xml:space="preserve">ISO 14224:2016 — Petroleum, petrochemical and natural gas industries — Collection and exchange of reliability and maintenance data for equipment</w:t>
-      </w:r>
-      <w:r>
-        <w:t xml:space="preserve">. International Organization for Standardization.</w:t>
-      </w:r>
-    </w:p>
-    <w:p>
-      <w:pPr>
-        <w:numPr>
-          <w:ilvl w:val="0"/>
-          <w:numId w:val="1032"/>
-        </w:numPr>
-      </w:pPr>
-      <w:r>
-        <w:t xml:space="preserve">Lopes, I., Senra, P., Vilarinho, S., Sá, V., Teixeira, C., Lopes, J., Alves, A., Oliveira, J. A., &amp; Figueiredo, M. (2016). Requirements specification of a computerized maintenance management system — A case study.</w:t>
-      </w:r>
-      <w:r>
-        <w:t xml:space="preserve"> </w:t>
-      </w:r>
-      <w:r>
-        <w:rPr>
-          <w:i/>
-          <w:iCs/>
-        </w:rPr>
-        <w:t xml:space="preserve">Procedia CIRP</w:t>
-      </w:r>
-      <w:r>
-        <w:t xml:space="preserve">, 52, 268–273.</w:t>
-      </w:r>
-    </w:p>
-    <w:p>
-      <w:pPr>
-        <w:numPr>
-          <w:ilvl w:val="0"/>
-          <w:numId w:val="1032"/>
-        </w:numPr>
-      </w:pPr>
-      <w:r>
-        <w:t xml:space="preserve">Murphy, K. (2021).</w:t>
-      </w:r>
-      <w:r>
-        <w:t xml:space="preserve"> </w:t>
-      </w:r>
-      <w:r>
-        <w:rPr>
-          <w:i/>
-          <w:iCs/>
-        </w:rPr>
-        <w:t xml:space="preserve">The State of Open-Source CMMS for SMEs</w:t>
-      </w:r>
-      <w:r>
-        <w:t xml:space="preserve">. Maintenance World Journal, 18(3), 45–53.</w:t>
-      </w:r>
-    </w:p>
-    <w:p>
-      <w:pPr>
-        <w:numPr>
-          <w:ilvl w:val="0"/>
-          <w:numId w:val="1032"/>
-        </w:numPr>
-      </w:pPr>
-      <w:r>
-        <w:t xml:space="preserve">Next.js. (2024).</w:t>
-      </w:r>
-      <w:r>
-        <w:t xml:space="preserve"> </w:t>
-      </w:r>
-      <w:r>
-        <w:rPr>
-          <w:i/>
-          <w:iCs/>
-        </w:rPr>
-        <w:t xml:space="preserve">Next.js — The React Framework for the Web</w:t>
-      </w:r>
-      <w:r>
-        <w:t xml:space="preserve">. Vercel Inc. https://nextjs.org/</w:t>
-      </w:r>
-    </w:p>
-    <w:p>
-      <w:pPr>
-        <w:numPr>
-          <w:ilvl w:val="0"/>
-          <w:numId w:val="1032"/>
-        </w:numPr>
-      </w:pPr>
-      <w:r>
-        <w:t xml:space="preserve">Roda, I., &amp; Macchi, M. (2018). A framework to embed asset management in production companies.</w:t>
-      </w:r>
-      <w:r>
-        <w:t xml:space="preserve"> </w:t>
-      </w:r>
-      <w:r>
-        <w:rPr>
-          <w:i/>
-          <w:iCs/>
-        </w:rPr>
-        <w:t xml:space="preserve">Proceedings of the Institution of Mechanical Engineers, Part O: Journal of Risk and Reliability</w:t>
-      </w:r>
-      <w:r>
-        <w:t xml:space="preserve">, 232(4), 368–378.</w:t>
-      </w:r>
-    </w:p>
-    <w:p>
-      <w:pPr>
-        <w:numPr>
-          <w:ilvl w:val="0"/>
-          <w:numId w:val="1032"/>
-        </w:numPr>
-      </w:pPr>
-      <w:r>
-        <w:t xml:space="preserve">Supabase. (2024).</w:t>
-      </w:r>
-      <w:r>
-        <w:t xml:space="preserve"> </w:t>
-      </w:r>
-      <w:r>
-        <w:rPr>
-          <w:i/>
-          <w:iCs/>
-        </w:rPr>
         <w:t xml:space="preserve">Supabase — The Open Source Firebase Alternative</w:t>
       </w:r>
       <w:r>
         <w:t xml:space="preserve">. https://supabase.com/</w:t>
-      </w:r>
-    </w:p>
-    <w:p>
-      <w:pPr>
-        <w:numPr>
-          <w:ilvl w:val="0"/>
-          <w:numId w:val="1032"/>
-        </w:numPr>
-      </w:pPr>
-      <w:r>
-        <w:t xml:space="preserve">Vercel. (2024).</w:t>
-      </w:r>
-      <w:r>
-        <w:t xml:space="preserve"> </w:t>
-      </w:r>
-      <w:r>
-        <w:rPr>
-          <w:i/>
-          <w:iCs/>
-        </w:rPr>
-        <w:t xml:space="preserve">Vercel — Develop. Preview. Ship.</w:t>
-      </w:r>
-      <w:r>
-        <w:t xml:space="preserve"> </w:t>
-      </w:r>
-      <w:r>
-        <w:t xml:space="preserve">https://vercel.com/</w:t>
       </w:r>
     </w:p>
     <w:p>
@@ -35052,18 +34857,45 @@
               <w:rPr>
                 <w:rStyle w:val="VerbatimChar"/>
               </w:rPr>
-              <w:t xml:space="preserve">gmao/nextjs/app/</w:t>
-            </w:r>
-          </w:p>
-        </w:tc>
-        <w:tc>
-          <w:tcPr/>
-          <w:p>
-            <w:pPr>
-              <w:pStyle w:val="Compact"/>
-            </w:pPr>
-            <w:r>
-              <w:t xml:space="preserve">Application web Next.js (frontend GMAO)</w:t>
+              <w:t xml:space="preserve">dashboard/supervision.py</w:t>
+            </w:r>
+          </w:p>
+        </w:tc>
+        <w:tc>
+          <w:tcPr/>
+          <w:p>
+            <w:pPr>
+              <w:pStyle w:val="Compact"/>
+            </w:pPr>
+            <w:r>
+              <w:t xml:space="preserve">Dashboard Streamlit (supervision + GMAO maison)</w:t>
+            </w:r>
+          </w:p>
+        </w:tc>
+      </w:tr>
+      <w:tr>
+        <w:tc>
+          <w:tcPr/>
+          <w:p>
+            <w:pPr>
+              <w:pStyle w:val="Compact"/>
+            </w:pPr>
+            <w:r>
+              <w:rPr>
+                <w:rStyle w:val="VerbatimChar"/>
+              </w:rPr>
+              <w:t xml:space="preserve">src/realtime/predict_loop.py</w:t>
+            </w:r>
+          </w:p>
+        </w:tc>
+        <w:tc>
+          <w:tcPr/>
+          <w:p>
+            <w:pPr>
+              <w:pStyle w:val="Compact"/>
+            </w:pPr>
+            <w:r>
+              <w:t xml:space="preserve">Service de prédiction temps réel (CR/RUL, ordres de travail)</w:t>
             </w:r>
           </w:p>
         </w:tc>
@@ -36572,7 +36404,7 @@
               <w:pStyle w:val="Compact"/>
             </w:pPr>
             <w:r>
-              <w:t xml:space="preserve">Lasi et al. (2014) ; Lu (2017) ; Xu et al. (2018) ; Bagheri et al. (2024)</w:t>
+              <w:t xml:space="preserve">Lasi et al. (2014) ; Lu (2017) ; Xu et al. (2018) ; Bagheri et al. (2015)</w:t>
             </w:r>
           </w:p>
         </w:tc>
@@ -36664,7 +36496,7 @@
               <w:pStyle w:val="Compact"/>
             </w:pPr>
             <w:r>
-              <w:t xml:space="preserve">Coelho (2022) ; Wei (2024), Yan &amp; Yan (2024), Hu et al. (2024)</w:t>
+              <w:t xml:space="preserve">Coelho (2022) ; Wei (2024), Kuang &amp; Long (2024), Hu et al. (2024)</w:t>
             </w:r>
           </w:p>
         </w:tc>
@@ -36756,7 +36588,7 @@
               <w:pStyle w:val="Compact"/>
             </w:pPr>
             <w:r>
-              <w:t xml:space="preserve">ISO 14224 (ISO, 2016) ; GLPI Project (2024) ; Bagheri et al. (2024)</w:t>
+              <w:t xml:space="preserve">ISO 14224 (ISO, 2016) ; GLPI Project (2024) ; Bagheri et al. (2015)</w:t>
             </w:r>
           </w:p>
         </w:tc>

</xml_diff>

<commit_message>
memoire: redaction du resume (FR), abstract (EN) et conclusion generale
- RESUME + mots-cles : synthese fidele OS1-OS4, R2 LORO +0,29 conditionnel a la
  couverture, apport methodologique (structure du R2), statut "en voie de consolidation"
- ABSTRACT + keywords : traduction anglaise equivalente
- CONCLUSION GENERALE : bilan par OS (QR1-QR4), contributions, limites,
  recommandations (COTCO / PME africaines / travaux futurs), honnete sur RMSE<15% non atteint

Restent en placeholder (data/personnel) : nom encadreur (page de titre),
table etalonnage HX711 (§III.1), captures dashboard (§III.5.1).

Co-Authored-By: Claude Opus 4.8 <noreply@anthropic.com>
</commit_message>
<xml_diff>
--- a/memoire/Memoire_M2_Corrosion_BATOUMBI.docx
+++ b/memoire/Memoire_M2_Corrosion_BATOUMBI.docx
@@ -626,11 +626,230 @@
         <w:pStyle w:val="FirstParagraph"/>
       </w:pPr>
       <w:r>
+        <w:t xml:space="preserve">La corrosion constitue le premier poste de coût de dégradation du secteur Oil &amp; Gas et la principale menace pesant sur les pipelines, tel celui exploité par la</w:t>
+      </w:r>
+      <w:r>
+        <w:t xml:space="preserve"> </w:t>
+      </w:r>
+      <w:r>
+        <w:rPr>
+          <w:b/>
+          <w:bCs/>
+        </w:rPr>
+        <w:t xml:space="preserve">COTCO</w:t>
+      </w:r>
+      <w:r>
+        <w:t xml:space="preserve"> </w:t>
+      </w:r>
+      <w:r>
+        <w:t xml:space="preserve">(Tchad-Cameroun), aujourd’hui surveillé par sondes à résistance électrique (ER) exploitées à un niveau Industrie 3.0 (seuils fixes, sans pronostic). Ce mémoire conçoit, développe et valide expérimentalement un</w:t>
+      </w:r>
+      <w:r>
+        <w:t xml:space="preserve"> </w:t>
+      </w:r>
+      <w:r>
+        <w:rPr>
+          <w:b/>
+          <w:bCs/>
+        </w:rPr>
+        <w:t xml:space="preserve">système intégré de maintenance prédictive de la corrosion</w:t>
+      </w:r>
+      <w:r>
+        <w:t xml:space="preserve"> </w:t>
+      </w:r>
+      <w:r>
+        <w:t xml:space="preserve">réalisant une transition</w:t>
+      </w:r>
+      <w:r>
+        <w:t xml:space="preserve"> </w:t>
+      </w:r>
+      <w:r>
+        <w:rPr>
+          <w:b/>
+          <w:bCs/>
+        </w:rPr>
+        <w:t xml:space="preserve">Industrie 3.0 → 4.0</w:t>
+      </w:r>
+      <w:r>
+        <w:t xml:space="preserve"> </w:t>
+      </w:r>
+      <w:r>
+        <w:t xml:space="preserve">sur l’ensemble de la chaîne</w:t>
+      </w:r>
+      <w:r>
+        <w:t xml:space="preserve"> </w:t>
+      </w:r>
+      <w:r>
         <w:rPr>
           <w:i/>
           <w:iCs/>
         </w:rPr>
-        <w:t xml:space="preserve">(Le résumé sera rédigé à l’issue de la campagne expérimentale, une fois les résultats consolidés.)</w:t>
+        <w:t xml:space="preserve">détection → diagnostic → pronostic → décision → action</w:t>
+      </w:r>
+      <w:r>
+        <w:t xml:space="preserve"> </w:t>
+      </w:r>
+      <w:r>
+        <w:t xml:space="preserve">(ISO 13381-1), au moyen de quatre briques : (OS1) une sonde ER instrumentée IoT (ESP32 + HX711 24 bits + DS18B20) ; (OS2) un modèle d’apprentissage automatique</w:t>
+      </w:r>
+      <w:r>
+        <w:t xml:space="preserve"> </w:t>
+      </w:r>
+      <w:r>
+        <w:rPr>
+          <w:b/>
+          <w:bCs/>
+        </w:rPr>
+        <w:t xml:space="preserve">XGBoost</w:t>
+      </w:r>
+      <w:r>
+        <w:t xml:space="preserve"> </w:t>
+      </w:r>
+      <w:r>
+        <w:t xml:space="preserve">prédisant le taux de corrosion (CR), interprété par analyse SHAP et validé par une procédure inter-essais</w:t>
+      </w:r>
+      <w:r>
+        <w:t xml:space="preserve"> </w:t>
+      </w:r>
+      <w:r>
+        <w:rPr>
+          <w:i/>
+          <w:iCs/>
+        </w:rPr>
+        <w:t xml:space="preserve">leave-one-run-out</w:t>
+      </w:r>
+      <w:r>
+        <w:t xml:space="preserve"> </w:t>
+      </w:r>
+      <w:r>
+        <w:t xml:space="preserve">(LORO) ; (OS3) un module de diagnostic des régimes de corrosion et d’identification des facteurs de variabilité ; (OS4) une application web Streamlit dotée d’un</w:t>
+      </w:r>
+      <w:r>
+        <w:t xml:space="preserve"> </w:t>
+      </w:r>
+      <w:r>
+        <w:rPr>
+          <w:b/>
+          <w:bCs/>
+        </w:rPr>
+        <w:t xml:space="preserve">module GMAO maison</w:t>
+      </w:r>
+      <w:r>
+        <w:t xml:space="preserve"> </w:t>
+      </w:r>
+      <w:r>
+        <w:t xml:space="preserve">transposable par API REST à un CMMS open-source. Une campagne d’essais accélérés</w:t>
+      </w:r>
+      <w:r>
+        <w:t xml:space="preserve"> </w:t>
+      </w:r>
+      <w:r>
+        <w:rPr>
+          <w:i/>
+          <w:iCs/>
+        </w:rPr>
+        <w:t xml:space="preserve">run-to-failure</w:t>
+      </w:r>
+      <w:r>
+        <w:t xml:space="preserve"> </w:t>
+      </w:r>
+      <w:r>
+        <w:t xml:space="preserve">(fil de fer en milieu HCl) a alimenté le modèle. Les résultats établissent que la chaîne d’acquisition suit fidèlement la dégradation jusqu’à la rupture (OS1) ; que XGBoost surpasse les références et atteint un R² LORO moyen positif (+0,29),</w:t>
+      </w:r>
+      <w:r>
+        <w:t xml:space="preserve"> </w:t>
+      </w:r>
+      <w:r>
+        <w:rPr>
+          <w:b/>
+          <w:bCs/>
+        </w:rPr>
+        <w:t xml:space="preserve">à condition que les conditions de l’essai testé soient couvertes et répétées à l’entraînement</w:t>
+      </w:r>
+      <w:r>
+        <w:t xml:space="preserve"> </w:t>
+      </w:r>
+      <w:r>
+        <w:t xml:space="preserve">— la performance s’effondrant sinon (R² ≈ −1,77) (OS2) ; que la</w:t>
+      </w:r>
+      <w:r>
+        <w:t xml:space="preserve"> </w:t>
+      </w:r>
+      <w:r>
+        <w:rPr>
+          <w:b/>
+          <w:bCs/>
+        </w:rPr>
+        <w:t xml:space="preserve">température</w:t>
+      </w:r>
+      <w:r>
+        <w:t xml:space="preserve"> </w:t>
+      </w:r>
+      <w:r>
+        <w:t xml:space="preserve">est la variable dominante et que la</w:t>
+      </w:r>
+      <w:r>
+        <w:t xml:space="preserve"> </w:t>
+      </w:r>
+      <w:r>
+        <w:rPr>
+          <w:b/>
+          <w:bCs/>
+        </w:rPr>
+        <w:t xml:space="preserve">répétabilité des conditions</w:t>
+      </w:r>
+      <w:r>
+        <w:t xml:space="preserve"> </w:t>
+      </w:r>
+      <w:r>
+        <w:t xml:space="preserve">gouverne la fiabilité, deux contre-exemples l’établissant expérimentalement (OS3) ; et que l’écran de supervision et le module GMAO (génération automatique d’ordres de travail, KPIs) sont opérationnels (OS4). L’apport méthodologique central est la lecture de la</w:t>
+      </w:r>
+      <w:r>
+        <w:t xml:space="preserve"> </w:t>
+      </w:r>
+      <w:r>
+        <w:rPr>
+          <w:b/>
+          <w:bCs/>
+        </w:rPr>
+        <w:t xml:space="preserve">structure</w:t>
+      </w:r>
+      <w:r>
+        <w:t xml:space="preserve"> </w:t>
+      </w:r>
+      <w:r>
+        <w:t xml:space="preserve">du R² — positif là où les conditions sont couvertes et répétées, négatif sinon —, rarement explicitée dans la littérature, et la démonstration qu’une couche I4.0 est accessible à coût marginal aux opérateurs et PME industrielles africaines. Au vu de l’état d’avancement, les objectifs sont</w:t>
+      </w:r>
+      <w:r>
+        <w:t xml:space="preserve"> </w:t>
+      </w:r>
+      <w:r>
+        <w:rPr>
+          <w:b/>
+          <w:bCs/>
+        </w:rPr>
+        <w:t xml:space="preserve">partiellement atteints et en voie de consolidation</w:t>
+      </w:r>
+      <w:r>
+        <w:t xml:space="preserve">, la campagne expérimentale se poursuivant.</w:t>
+      </w:r>
+    </w:p>
+    <w:p>
+      <w:pPr>
+        <w:pStyle w:val="BodyText"/>
+      </w:pPr>
+      <w:r>
+        <w:rPr>
+          <w:b/>
+          <w:bCs/>
+        </w:rPr>
+        <w:t xml:space="preserve">Mots-clés :</w:t>
+      </w:r>
+      <w:r>
+        <w:t xml:space="preserve"> </w:t>
+      </w:r>
+      <w:r>
+        <w:t xml:space="preserve">maintenance prédictive, corrosion, sonde à résistance électrique (ER), apprentissage automatique, XGBoost, durée de vie résiduelle (RUL), Industrie 4.0, GMAO, pipeline, COTCO.</w:t>
       </w:r>
     </w:p>
     <w:p>
@@ -653,11 +872,224 @@
         <w:pStyle w:val="FirstParagraph"/>
       </w:pPr>
       <w:r>
+        <w:t xml:space="preserve">Corrosion is the leading degradation-cost driver in the Oil &amp; Gas sector and the main threat to pipelines such as the</w:t>
+      </w:r>
+      <w:r>
+        <w:t xml:space="preserve"> </w:t>
+      </w:r>
+      <w:r>
+        <w:rPr>
+          <w:b/>
+          <w:bCs/>
+        </w:rPr>
+        <w:t xml:space="preserve">COTCO</w:t>
+      </w:r>
+      <w:r>
+        <w:t xml:space="preserve"> </w:t>
+      </w:r>
+      <w:r>
+        <w:t xml:space="preserve">line (Chad-Cameroon), currently monitored by electrical-resistance (ER) probes operated at an Industry 3.0 level (fixed thresholds, no prognosis). This thesis designs, develops and experimentally validates an</w:t>
+      </w:r>
+      <w:r>
+        <w:t xml:space="preserve"> </w:t>
+      </w:r>
+      <w:r>
+        <w:rPr>
+          <w:b/>
+          <w:bCs/>
+        </w:rPr>
+        <w:t xml:space="preserve">integrated predictive-maintenance system for corrosion</w:t>
+      </w:r>
+      <w:r>
+        <w:t xml:space="preserve">, achieving an</w:t>
+      </w:r>
+      <w:r>
+        <w:t xml:space="preserve"> </w:t>
+      </w:r>
+      <w:r>
+        <w:rPr>
+          <w:b/>
+          <w:bCs/>
+        </w:rPr>
+        <w:t xml:space="preserve">Industry 3.0 → 4.0</w:t>
+      </w:r>
+      <w:r>
+        <w:t xml:space="preserve"> </w:t>
+      </w:r>
+      <w:r>
+        <w:t xml:space="preserve">transition across the full</w:t>
+      </w:r>
+      <w:r>
+        <w:t xml:space="preserve"> </w:t>
+      </w:r>
+      <w:r>
         <w:rPr>
           <w:i/>
           <w:iCs/>
         </w:rPr>
-        <w:t xml:space="preserve">(The abstract will be written once the experimental campaign is complete and the results are finalised.)</w:t>
+        <w:t xml:space="preserve">detection → diagnosis → prognosis → decision → action</w:t>
+      </w:r>
+      <w:r>
+        <w:t xml:space="preserve"> </w:t>
+      </w:r>
+      <w:r>
+        <w:t xml:space="preserve">chain (ISO 13381-1) through four building blocks: (SO1) an IoT-instrumented ER probe (ESP32 + 24-bit HX711 + DS18B20); (SO2) an</w:t>
+      </w:r>
+      <w:r>
+        <w:t xml:space="preserve"> </w:t>
+      </w:r>
+      <w:r>
+        <w:rPr>
+          <w:b/>
+          <w:bCs/>
+        </w:rPr>
+        <w:t xml:space="preserve">XGBoost</w:t>
+      </w:r>
+      <w:r>
+        <w:t xml:space="preserve"> </w:t>
+      </w:r>
+      <w:r>
+        <w:t xml:space="preserve">machine-learning model predicting the corrosion rate (CR), interpreted with SHAP and validated through a</w:t>
+      </w:r>
+      <w:r>
+        <w:t xml:space="preserve"> </w:t>
+      </w:r>
+      <w:r>
+        <w:rPr>
+          <w:i/>
+          <w:iCs/>
+        </w:rPr>
+        <w:t xml:space="preserve">leave-one-run-out</w:t>
+      </w:r>
+      <w:r>
+        <w:t xml:space="preserve"> </w:t>
+      </w:r>
+      <w:r>
+        <w:t xml:space="preserve">(LORO) cross-run procedure; (SO3) a module diagnosing corrosion regimes and identifying variability factors; and (SO4) a Streamlit web application embedding an in-house</w:t>
+      </w:r>
+      <w:r>
+        <w:t xml:space="preserve"> </w:t>
+      </w:r>
+      <w:r>
+        <w:rPr>
+          <w:b/>
+          <w:bCs/>
+        </w:rPr>
+        <w:t xml:space="preserve">CMMS module</w:t>
+      </w:r>
+      <w:r>
+        <w:t xml:space="preserve">, portable via REST API to an open-source CMMS. An accelerated</w:t>
+      </w:r>
+      <w:r>
+        <w:t xml:space="preserve"> </w:t>
+      </w:r>
+      <w:r>
+        <w:rPr>
+          <w:i/>
+          <w:iCs/>
+        </w:rPr>
+        <w:t xml:space="preserve">run-to-failure</w:t>
+      </w:r>
+      <w:r>
+        <w:t xml:space="preserve"> </w:t>
+      </w:r>
+      <w:r>
+        <w:t xml:space="preserve">test campaign (iron wire in HCl) fed the model. The results show that the acquisition chain faithfully tracks degradation up to rupture (SO1); that XGBoost outperforms the baselines and reaches a positive mean LORO R² (+0.29)</w:t>
+      </w:r>
+      <w:r>
+        <w:t xml:space="preserve"> </w:t>
+      </w:r>
+      <w:r>
+        <w:rPr>
+          <w:b/>
+          <w:bCs/>
+        </w:rPr>
+        <w:t xml:space="preserve">provided the tested run’s conditions are covered and repeated in training</w:t>
+      </w:r>
+      <w:r>
+        <w:t xml:space="preserve"> </w:t>
+      </w:r>
+      <w:r>
+        <w:t xml:space="preserve">— collapsing otherwise (R² ≈ −1.77) (SO2); that</w:t>
+      </w:r>
+      <w:r>
+        <w:t xml:space="preserve"> </w:t>
+      </w:r>
+      <w:r>
+        <w:rPr>
+          <w:b/>
+          <w:bCs/>
+        </w:rPr>
+        <w:t xml:space="preserve">temperature</w:t>
+      </w:r>
+      <w:r>
+        <w:t xml:space="preserve"> </w:t>
+      </w:r>
+      <w:r>
+        <w:t xml:space="preserve">is the dominant variable and that</w:t>
+      </w:r>
+      <w:r>
+        <w:t xml:space="preserve"> </w:t>
+      </w:r>
+      <w:r>
+        <w:rPr>
+          <w:b/>
+          <w:bCs/>
+        </w:rPr>
+        <w:t xml:space="preserve">condition repeatability</w:t>
+      </w:r>
+      <w:r>
+        <w:t xml:space="preserve"> </w:t>
+      </w:r>
+      <w:r>
+        <w:t xml:space="preserve">governs reliability, as two counter-examples establish experimentally (SO3); and that the supervision dashboard and CMMS module (automatic work-order generation, KPIs) are operational (SO4). The core methodological contribution is reading the</w:t>
+      </w:r>
+      <w:r>
+        <w:t xml:space="preserve"> </w:t>
+      </w:r>
+      <w:r>
+        <w:rPr>
+          <w:b/>
+          <w:bCs/>
+        </w:rPr>
+        <w:t xml:space="preserve">structure</w:t>
+      </w:r>
+      <w:r>
+        <w:t xml:space="preserve"> </w:t>
+      </w:r>
+      <w:r>
+        <w:t xml:space="preserve">of R² — positive where conditions are covered and repeated, negative otherwise —, rarely made explicit in the literature, together with the demonstration that an Industry 4.0 layer is attainable at marginal cost for African industrial operators and SMEs. Given the current progress, the objectives are</w:t>
+      </w:r>
+      <w:r>
+        <w:t xml:space="preserve"> </w:t>
+      </w:r>
+      <w:r>
+        <w:rPr>
+          <w:b/>
+          <w:bCs/>
+        </w:rPr>
+        <w:t xml:space="preserve">partially met and undergoing consolidation</w:t>
+      </w:r>
+      <w:r>
+        <w:t xml:space="preserve">, as the experimental campaign continues.</w:t>
+      </w:r>
+    </w:p>
+    <w:p>
+      <w:pPr>
+        <w:pStyle w:val="BodyText"/>
+      </w:pPr>
+      <w:r>
+        <w:rPr>
+          <w:b/>
+          <w:bCs/>
+        </w:rPr>
+        <w:t xml:space="preserve">Keywords:</w:t>
+      </w:r>
+      <w:r>
+        <w:t xml:space="preserve"> </w:t>
+      </w:r>
+      <w:r>
+        <w:t xml:space="preserve">predictive maintenance, corrosion, electrical-resistance (ER) probe, machine learning, XGBoost, remaining useful life (RUL), Industry 4.0, CMMS, pipeline, COTCO.</w:t>
       </w:r>
     </w:p>
     <w:p>
@@ -30355,11 +30787,392 @@
         <w:pStyle w:val="FirstParagraph"/>
       </w:pPr>
       <w:r>
+        <w:t xml:space="preserve">Ce mémoire s’est donné pour objectif de concevoir, développer et valider expérimentalement un</w:t>
+      </w:r>
+      <w:r>
+        <w:t xml:space="preserve"> </w:t>
+      </w:r>
+      <w:r>
+        <w:rPr>
+          <w:b/>
+          <w:bCs/>
+        </w:rPr>
+        <w:t xml:space="preserve">système intégré de maintenance prédictive de la corrosion</w:t>
+      </w:r>
+      <w:r>
+        <w:t xml:space="preserve">, matérialisant une transition</w:t>
+      </w:r>
+      <w:r>
+        <w:t xml:space="preserve"> </w:t>
+      </w:r>
+      <w:r>
+        <w:rPr>
+          <w:b/>
+          <w:bCs/>
+        </w:rPr>
+        <w:t xml:space="preserve">Industrie 3.0 → 4.0</w:t>
+      </w:r>
+      <w:r>
+        <w:t xml:space="preserve"> </w:t>
+      </w:r>
+      <w:r>
+        <w:t xml:space="preserve">sur l’ensemble de la chaîne</w:t>
+      </w:r>
+      <w:r>
+        <w:t xml:space="preserve"> </w:t>
+      </w:r>
+      <w:r>
         <w:rPr>
           <w:i/>
           <w:iCs/>
         </w:rPr>
-        <w:t xml:space="preserve">(La conclusion générale sera rédigée à l’issue de la campagne expérimentale.)</w:t>
+        <w:t xml:space="preserve">détection → diagnostic → pronostic → décision → action</w:t>
+      </w:r>
+      <w:r>
+        <w:t xml:space="preserve"> </w:t>
+      </w:r>
+      <w:r>
+        <w:t xml:space="preserve">(ISO 13381-1), et doublement transposable aux opérateurs déjà instrumentés (cas COTCO) comme aux PME industrielles africaines. Au terme du travail, le bilan des quatre objectifs spécifiques peut être dressé.</w:t>
+      </w:r>
+    </w:p>
+    <w:p>
+      <w:pPr>
+        <w:pStyle w:val="BodyText"/>
+      </w:pPr>
+      <w:r>
+        <w:rPr>
+          <w:b/>
+          <w:bCs/>
+        </w:rPr>
+        <w:t xml:space="preserve">OS1 — Détection.</w:t>
+      </w:r>
+      <w:r>
+        <w:t xml:space="preserve"> </w:t>
+      </w:r>
+      <w:r>
+        <w:t xml:space="preserve">La chaîne d’acquisition ER instrumentée (ESP32, HX711 24 bits, DS18B20) est fonctionnelle : elle suit en continu, au pas de 30 secondes, les variations de résistance d’un fil de fer en milieu acide concentré, et a permis de conduire sans interruption une série d’essais</w:t>
+      </w:r>
+      <w:r>
+        <w:t xml:space="preserve"> </w:t>
+      </w:r>
+      <w:r>
+        <w:rPr>
+          <w:i/>
+          <w:iCs/>
+        </w:rPr>
+        <w:t xml:space="preserve">run-to-failure</w:t>
+      </w:r>
+      <w:r>
+        <w:t xml:space="preserve"> </w:t>
+      </w:r>
+      <w:r>
+        <w:t xml:space="preserve">complets jusqu’à la rupture. Elle produit un format de données standardisé, exploitable indifféremment par le pipeline ML maison ou par l’export d’une sonde commerciale (QR1).</w:t>
+      </w:r>
+    </w:p>
+    <w:p>
+      <w:pPr>
+        <w:pStyle w:val="BodyText"/>
+      </w:pPr>
+      <w:r>
+        <w:rPr>
+          <w:b/>
+          <w:bCs/>
+        </w:rPr>
+        <w:t xml:space="preserve">OS2 — Pronostic.</w:t>
+      </w:r>
+      <w:r>
+        <w:t xml:space="preserve"> </w:t>
+      </w:r>
+      <w:r>
+        <w:t xml:space="preserve">Le modèle XGBoost prédit le taux de corrosion et surpasse les références (régression linéaire, prédiction par la moyenne). Sa validation inter-essais</w:t>
+      </w:r>
+      <w:r>
+        <w:t xml:space="preserve"> </w:t>
+      </w:r>
+      <w:r>
+        <w:rPr>
+          <w:i/>
+          <w:iCs/>
+        </w:rPr>
+        <w:t xml:space="preserve">leave-one-run-out</w:t>
+      </w:r>
+      <w:r>
+        <w:t xml:space="preserve"> </w:t>
+      </w:r>
+      <w:r>
+        <w:t xml:space="preserve">atteint un R² moyen positif (+0,29) sur la plage thermique couverte, mais ce résultat n’est pas automatique : il s’effondre (R² ≈ −1,77) lorsque les conditions de l’essai testé ne sont pas couvertes à l’entraînement. La durée de vie résiduelle est estimée par trois voies complémentaires (extrapolation physique, dérivé XGBoost, jumeau numérique). L’objectif de précision fixé a priori (RMSE &lt; 15 %) n’est pas encore atteint de façon stabilisée, le faible effectif d’essais rendant les métriques bruitées (QR2).</w:t>
+      </w:r>
+    </w:p>
+    <w:p>
+      <w:pPr>
+        <w:pStyle w:val="BodyText"/>
+      </w:pPr>
+      <w:r>
+        <w:rPr>
+          <w:b/>
+          <w:bCs/>
+        </w:rPr>
+        <w:t xml:space="preserve">OS3 — Diagnostic et décision.</w:t>
+      </w:r>
+      <w:r>
+        <w:t xml:space="preserve"> </w:t>
+      </w:r>
+      <w:r>
+        <w:t xml:space="preserve">Le module de diagnostic identifie correctement la succession des régimes (induction, croissance, emballement, pré-rupture). L’analyse a établi que la</w:t>
+      </w:r>
+      <w:r>
+        <w:t xml:space="preserve"> </w:t>
+      </w:r>
+      <w:r>
+        <w:rPr>
+          <w:b/>
+          <w:bCs/>
+        </w:rPr>
+        <w:t xml:space="preserve">température est la variable dominante</w:t>
+      </w:r>
+      <w:r>
+        <w:t xml:space="preserve"> </w:t>
+      </w:r>
+      <w:r>
+        <w:t xml:space="preserve">et, surtout, que la</w:t>
+      </w:r>
+      <w:r>
+        <w:t xml:space="preserve"> </w:t>
+      </w:r>
+      <w:r>
+        <w:rPr>
+          <w:b/>
+          <w:bCs/>
+        </w:rPr>
+        <w:t xml:space="preserve">répétabilité des conditions</w:t>
+      </w:r>
+      <w:r>
+        <w:t xml:space="preserve"> </w:t>
+      </w:r>
+      <w:r>
+        <w:t xml:space="preserve">— couverture thermique, qualité de régulation, constance de la concentration — conditionne la fiabilité de la prédiction ; deux contre-exemples (régulation dégradée, acide évaporé) l’ont démontré expérimentalement, auxquels s’ajoute une variabilité intrinsèque de la morphologie de dégradation. Un système d’alertes graduées (vert / orange / rouge) a été calibré sur les sorties CR et RUL (QR3).</w:t>
+      </w:r>
+    </w:p>
+    <w:p>
+      <w:pPr>
+        <w:pStyle w:val="BodyText"/>
+      </w:pPr>
+      <w:r>
+        <w:rPr>
+          <w:b/>
+          <w:bCs/>
+        </w:rPr>
+        <w:t xml:space="preserve">OS4 — Action.</w:t>
+      </w:r>
+      <w:r>
+        <w:t xml:space="preserve"> </w:t>
+      </w:r>
+      <w:r>
+        <w:t xml:space="preserve">L’application web Streamlit et le</w:t>
+      </w:r>
+      <w:r>
+        <w:t xml:space="preserve"> </w:t>
+      </w:r>
+      <w:r>
+        <w:rPr>
+          <w:b/>
+          <w:bCs/>
+        </w:rPr>
+        <w:t xml:space="preserve">module GMAO maison</w:t>
+      </w:r>
+      <w:r>
+        <w:t xml:space="preserve"> </w:t>
+      </w:r>
+      <w:r>
+        <w:t xml:space="preserve">sont opérationnels : ils génèrent et tracent automatiquement les ordres de travail à partir des alertes prédictives, et calculent les KPIs de maintenance (MTBF, MTTR, disponibilité). Le mapping prédiction → ordre de travail est défini de façon générique, transposable par API REST à un CMMS open-source ; cette intégration reste, à ce stade, au statut de spécification (QR4).</w:t>
+      </w:r>
+    </w:p>
+    <w:p>
+      <w:pPr>
+        <w:pStyle w:val="BodyText"/>
+      </w:pPr>
+      <w:r>
+        <w:rPr>
+          <w:b/>
+          <w:bCs/>
+        </w:rPr>
+        <w:t xml:space="preserve">Contributions.</w:t>
+      </w:r>
+      <w:r>
+        <w:t xml:space="preserve"> </w:t>
+      </w:r>
+      <w:r>
+        <w:t xml:space="preserve">L’apport méthodologique central n’est pas la valeur absolue du R² mais la lecture de sa</w:t>
+      </w:r>
+      <w:r>
+        <w:t xml:space="preserve"> </w:t>
+      </w:r>
+      <w:r>
+        <w:rPr>
+          <w:b/>
+          <w:bCs/>
+        </w:rPr>
+        <w:t xml:space="preserve">structure</w:t>
+      </w:r>
+      <w:r>
+        <w:t xml:space="preserve"> </w:t>
+      </w:r>
+      <w:r>
+        <w:t xml:space="preserve">: la prédiction inter-essais est fiable là où les conditions sont couvertes et répétées, et échoue sinon — lecture rarement explicitée dans une littérature dominée par les validations intra-jeu. Le travail démontre par ailleurs qu’une</w:t>
+      </w:r>
+      <w:r>
+        <w:t xml:space="preserve"> </w:t>
+      </w:r>
+      <w:r>
+        <w:rPr>
+          <w:b/>
+          <w:bCs/>
+        </w:rPr>
+        <w:t xml:space="preserve">couche prédictive I4.0 peut être ajoutée pour un coût marginal</w:t>
+      </w:r>
+      <w:r>
+        <w:t xml:space="preserve">, en aval d’une instrumentation existante ou de façon autonome, et qu’une boucle décision → action structurée est accessible</w:t>
+      </w:r>
+      <w:r>
+        <w:t xml:space="preserve"> </w:t>
+      </w:r>
+      <w:r>
+        <w:rPr>
+          <w:b/>
+          <w:bCs/>
+        </w:rPr>
+        <w:t xml:space="preserve">sans licence propriétaire</w:t>
+      </w:r>
+      <w:r>
+        <w:t xml:space="preserve">.</w:t>
+      </w:r>
+    </w:p>
+    <w:p>
+      <w:pPr>
+        <w:pStyle w:val="BodyText"/>
+      </w:pPr>
+      <w:r>
+        <w:rPr>
+          <w:b/>
+          <w:bCs/>
+        </w:rPr>
+        <w:t xml:space="preserve">Limites.</w:t>
+      </w:r>
+      <w:r>
+        <w:t xml:space="preserve"> </w:t>
+      </w:r>
+      <w:r>
+        <w:t xml:space="preserve">Le matériau retenu (fil de fer) n’est pas l’acier API 5L des pipelines : les valeurs absolues de CR ne sont pas directement transposables. Le nombre d’essais reste réduit (métriques bruitées), une seule plage thermique est aujourd’hui couverte par plusieurs répétitions, et l’absence de coupon gravimétrique parallèle prive le travail d’une validation indépendante du CR.</w:t>
+      </w:r>
+    </w:p>
+    <w:p>
+      <w:pPr>
+        <w:pStyle w:val="BodyText"/>
+      </w:pPr>
+      <w:r>
+        <w:rPr>
+          <w:b/>
+          <w:bCs/>
+        </w:rPr>
+        <w:t xml:space="preserve">Recommandations et perspectives.</w:t>
+      </w:r>
+      <w:r>
+        <w:t xml:space="preserve"> </w:t>
+      </w:r>
+      <w:r>
+        <w:t xml:space="preserve">Pour</w:t>
+      </w:r>
+      <w:r>
+        <w:t xml:space="preserve"> </w:t>
+      </w:r>
+      <w:r>
+        <w:rPr>
+          <w:b/>
+          <w:bCs/>
+        </w:rPr>
+        <w:t xml:space="preserve">COTCO</w:t>
+      </w:r>
+      <w:r>
+        <w:t xml:space="preserve">, le pipeline ML est applicable directement aux flux des sondes ER déjà en place via export DCS, sans remplacement matériel, la chaîne d’acquisition autonome ESP32 constituant une option d’extension pour les sections non câblées. Pour les</w:t>
+      </w:r>
+      <w:r>
+        <w:t xml:space="preserve"> </w:t>
+      </w:r>
+      <w:r>
+        <w:rPr>
+          <w:b/>
+          <w:bCs/>
+        </w:rPr>
+        <w:t xml:space="preserve">PME industrielles africaines</w:t>
+      </w:r>
+      <w:r>
+        <w:t xml:space="preserve">, l’architecture module GMAO ↔ CMMS open-source ouvre une démocratisation effective de la maintenance assistée par ordinateur, sans licence propriétaire. Pour les</w:t>
+      </w:r>
+      <w:r>
+        <w:t xml:space="preserve"> </w:t>
+      </w:r>
+      <w:r>
+        <w:rPr>
+          <w:b/>
+          <w:bCs/>
+        </w:rPr>
+        <w:t xml:space="preserve">travaux futurs</w:t>
+      </w:r>
+      <w:r>
+        <w:t xml:space="preserve">, la campagne se poursuit selon quatre axes : compléter la couverture thermique par des essais répétés</w:t>
+      </w:r>
+      <w:r>
+        <w:t xml:space="preserve"> </w:t>
+      </w:r>
+      <w:r>
+        <w:rPr>
+          <w:b/>
+          <w:bCs/>
+        </w:rPr>
+        <w:t xml:space="preserve">au sein d’une même morphologie</w:t>
+      </w:r>
+      <w:r>
+        <w:t xml:space="preserve">, consolider les métriques sur un volume accru, adjoindre une validation gravimétrique, et finaliser l’automatisation de la boucle alerte → ticket CMMS. La transposition aux conditions industrielles réelles (acier API 5L, conditions de procédé) constitue l’objet du stage en entreprise prévu à la suite de ce mémoire.</w:t>
+      </w:r>
+    </w:p>
+    <w:p>
+      <w:pPr>
+        <w:pStyle w:val="BodyText"/>
+      </w:pPr>
+      <w:r>
+        <w:t xml:space="preserve">En définitive, les objectifs sont</w:t>
+      </w:r>
+      <w:r>
+        <w:t xml:space="preserve"> </w:t>
+      </w:r>
+      <w:r>
+        <w:rPr>
+          <w:b/>
+          <w:bCs/>
+        </w:rPr>
+        <w:t xml:space="preserve">partiellement atteints et en voie de consolidation</w:t>
+      </w:r>
+      <w:r>
+        <w:t xml:space="preserve"> </w:t>
+      </w:r>
+      <w:r>
+        <w:t xml:space="preserve">: le système intégré est fonctionnel de bout en bout, et le travail établit les conditions méthodologiques —</w:t>
+      </w:r>
+      <w:r>
+        <w:t xml:space="preserve"> </w:t>
+      </w:r>
+      <w:r>
+        <w:rPr>
+          <w:b/>
+          <w:bCs/>
+        </w:rPr>
+        <w:t xml:space="preserve">couverture et répétabilité</w:t>
+      </w:r>
+      <w:r>
+        <w:t xml:space="preserve"> </w:t>
+      </w:r>
+      <w:r>
+        <w:t xml:space="preserve">— sous lesquelles la maintenance prédictive de la corrosion devient fiable et transposable au contexte industriel africain.</w:t>
       </w:r>
     </w:p>
     <w:p>

</xml_diff>

<commit_message>
memoire: reordonnancement propre des figures III (Supabase de retour)
Regeneration de toutes les figures Chap. III avec numerotation sequentielle correcte :
- escalier evolution LORO : III.10 -> III.5 (a sa juste place en §III.3.2)
- r2_plage III.5->III.6, features III.6->III.7, emballement III.7->III.8,
  contrexemples III.8->III.9, simulateur III.9->III.10, scorecard III.11
- titres GRAVES dans les PNG = legendes markdown (zero mismatch) ; corrige le
  mismatch preexistant contrexemples (grave III.7 / legende III.8)
- chiffres ML identiques (static_results.json inchange : -1,77 / +0,29 confirmes)

Co-Authored-By: Claude Opus 4.8 <noreply@anthropic.com>
</commit_message>
<xml_diff>
--- a/memoire/Memoire_M2_Corrosion_BATOUMBI.docx
+++ b/memoire/Memoire_M2_Corrosion_BATOUMBI.docx
@@ -27002,7 +27002,7 @@
         <w:pStyle w:val="FirstParagraph"/>
       </w:pPr>
       <w:r>
-        <w:t xml:space="preserve">Ce résultat positif (+0,29) n’a pas été obtenu d’emblée : il est l’aboutissement d’une trajectoire que la figure III.10 retrace, du</w:t>
+        <w:t xml:space="preserve">Ce résultat positif (+0,29) n’a pas été obtenu d’emblée : il est l’aboutissement d’une trajectoire que la figure III.5 retrace, du</w:t>
       </w:r>
       <w:r>
         <w:t xml:space="preserve"> </w:t>
@@ -27044,7 +27044,7 @@
           <wp:inline>
             <wp:extent cx="4739005" cy="2901329"/>
             <wp:effectExtent b="0" l="0" r="0" t="0"/>
-            <wp:docPr descr="Figure III.10 — Évolution du R² LORO au fil de la campagne, du LORO initial (couverture nulle) au LORO actuel" title="" id="136" name="Picture"/>
+            <wp:docPr descr="Figure III.5 — Évolution du R² LORO au fil de la campagne, du LORO initial (couverture nulle) au LORO actuel" title="" id="136" name="Picture"/>
             <a:graphic>
               <a:graphicData uri="http://schemas.openxmlformats.org/drawingml/2006/picture">
                 <pic:pic>
@@ -27087,7 +27087,7 @@
         <w:pStyle w:val="ImageCaption"/>
       </w:pPr>
       <w:r>
-        <w:t xml:space="preserve">Figure III.10 — Évolution du R² LORO au fil de la campagne, du LORO initial (couverture nulle) au LORO actuel</w:t>
+        <w:t xml:space="preserve">Figure III.5 — Évolution du R² LORO au fil de la campagne, du LORO initial (couverture nulle) au LORO actuel</w:t>
       </w:r>
     </w:p>
     <w:p>
@@ -27439,7 +27439,7 @@
         <w:pStyle w:val="FirstParagraph"/>
       </w:pPr>
       <w:r>
-        <w:t xml:space="preserve">L’entraînement peut être enrichi de plusieurs manières : série de test seule, ou ajout d’essais auxiliaires bruts, sous-échantillonnés, ou pondérés. La figure III.5 compare ces quatre variantes (R² moyen LORO sur Run #12 et #16). Le résultat est net :</w:t>
+        <w:t xml:space="preserve">L’entraînement peut être enrichi de plusieurs manières : série de test seule, ou ajout d’essais auxiliaires bruts, sous-échantillonnés, ou pondérés. La figure III.6 compare ces quatre variantes (R² moyen LORO sur Run #12 et #16). Le résultat est net :</w:t>
       </w:r>
     </w:p>
     <w:p>
@@ -27535,7 +27535,7 @@
           <wp:inline>
             <wp:extent cx="4014216" cy="2383214"/>
             <wp:effectExtent b="0" l="0" r="0" t="0"/>
-            <wp:docPr descr="Figure III.5 — Effet de la couverture des conditions sur la fiabilité" title="" id="140" name="Picture"/>
+            <wp:docPr descr="Figure III.6 — Effet de la couverture des conditions sur la fiabilité" title="" id="140" name="Picture"/>
             <a:graphic>
               <a:graphicData uri="http://schemas.openxmlformats.org/drawingml/2006/picture">
                 <pic:pic>
@@ -27578,7 +27578,7 @@
         <w:pStyle w:val="ImageCaption"/>
       </w:pPr>
       <w:r>
-        <w:t xml:space="preserve">Figure III.5 — Effet de la couverture des conditions sur la fiabilité</w:t>
+        <w:t xml:space="preserve">Figure III.6 — Effet de la couverture des conditions sur la fiabilité</w:t>
       </w:r>
     </w:p>
     <w:p>
@@ -27716,7 +27716,7 @@
         <w:t xml:space="preserve"> </w:t>
       </w:r>
       <w:r>
-        <w:t xml:space="preserve">— et la dégrade même légèrement (R² moyen ramené de +0,29 à ≈ +0,20 ; figure III.10). Loin d’infirmer le modèle, ce résultat en confirme le mécanisme : enrichir l’entraînement n’est profitable que si l’essai ajouté</w:t>
+        <w:t xml:space="preserve">— et la dégrade même légèrement (R² moyen ramené de +0,29 à ≈ +0,20 ; figure III.5). Loin d’infirmer le modèle, ce résultat en confirme le mécanisme : enrichir l’entraînement n’est profitable que si l’essai ajouté</w:t>
       </w:r>
       <w:r>
         <w:t xml:space="preserve"> </w:t>
@@ -27798,7 +27798,7 @@
         <w:pStyle w:val="FirstParagraph"/>
       </w:pPr>
       <w:r>
-        <w:t xml:space="preserve">La figure III.6 présente l’importance relative des variables dans le modèle. Les variables traduisant l’</w:t>
+        <w:t xml:space="preserve">La figure III.7 présente l’importance relative des variables dans le modèle. Les variables traduisant l’</w:t>
       </w:r>
       <w:r>
         <w:rPr>
@@ -27856,7 +27856,7 @@
           <wp:inline>
             <wp:extent cx="4460240" cy="2198180"/>
             <wp:effectExtent b="0" l="0" r="0" t="0"/>
-            <wp:docPr descr="Figure III.6 — Importance des variables explicatives (XGBoost)" title="" id="144" name="Picture"/>
+            <wp:docPr descr="Figure III.7 — Importance des variables explicatives (XGBoost)" title="" id="144" name="Picture"/>
             <a:graphic>
               <a:graphicData uri="http://schemas.openxmlformats.org/drawingml/2006/picture">
                 <pic:pic>
@@ -27899,7 +27899,7 @@
         <w:pStyle w:val="ImageCaption"/>
       </w:pPr>
       <w:r>
-        <w:t xml:space="preserve">Figure III.6 — Importance des variables explicatives (XGBoost)</w:t>
+        <w:t xml:space="preserve">Figure III.7 — Importance des variables explicatives (XGBoost)</w:t>
       </w:r>
     </w:p>
     <w:bookmarkEnd w:id="146"/>
@@ -28941,7 +28941,7 @@
         <w:t xml:space="preserve"> </w:t>
       </w:r>
       <w:r>
-        <w:t xml:space="preserve">et la perte de tenue mécanique — deux manifestations du même événement, ce qui rejoint l’observation visuelle faite en cours d’essai. La figure III.7 l’illustre sur un essai propre (Run #1) :</w:t>
+        <w:t xml:space="preserve">et la perte de tenue mécanique — deux manifestations du même événement, ce qui rejoint l’observation visuelle faite en cours d’essai. La figure III.8 l’illustre sur un essai propre (Run #1) :</w:t>
       </w:r>
       <w:r>
         <w:t xml:space="preserve"> </w:t>
@@ -28997,7 +28997,7 @@
           <wp:inline>
             <wp:extent cx="4571746" cy="2759833"/>
             <wp:effectExtent b="0" l="0" r="0" t="0"/>
-            <wp:docPr descr="Figure III.7 — Emballement géométrique de R en fin d’essai et rupture par disparition de la section (Run #1, échelle log)" title="" id="150" name="Picture"/>
+            <wp:docPr descr="Figure III.8 — Emballement géométrique de R en fin d’essai et rupture par disparition de la section (Run #1, échelle log)" title="" id="150" name="Picture"/>
             <a:graphic>
               <a:graphicData uri="http://schemas.openxmlformats.org/drawingml/2006/picture">
                 <pic:pic>
@@ -29040,7 +29040,7 @@
         <w:pStyle w:val="ImageCaption"/>
       </w:pPr>
       <w:r>
-        <w:t xml:space="preserve">Figure III.7 — Emballement géométrique de R en fin d’essai et rupture par disparition de la section (Run #1, échelle log)</w:t>
+        <w:t xml:space="preserve">Figure III.8 — Emballement géométrique de R en fin d’essai et rupture par disparition de la section (Run #1, échelle log)</w:t>
       </w:r>
     </w:p>
     <w:bookmarkEnd w:id="152"/>
@@ -29114,7 +29114,7 @@
         <w:pStyle w:val="BodyText"/>
       </w:pPr>
       <w:r>
-        <w:t xml:space="preserve">La figure III.8 confronte la courbe d’un essai propre (Run #16) à celles de ces deux contre-exemples.</w:t>
+        <w:t xml:space="preserve">La figure III.9 confronte la courbe d’un essai propre (Run #16) à celles de ces deux contre-exemples.</w:t>
       </w:r>
     </w:p>
     <w:p>
@@ -29127,7 +29127,7 @@
           <wp:inline>
             <wp:extent cx="4739005" cy="2499070"/>
             <wp:effectExtent b="0" l="0" r="0" t="0"/>
-            <wp:docPr descr="Figure III.8 — Vitrine 30 °C vs contre-exemples" title="" id="154" name="Picture"/>
+            <wp:docPr descr="Figure III.9 — Vitrine 30 °C vs contre-exemples" title="" id="154" name="Picture"/>
             <a:graphic>
               <a:graphicData uri="http://schemas.openxmlformats.org/drawingml/2006/picture">
                 <pic:pic>
@@ -29170,7 +29170,7 @@
         <w:pStyle w:val="ImageCaption"/>
       </w:pPr>
       <w:r>
-        <w:t xml:space="preserve">Figure III.8 — Vitrine 30 °C vs contre-exemples</w:t>
+        <w:t xml:space="preserve">Figure III.9 — Vitrine 30 °C vs contre-exemples</w:t>
       </w:r>
     </w:p>
     <w:p>
@@ -30249,7 +30249,7 @@
         <w:t xml:space="preserve"> </w:t>
       </w:r>
       <w:r>
-        <w:t xml:space="preserve">(figure III.9). Cette démarche s’inspire des données</w:t>
+        <w:t xml:space="preserve">(figure III.10). Cette démarche s’inspire des données</w:t>
       </w:r>
       <w:r>
         <w:t xml:space="preserve"> </w:t>
@@ -30510,7 +30510,7 @@
           <wp:inline>
             <wp:extent cx="4460240" cy="2617966"/>
             <wp:effectExtent b="0" l="0" r="0" t="0"/>
-            <wp:docPr descr="Figure III.9 — Jumeau numérique : bande prédictive de durée de vie (P10–P90) issue des trajectoires synthétiques couvrant les deux morphologies de corrosion, et position de l’essai Run #21 — prédiction avant essai 13–20,5 h, rupture observée à 13,1 h, dans la bande" title="" id="167" name="Picture"/>
+            <wp:docPr descr="Figure III.10 — Jumeau numérique : bande prédictive de durée de vie (P10–P90) issue des trajectoires synthétiques couvrant les deux morphologies de corrosion, et position de l’essai Run #21 — prédiction avant essai 13–20,5 h, rupture observée à 13,1 h, dans la bande" title="" id="167" name="Picture"/>
             <a:graphic>
               <a:graphicData uri="http://schemas.openxmlformats.org/drawingml/2006/picture">
                 <pic:pic>
@@ -30553,7 +30553,7 @@
         <w:pStyle w:val="ImageCaption"/>
       </w:pPr>
       <w:r>
-        <w:t xml:space="preserve">Figure III.9 — Jumeau numérique : bande prédictive de durée de vie (P10–P90) issue des trajectoires synthétiques couvrant les deux morphologies de corrosion, et position de l’essai Run #21 — prédiction</w:t>
+        <w:t xml:space="preserve">Figure III.10 — Jumeau numérique : bande prédictive de durée de vie (P10–P90) issue des trajectoires synthétiques couvrant les deux morphologies de corrosion, et position de l’essai Run #21 — prédiction</w:t>
       </w:r>
       <w:r>
         <w:t xml:space="preserve"> </w:t>

</xml_diff>

<commit_message>
memoire: captures dashboard reelles en §III.5 (demonstration OS4)
- §III.5.1 : 3 captures de supervision (Synoptique III.10, Supervision Run R(t)+T III.11,
  CR(t)+jauges III.12) remplacent le placeholder
- §III.5.2 : capture GMAO / ordres de travail auto (III.13)
- decalage propre pour garder l'ordre de lecture : simulateur III.10->III.14,
  scorecard III.11->III.15 (titre grave regenere)
- captures sous noms descriptifs fig_iii5_*.png (sources brutes laissees hors git)

Co-Authored-By: Claude Opus 4.8 <noreply@anthropic.com>
</commit_message>
<xml_diff>
--- a/memoire/Memoire_M2_Corrosion_BATOUMBI.docx
+++ b/memoire/Memoire_M2_Corrosion_BATOUMBI.docx
@@ -25410,7 +25410,7 @@
     </w:p>
     <w:bookmarkEnd w:id="115"/>
     <w:bookmarkEnd w:id="116"/>
-    <w:bookmarkStart w:id="175" w:name="chapitre-iii-résultats-et-discussions"/>
+    <w:bookmarkStart w:id="187" w:name="chapitre-iii-résultats-et-discussions"/>
     <w:p>
       <w:pPr>
         <w:pStyle w:val="Heading1"/>
@@ -28321,7 +28321,7 @@
         <w:t xml:space="preserve"> </w:t>
       </w:r>
       <w:r>
-        <w:t xml:space="preserve">d’essai à mesure que la pente se stabilise. Confronté aux deux essais graduels réalisés depuis (figure III.11, §III.6.5), le jumeau enregistre</w:t>
+        <w:t xml:space="preserve">d’essai à mesure que la pente se stabilise. Confronté aux deux essais graduels réalisés depuis (figure III.15, §III.6.5), le jumeau enregistre</w:t>
       </w:r>
       <w:r>
         <w:t xml:space="preserve"> </w:t>
@@ -29538,7 +29538,7 @@
     </w:p>
     <w:bookmarkEnd w:id="157"/>
     <w:bookmarkEnd w:id="158"/>
-    <w:bookmarkStart w:id="161" w:name="Xb09493a01bd5c0a7105ec7c90c1b4c54ff82079"/>
+    <w:bookmarkStart w:id="173" w:name="Xb09493a01bd5c0a7105ec7c90c1b4c54ff82079"/>
     <w:p>
       <w:pPr>
         <w:pStyle w:val="Heading2"/>
@@ -29571,7 +29571,7 @@
         <w:t xml:space="preserve">intégré à l’application, dont l’architecture est transposable à un CMMS open-source (§II.7.1). Cette section présente l’état de la démonstration à ce stade.</w:t>
       </w:r>
     </w:p>
-    <w:bookmarkStart w:id="159" w:name="iii.5.1.-écran-de-supervision-temps-réel"/>
+    <w:bookmarkStart w:id="168" w:name="iii.5.1.-écran-de-supervision-temps-réel"/>
     <w:p>
       <w:pPr>
         <w:pStyle w:val="Heading3"/>
@@ -29586,6 +29586,46 @@
       </w:pPr>
       <w:r>
         <w:t xml:space="preserve">Une application web de supervision a été développée (Streamlit). Elle se connecte en temps réel à la base Supabase et affiche, par essai, la résistance compensée, la température, le taux de corrosion et l’état de l’acquisition, dans une interface de type salle de contrôle. Elle détecte automatiquement un run actif et s’actualise en continu.</w:t>
+      </w:r>
+    </w:p>
+    <w:p>
+      <w:pPr>
+        <w:pStyle w:val="BodyText"/>
+      </w:pPr>
+      <w:r>
+        <w:t xml:space="preserve">La page</w:t>
+      </w:r>
+      <w:r>
+        <w:t xml:space="preserve"> </w:t>
+      </w:r>
+      <w:r>
+        <w:rPr>
+          <w:b/>
+          <w:bCs/>
+        </w:rPr>
+        <w:t xml:space="preserve">Synoptique</w:t>
+      </w:r>
+      <w:r>
+        <w:t xml:space="preserve"> </w:t>
+      </w:r>
+      <w:r>
+        <w:t xml:space="preserve">(figure III.10) donne une vue d’ensemble de la chaîne — sonde ER → ESP32 → Wi-Fi → Supabase → pipeline → XGBoost → supervision — assortie des indicateurs de campagne (nombre d’essais, mesures, heures d’acquisition) et du registre des essais. La page</w:t>
+      </w:r>
+      <w:r>
+        <w:t xml:space="preserve"> </w:t>
+      </w:r>
+      <w:r>
+        <w:rPr>
+          <w:b/>
+          <w:bCs/>
+        </w:rPr>
+        <w:t xml:space="preserve">Supervision Run</w:t>
+      </w:r>
+      <w:r>
+        <w:t xml:space="preserve"> </w:t>
+      </w:r>
+      <w:r>
+        <w:t xml:space="preserve">restitue, pour un essai sélectionné, le replay de la résistance compensée</w:t>
       </w:r>
       <w:r>
         <w:t xml:space="preserve"> </w:t>
@@ -29595,331 +29635,10 @@
           <w:i/>
           <w:iCs/>
         </w:rPr>
-        <w:t xml:space="preserve">[Captures d’écran de l’écran de supervision à insérer.]</w:t>
-      </w:r>
-    </w:p>
-    <w:bookmarkEnd w:id="159"/>
-    <w:bookmarkStart w:id="160" w:name="X58bfb2439e119d7dddd15b2923e61316fba5e9a"/>
-    <w:p>
-      <w:pPr>
-        <w:pStyle w:val="Heading3"/>
-      </w:pPr>
-      <w:r>
-        <w:t xml:space="preserve">III.5.2. Module GMAO maison : génération d’ordres de travail et KPIs</w:t>
-      </w:r>
-    </w:p>
-    <w:p>
-      <w:pPr>
-        <w:pStyle w:val="FirstParagraph"/>
-      </w:pPr>
-      <w:r>
-        <w:t xml:space="preserve">Un</w:t>
-      </w:r>
-      <w:r>
-        <w:t xml:space="preserve"> </w:t>
-      </w:r>
-      <w:r>
-        <w:rPr>
-          <w:b/>
-          <w:bCs/>
-        </w:rPr>
-        <w:t xml:space="preserve">module de gestion des ordres de travail (GMAO maison)</w:t>
-      </w:r>
-      <w:r>
-        <w:t xml:space="preserve"> </w:t>
-      </w:r>
-      <w:r>
-        <w:t xml:space="preserve">a été développé : il persiste les OT dans une table dédiée (</w:t>
-      </w:r>
-      <w:r>
-        <w:rPr>
-          <w:rStyle w:val="VerbatimChar"/>
-        </w:rPr>
-        <w:t xml:space="preserve">cr_work_orders</w:t>
-      </w:r>
-      <w:r>
-        <w:t xml:space="preserve">, Supabase) et expose une page « Ordres de travail » dans l’application (création, assignation, clôture). À chaque dépassement de seuil, une alerte génère automatiquement un</w:t>
-      </w:r>
-      <w:r>
-        <w:t xml:space="preserve"> </w:t>
-      </w:r>
-      <w:r>
-        <w:rPr>
-          <w:b/>
-          <w:bCs/>
-        </w:rPr>
-        <w:t xml:space="preserve">ordre de travail enrichi</w:t>
-      </w:r>
-      <w:r>
-        <w:t xml:space="preserve"> </w:t>
-      </w:r>
-      <w:r>
-        <w:t xml:space="preserve">(CR, RUL, régime diagnostiqué, section perdue), avec déduplication (un OT ouvert par run et par niveau). Le mapping prédiction → OT (§II.7.5) est défini de façon générique : les mêmes champs se reporteraient sur un</w:t>
-      </w:r>
-      <w:r>
-        <w:t xml:space="preserve"> </w:t>
-      </w:r>
-      <w:r>
-        <w:rPr>
-          <w:b/>
-          <w:bCs/>
-        </w:rPr>
-        <w:t xml:space="preserve">CMMS open-source exposant une API</w:t>
-      </w:r>
-      <w:r>
-        <w:t xml:space="preserve">, transposition restée au stade de</w:t>
-      </w:r>
-      <w:r>
-        <w:t xml:space="preserve"> </w:t>
-      </w:r>
-      <w:r>
-        <w:rPr>
-          <w:b/>
-          <w:bCs/>
-        </w:rPr>
-        <w:t xml:space="preserve">spécification (non déployée)</w:t>
-      </w:r>
-      <w:r>
-        <w:t xml:space="preserve">, l’accès API des solutions gratuites étant restreint. Les KPIs de maintenance (MTBF, MTTR, disponibilité, taux de fausses alertes) sont calculés à partir de l’historique des OT. Toute la chaîne reste à ce stade</w:t>
-      </w:r>
-      <w:r>
-        <w:t xml:space="preserve"> </w:t>
-      </w:r>
-      <w:r>
-        <w:rPr>
-          <w:b/>
-          <w:bCs/>
-        </w:rPr>
-        <w:t xml:space="preserve">interne à Streamlit/Supabase</w:t>
-      </w:r>
-      <w:r>
-        <w:t xml:space="preserve"> </w:t>
-      </w:r>
-      <w:r>
-        <w:t xml:space="preserve">: aucun appel n’est émis vers un CMMS externe.</w:t>
-      </w:r>
-    </w:p>
-    <w:p>
-      <w:pPr>
-        <w:pStyle w:val="BlockText"/>
-      </w:pPr>
-      <w:r>
-        <w:rPr>
-          <w:b/>
-          <w:bCs/>
-        </w:rPr>
-        <w:t xml:space="preserve">État d’avancement.</w:t>
-      </w:r>
-      <w:r>
-        <w:t xml:space="preserve"> </w:t>
-      </w:r>
-      <w:r>
-        <w:t xml:space="preserve">L’écran de supervision et le module GMAO maison (génération/clôture d’OT, KPIs) sont</w:t>
-      </w:r>
-      <w:r>
-        <w:t xml:space="preserve"> </w:t>
-      </w:r>
-      <w:r>
-        <w:rPr>
-          <w:b/>
-          <w:bCs/>
-        </w:rPr>
-        <w:t xml:space="preserve">opérationnels</w:t>
-      </w:r>
-      <w:r>
-        <w:t xml:space="preserve"> </w:t>
-      </w:r>
-      <w:r>
-        <w:t xml:space="preserve">et démontrent la boucle Sonde → ML → OT de bout en bout. L’intégration à un CMMS open-source mature (GLPI) reste au stade de</w:t>
-      </w:r>
-      <w:r>
-        <w:t xml:space="preserve"> </w:t>
-      </w:r>
-      <w:r>
-        <w:rPr>
-          <w:b/>
-          <w:bCs/>
-        </w:rPr>
-        <w:t xml:space="preserve">spécification transposable</w:t>
-      </w:r>
-      <w:r>
-        <w:t xml:space="preserve">. Les KPIs n’auront de valeur statistique que sur un volume d’essais et d’interventions plus important — ils constituent à ce stade une démonstration de la chaîne de calcul.</w:t>
-      </w:r>
-    </w:p>
-    <w:p>
-      <w:r>
-        <w:pict>
-          <v:rect style="width:0;height:1.5pt" o:hralign="center" o:hrstd="t" o:hr="t"/>
-        </w:pict>
-      </w:r>
-    </w:p>
-    <w:bookmarkEnd w:id="160"/>
-    <w:bookmarkEnd w:id="161"/>
-    <w:bookmarkStart w:id="173" w:name="iii.6.-discussions"/>
-    <w:p>
-      <w:pPr>
-        <w:pStyle w:val="Heading2"/>
-      </w:pPr>
-      <w:r>
-        <w:t xml:space="preserve">III.6. Discussions</w:t>
-      </w:r>
-    </w:p>
-    <w:bookmarkStart w:id="162" w:name="Xf68fd1ddeba738769848465616783f4a3e28b38"/>
-    <w:p>
-      <w:pPr>
-        <w:pStyle w:val="Heading3"/>
-      </w:pPr>
-      <w:r>
-        <w:t xml:space="preserve">III.6.1. Le prototype low-cost face aux sondes commerciales (I3.0 → I4.0)</w:t>
-      </w:r>
-    </w:p>
-    <w:p>
-      <w:pPr>
-        <w:pStyle w:val="FirstParagraph"/>
-      </w:pPr>
-      <w:r>
-        <w:t xml:space="preserve">Les sondes ER commerciales (Cosasco, Emerson Roxar, Permasense) offrent une résolution et un durcissement industriels supérieurs, mais restent coûteuses et exploitées à un niveau Industrie 3.0 (seuils fixes, analyse silotée). Le prototype développé ici, à partir de composants accessibles localement, démontre qu’une</w:t>
-      </w:r>
-      <w:r>
-        <w:t xml:space="preserve"> </w:t>
-      </w:r>
-      <w:r>
-        <w:rPr>
-          <w:b/>
-          <w:bCs/>
-        </w:rPr>
-        <w:t xml:space="preserve">couche prédictive (I4.0) peut être ajoutée pour un coût marginal</w:t>
-      </w:r>
-      <w:r>
-        <w:t xml:space="preserve"> </w:t>
-      </w:r>
-      <w:r>
-        <w:t xml:space="preserve">: il ne s’agit pas de remplacer les sondes commerciales mais de brancher en aval une chaîne ML — saut essentiellement logiciel.</w:t>
-      </w:r>
-    </w:p>
-    <w:bookmarkEnd w:id="162"/>
-    <w:bookmarkStart w:id="163" w:name="X5224df022dd07f7852ef1724ca928ea18bf1556"/>
-    <w:p>
-      <w:pPr>
-        <w:pStyle w:val="Heading3"/>
-      </w:pPr>
-      <w:r>
-        <w:t xml:space="preserve">III.6.2. Performance du modèle — confrontation à la littérature</w:t>
-      </w:r>
-    </w:p>
-    <w:p>
-      <w:pPr>
-        <w:pStyle w:val="FirstParagraph"/>
-      </w:pPr>
-      <w:r>
-        <w:t xml:space="preserve">La littérature rapporte d’excellentes performances pour les modèles ML de prédiction du taux de corrosion sur de</w:t>
-      </w:r>
-      <w:r>
-        <w:t xml:space="preserve"> </w:t>
-      </w:r>
-      <w:r>
-        <w:rPr>
-          <w:b/>
-          <w:bCs/>
-        </w:rPr>
-        <w:t xml:space="preserve">grands jeux de données homogènes</w:t>
-      </w:r>
-      <w:r>
-        <w:t xml:space="preserve"> </w:t>
-      </w:r>
-      <w:r>
-        <w:t xml:space="preserve">(Wei et al., 2024 ; Kuang et Long, 2024 ; Hu et al., 2024, avec des R² &gt; 0,96). Nos résultats, plus modestes en valeur absolue, s’expliquent par un nombre d’essais réduit et, surtout, par le caractère</w:t>
-      </w:r>
-      <w:r>
-        <w:t xml:space="preserve"> </w:t>
-      </w:r>
-      <w:r>
-        <w:rPr>
-          <w:b/>
-          <w:bCs/>
-        </w:rPr>
-        <w:t xml:space="preserve">inter-essais</w:t>
-      </w:r>
-      <w:r>
-        <w:t xml:space="preserve"> </w:t>
-      </w:r>
-      <w:r>
-        <w:t xml:space="preserve">de notre validation (LORO), bien plus exigeante qu’une validation intra-jeu. Le résultat marquant n’est pas tant la valeur du R² que sa</w:t>
-      </w:r>
-      <w:r>
-        <w:t xml:space="preserve"> </w:t>
-      </w:r>
-      <w:r>
-        <w:rPr>
-          <w:b/>
-          <w:bCs/>
-        </w:rPr>
-        <w:t xml:space="preserve">structure</w:t>
-      </w:r>
-      <w:r>
-        <w:t xml:space="preserve"> </w:t>
-      </w:r>
-      <w:r>
-        <w:t xml:space="preserve">: positif là où les conditions sont couvertes et répétées, négatif sinon. Cette lecture, rarement explicitée dans la littérature, constitue l’apport méthodologique de ce travail.</w:t>
-      </w:r>
-    </w:p>
-    <w:bookmarkEnd w:id="163"/>
-    <w:bookmarkStart w:id="164" w:name="X1abad3fb650abc5a9d79a3b29b6be42c791f531"/>
-    <w:p>
-      <w:pPr>
-        <w:pStyle w:val="Heading3"/>
-      </w:pPr>
-      <w:r>
-        <w:t xml:space="preserve">III.6.3. Apport d’une boucle GMAO légère et transposable</w:t>
-      </w:r>
-    </w:p>
-    <w:p>
-      <w:pPr>
-        <w:pStyle w:val="FirstParagraph"/>
-      </w:pPr>
-      <w:r>
-        <w:t xml:space="preserve">Structurer la boucle décision → action par un</w:t>
-      </w:r>
-      <w:r>
-        <w:t xml:space="preserve"> </w:t>
-      </w:r>
-      <w:r>
-        <w:rPr>
-          <w:b/>
-          <w:bCs/>
-        </w:rPr>
-        <w:t xml:space="preserve">module GMAO maison léger</w:t>
-      </w:r>
-      <w:r>
-        <w:t xml:space="preserve">, transposable à un CMMS open-source (GLPI) plutôt que par une suite propriétaire, offre un coût total de possession très faible (de l’ordre de quelques dizaines de dollars, contre 50–250 k USD pour SAP PM ou IBM Maximo), ouvrant la maintenance structurée aux PME industrielles africaines. Cette approche reste compatible avec un déploiement on-premise, exigé par les contraintes de sécurité industrielle (cas COTCO).</w:t>
-      </w:r>
-    </w:p>
-    <w:bookmarkEnd w:id="164"/>
-    <w:bookmarkStart w:id="165" w:name="iii.6.4.-limites-du-travail"/>
-    <w:p>
-      <w:pPr>
-        <w:pStyle w:val="Heading3"/>
-      </w:pPr>
-      <w:r>
-        <w:t xml:space="preserve">III.6.4. Limites du travail</w:t>
-      </w:r>
-    </w:p>
-    <w:p>
-      <w:pPr>
-        <w:pStyle w:val="FirstParagraph"/>
-      </w:pPr>
-      <w:r>
-        <w:rPr>
-          <w:b/>
-          <w:bCs/>
-        </w:rPr>
-        <w:t xml:space="preserve">Limites matérielles :</w:t>
-      </w:r>
-      <w:r>
-        <w:t xml:space="preserve"> </w:t>
-      </w:r>
-      <w:r>
-        <w:t xml:space="preserve">le fil de fer utilisé n’est pas le matériau des pipelines COTCO (acier API 5L). Les valeurs absolues de</w:t>
+        <w:t xml:space="preserve">R</w:t>
+      </w:r>
+      <w:r>
+        <w:t xml:space="preserve">(t) et de la température, avec les grandeurs clés — durée de vie,</w:t>
       </w:r>
       <w:r>
         <w:t xml:space="preserve"> </w:t>
@@ -29929,87 +29648,13 @@
           <w:i/>
           <w:iCs/>
         </w:rPr>
-        <w:t xml:space="preserve">CR</w:t>
-      </w:r>
-      <w:r>
-        <w:t xml:space="preserve"> </w:t>
-      </w:r>
-      <w:r>
-        <w:t xml:space="preserve">ne sont pas directement transposables — limitation assumée dans une preuve de concept visant à valider la chaîne et la méthode. Par ailleurs, en HCl concentré, l’</w:t>
-      </w:r>
-      <w:r>
-        <w:rPr>
-          <w:b/>
-          <w:bCs/>
-        </w:rPr>
-        <w:t xml:space="preserve">électrolyte conducteur shunte partiellement la mesure ER</w:t>
-      </w:r>
-      <w:r>
-        <w:t xml:space="preserve"> </w:t>
-      </w:r>
-      <w:r>
-        <w:t xml:space="preserve">(un courant parasite circule dans la solution en parallèle du fil), ce qui plafonne la résistance mesurable et peut masquer la rupture des fils épais ; ce phénomène physique impose l’emploi d’un</w:t>
-      </w:r>
-      <w:r>
-        <w:t xml:space="preserve"> </w:t>
-      </w:r>
-      <w:r>
-        <w:rPr>
-          <w:b/>
-          <w:bCs/>
-        </w:rPr>
-        <w:t xml:space="preserve">fil fin</w:t>
-      </w:r>
-      <w:r>
-        <w:t xml:space="preserve"> </w:t>
-      </w:r>
-      <w:r>
-        <w:t xml:space="preserve">(Ø ≈ 1,15 mm), qui rompt sous le plafond de mesure et rend l’événement de défaillance observable. Ce même couplage explique le</w:t>
-      </w:r>
-      <w:r>
-        <w:t xml:space="preserve"> </w:t>
-      </w:r>
-      <w:r>
-        <w:rPr>
-          <w:b/>
-          <w:bCs/>
-        </w:rPr>
-        <w:t xml:space="preserve">comportement post-rupture</w:t>
-      </w:r>
-      <w:r>
-        <w:t xml:space="preserve"> </w:t>
-      </w:r>
-      <w:r>
-        <w:t xml:space="preserve">: une fois le fil sectionné, le courant continue de transiter par l’</w:t>
-      </w:r>
-      <w:r>
-        <w:rPr>
-          <w:b/>
-          <w:bCs/>
-        </w:rPr>
-        <w:t xml:space="preserve">électrolyte</w:t>
-      </w:r>
-      <w:r>
-        <w:t xml:space="preserve"> </w:t>
-      </w:r>
-      <w:r>
-        <w:t xml:space="preserve">(et un éventuel dernier filament métallique), si bien que la résistance apparente</w:t>
-      </w:r>
-      <w:r>
-        <w:t xml:space="preserve"> </w:t>
-      </w:r>
-      <w:r>
-        <w:rPr>
-          <w:b/>
-          <w:bCs/>
-        </w:rPr>
-        <w:t xml:space="preserve">reste élevée et croissante</w:t>
-      </w:r>
-      <w:r>
-        <w:t xml:space="preserve"> </w:t>
-      </w:r>
-      <w:r>
-        <w:t xml:space="preserve">jusqu’à l’ouverture franche du circuit. La portion terminale du signal</w:t>
+        <w:t xml:space="preserve">R</w:t>
+      </w:r>
+      <w:r>
+        <w:t xml:space="preserve"> </w:t>
+      </w:r>
+      <w:r>
+        <w:t xml:space="preserve">initiale/finale, température moyenne (figure III.11) — ainsi que le taux de corrosion instantané</w:t>
       </w:r>
       <w:r>
         <w:t xml:space="preserve"> </w:t>
@@ -30019,121 +29664,10 @@
           <w:i/>
           <w:iCs/>
         </w:rPr>
-        <w:t xml:space="preserve">R</w:t>
-      </w:r>
-      <w:r>
-        <w:t xml:space="preserve">(t) relève donc d’une</w:t>
-      </w:r>
-      <w:r>
-        <w:t xml:space="preserve"> </w:t>
-      </w:r>
-      <w:r>
-        <w:rPr>
-          <w:b/>
-          <w:bCs/>
-        </w:rPr>
-        <w:t xml:space="preserve">conduction électrolytique, non métallique</w:t>
-      </w:r>
-      <w:r>
-        <w:t xml:space="preserve"> </w:t>
-      </w:r>
-      <w:r>
-        <w:t xml:space="preserve">: elle ne traduit plus l’état du fil et est, à ce titre,</w:t>
-      </w:r>
-      <w:r>
-        <w:t xml:space="preserve"> </w:t>
-      </w:r>
-      <w:r>
-        <w:rPr>
-          <w:b/>
-          <w:bCs/>
-        </w:rPr>
-        <w:t xml:space="preserve">tronquée au seuil de saturation</w:t>
-      </w:r>
-      <w:r>
-        <w:t xml:space="preserve"> </w:t>
-      </w:r>
-      <w:r>
-        <w:t xml:space="preserve">(</w:t>
-      </w:r>
-      <w:r>
-        <w:rPr>
-          <w:rStyle w:val="VerbatimChar"/>
-        </w:rPr>
-        <w:t xml:space="preserve">rx &gt; 100 Ω</w:t>
-      </w:r>
-      <w:r>
-        <w:t xml:space="preserve">) puis exclue de l’apprentissage (§II.4.4). Cette limitation, propre aux sondes ER en milieu très conducteur, est documentée dans la littérature de la mesure de corrosion (Roberge, 2008 ; Mansfeld, 2014).</w:t>
-      </w:r>
-    </w:p>
-    <w:p>
-      <w:pPr>
-        <w:pStyle w:val="BodyText"/>
-      </w:pPr>
-      <w:r>
-        <w:rPr>
-          <w:b/>
-          <w:bCs/>
-        </w:rPr>
-        <w:t xml:space="preserve">Limites du jeu de données :</w:t>
-      </w:r>
-      <w:r>
-        <w:t xml:space="preserve"> </w:t>
-      </w:r>
-      <w:r>
-        <w:t xml:space="preserve">le nombre d’essais exploités à ce stade reste réduit, ce qui rend les métriques</w:t>
-      </w:r>
-      <w:r>
-        <w:t xml:space="preserve"> </w:t>
-      </w:r>
-      <w:r>
-        <w:rPr>
-          <w:b/>
-          <w:bCs/>
-        </w:rPr>
-        <w:t xml:space="preserve">bruitées</w:t>
-      </w:r>
-      <w:r>
-        <w:t xml:space="preserve"> </w:t>
-      </w:r>
-      <w:r>
-        <w:t xml:space="preserve">(un même essai peut voir son R² varier sensiblement selon la composition du jeu d’entraînement). La campagne en cours vise précisément à augmenter ce volume.</w:t>
-      </w:r>
-    </w:p>
-    <w:p>
-      <w:pPr>
-        <w:pStyle w:val="BodyText"/>
-      </w:pPr>
-      <w:r>
-        <w:rPr>
-          <w:b/>
-          <w:bCs/>
-        </w:rPr>
-        <w:t xml:space="preserve">Limites de la couverture thermique :</w:t>
-      </w:r>
-      <w:r>
-        <w:t xml:space="preserve"> </w:t>
-      </w:r>
-      <w:r>
-        <w:t xml:space="preserve">une seule plage (~30 °C) est aujourd’hui couverte par plusieurs essais répétés ; la plage ~32 °C n’est représentée que par un essai unique (Run #11), ce qui interdit encore toute validation croisée à cette température.</w:t>
-      </w:r>
-    </w:p>
-    <w:p>
-      <w:pPr>
-        <w:pStyle w:val="BodyText"/>
-      </w:pPr>
-      <w:r>
-        <w:rPr>
-          <w:b/>
-          <w:bCs/>
-        </w:rPr>
-        <w:t xml:space="preserve">Limites de la validation :</w:t>
-      </w:r>
-      <w:r>
-        <w:t xml:space="preserve"> </w:t>
-      </w:r>
-      <w:r>
-        <w:t xml:space="preserve">l’absence de coupon gravimétrique parallèle prive ce travail d’une validation indépendante du</w:t>
+        <w:t xml:space="preserve">CR</w:t>
+      </w:r>
+      <w:r>
+        <w:t xml:space="preserve">(t) et l’état final de dégradation (section perdue,</w:t>
       </w:r>
       <w:r>
         <w:t xml:space="preserve"> </w:t>
@@ -30146,358 +29680,7 @@
         <w:t xml:space="preserve">CR</w:t>
       </w:r>
       <w:r>
-        <w:t xml:space="preserve">. Cette double validation ER + gravimétrie est recommandée pour la suite.</w:t>
-      </w:r>
-    </w:p>
-    <w:bookmarkEnd w:id="165"/>
-    <w:bookmarkStart w:id="172" w:name="iii.6.5.-perspectives"/>
-    <w:p>
-      <w:pPr>
-        <w:pStyle w:val="Heading3"/>
-      </w:pPr>
-      <w:r>
-        <w:t xml:space="preserve">III.6.5. Perspectives</w:t>
-      </w:r>
-    </w:p>
-    <w:p>
-      <w:pPr>
-        <w:pStyle w:val="FirstParagraph"/>
-      </w:pPr>
-      <w:r>
-        <w:t xml:space="preserve">La campagne se poursuit selon trois axes : (i)</w:t>
-      </w:r>
-      <w:r>
-        <w:t xml:space="preserve"> </w:t>
-      </w:r>
-      <w:r>
-        <w:rPr>
-          <w:b/>
-          <w:bCs/>
-        </w:rPr>
-        <w:t xml:space="preserve">compléter la couverture thermique</w:t>
-      </w:r>
-      <w:r>
-        <w:t xml:space="preserve"> </w:t>
-      </w:r>
-      <w:r>
-        <w:t xml:space="preserve">par des essais répétés aux consignes 30 °C et 32 °C, afin de transformer la plage 32 °C de « non couverte » à « couverte » ; (ii)</w:t>
-      </w:r>
-      <w:r>
-        <w:t xml:space="preserve"> </w:t>
-      </w:r>
-      <w:r>
-        <w:rPr>
-          <w:b/>
-          <w:bCs/>
-        </w:rPr>
-        <w:t xml:space="preserve">consolider les métriques</w:t>
-      </w:r>
-      <w:r>
-        <w:t xml:space="preserve"> </w:t>
-      </w:r>
-      <w:r>
-        <w:t xml:space="preserve">sur un volume d’essais accru ; (iii)</w:t>
-      </w:r>
-      <w:r>
-        <w:t xml:space="preserve"> </w:t>
-      </w:r>
-      <w:r>
-        <w:rPr>
-          <w:b/>
-          <w:bCs/>
-        </w:rPr>
-        <w:t xml:space="preserve">finaliser l’automatisation</w:t>
-      </w:r>
-      <w:r>
-        <w:t xml:space="preserve"> </w:t>
-      </w:r>
-      <w:r>
-        <w:t xml:space="preserve">de la boucle alerte → ticket CMMS et le calcul des KPIs sur historique. La transposition aux conditions industrielles réelles (acier API 5L, conditions de procédé) constitue l’objet du stage en entreprise prévu à la suite de ce mémoire.</w:t>
-      </w:r>
-    </w:p>
-    <w:p>
-      <w:pPr>
-        <w:pStyle w:val="BodyText"/>
-      </w:pPr>
-      <w:r>
-        <w:t xml:space="preserve">Un quatrième axe, exploratoire, vise à</w:t>
-      </w:r>
-      <w:r>
-        <w:t xml:space="preserve"> </w:t>
-      </w:r>
-      <w:r>
-        <w:rPr>
-          <w:b/>
-          <w:bCs/>
-        </w:rPr>
-        <w:t xml:space="preserve">densifier synthétiquement l’espace des conditions</w:t>
-      </w:r>
-      <w:r>
-        <w:t xml:space="preserve">. Plutôt que de multiplier des essais réels coûteux, un jumeau numérique mécaniste — calibré sur les essais réels et décrivant la cinétique de corrosion par une loi sigmoïde d’Avrami (induction puis emballement, Avrami, 1939) — permet de générer des trajectoires synthétiques et d’en déduire, pour un essai à venir, une</w:t>
-      </w:r>
-      <w:r>
-        <w:t xml:space="preserve"> </w:t>
-      </w:r>
-      <w:r>
-        <w:rPr>
-          <w:b/>
-          <w:bCs/>
-        </w:rPr>
-        <w:t xml:space="preserve">bande prédictive de durée de vie</w:t>
-      </w:r>
-      <w:r>
-        <w:t xml:space="preserve"> </w:t>
-      </w:r>
-      <w:r>
-        <w:t xml:space="preserve">(figure III.10). Cette démarche s’inspire des données</w:t>
-      </w:r>
-      <w:r>
-        <w:t xml:space="preserve"> </w:t>
-      </w:r>
-      <w:r>
-        <w:rPr>
-          <w:i/>
-          <w:iCs/>
-        </w:rPr>
-        <w:t xml:space="preserve">run-to-failure</w:t>
-      </w:r>
-      <w:r>
-        <w:t xml:space="preserve"> </w:t>
-      </w:r>
-      <w:r>
-        <w:t xml:space="preserve">synthétiques largement utilisées en maintenance prédictive (benchmark NASA C-MAPSS ; Saxena et al., 2008). Une première analyse en</w:t>
-      </w:r>
-      <w:r>
-        <w:t xml:space="preserve"> </w:t>
-      </w:r>
-      <w:r>
-        <w:rPr>
-          <w:i/>
-          <w:iCs/>
-        </w:rPr>
-        <w:t xml:space="preserve">leave-one-run-out</w:t>
-      </w:r>
-      <w:r>
-        <w:t xml:space="preserve"> </w:t>
-      </w:r>
-      <w:r>
-        <w:t xml:space="preserve">sur ces trajectoires établit qu’</w:t>
-      </w:r>
-      <w:r>
-        <w:rPr>
-          <w:b/>
-          <w:bCs/>
-        </w:rPr>
-        <w:t xml:space="preserve">une morphologie de corrosion n’est prédictible qu’à partir du moment où elle a été observée au moins deux fois</w:t>
-      </w:r>
-      <w:r>
-        <w:t xml:space="preserve">, ce qui quantifie le besoin de répétition. Deux essais réels, Run #21 puis Run #22, ont depuis fourni deux tests « prédire-puis-confirmer » à l’issue contrastée et instructive (figure III.11). Pour</w:t>
-      </w:r>
-      <w:r>
-        <w:t xml:space="preserve"> </w:t>
-      </w:r>
-      <w:r>
-        <w:rPr>
-          <w:b/>
-          <w:bCs/>
-        </w:rPr>
-        <w:t xml:space="preserve">Run #21</w:t>
-      </w:r>
-      <w:r>
-        <w:t xml:space="preserve">, la bande annoncée</w:t>
-      </w:r>
-      <w:r>
-        <w:t xml:space="preserve"> </w:t>
-      </w:r>
-      <w:r>
-        <w:rPr>
-          <w:i/>
-          <w:iCs/>
-        </w:rPr>
-        <w:t xml:space="preserve">avant</w:t>
-      </w:r>
-      <w:r>
-        <w:t xml:space="preserve"> </w:t>
-      </w:r>
-      <w:r>
-        <w:t xml:space="preserve">l’essai (13–20,5 h, médiane 16 h) a été</w:t>
-      </w:r>
-      <w:r>
-        <w:t xml:space="preserve"> </w:t>
-      </w:r>
-      <w:r>
-        <w:rPr>
-          <w:b/>
-          <w:bCs/>
-        </w:rPr>
-        <w:t xml:space="preserve">vérifiée</w:t>
-      </w:r>
-      <w:r>
-        <w:t xml:space="preserve"> </w:t>
-      </w:r>
-      <w:r>
-        <w:t xml:space="preserve">: rupture à</w:t>
-      </w:r>
-      <w:r>
-        <w:t xml:space="preserve"> </w:t>
-      </w:r>
-      <w:r>
-        <w:rPr>
-          <w:b/>
-          <w:bCs/>
-        </w:rPr>
-        <w:t xml:space="preserve">13,1 h</w:t>
-      </w:r>
-      <w:r>
-        <w:t xml:space="preserve">, à l’intérieur de la bande (borne inférieure). Pour</w:t>
-      </w:r>
-      <w:r>
-        <w:t xml:space="preserve"> </w:t>
-      </w:r>
-      <w:r>
-        <w:rPr>
-          <w:b/>
-          <w:bCs/>
-        </w:rPr>
-        <w:t xml:space="preserve">Run #22</w:t>
-      </w:r>
-      <w:r>
-        <w:t xml:space="preserve">, en revanche, la rupture est survenue à</w:t>
-      </w:r>
-      <w:r>
-        <w:t xml:space="preserve"> </w:t>
-      </w:r>
-      <w:r>
-        <w:rPr>
-          <w:b/>
-          <w:bCs/>
-        </w:rPr>
-        <w:t xml:space="preserve">11,95 h</w:t>
-      </w:r>
-      <w:r>
-        <w:t xml:space="preserve">,</w:t>
-      </w:r>
-      <w:r>
-        <w:t xml:space="preserve"> </w:t>
-      </w:r>
-      <w:r>
-        <w:rPr>
-          <w:b/>
-          <w:bCs/>
-        </w:rPr>
-        <w:t xml:space="preserve">en deçà</w:t>
-      </w:r>
-      <w:r>
-        <w:t xml:space="preserve"> </w:t>
-      </w:r>
-      <w:r>
-        <w:t xml:space="preserve">de la borne basse : l’essai le plus rapide de toute la campagne tombe</w:t>
-      </w:r>
-      <w:r>
-        <w:t xml:space="preserve"> </w:t>
-      </w:r>
-      <w:r>
-        <w:rPr>
-          <w:b/>
-          <w:bCs/>
-        </w:rPr>
-        <w:t xml:space="preserve">sous l’enveloppe des donneurs</w:t>
-      </w:r>
-      <w:r>
-        <w:t xml:space="preserve">, que le jumeau interpole sans l’extrapoler. Ce</w:t>
-      </w:r>
-      <w:r>
-        <w:t xml:space="preserve"> </w:t>
-      </w:r>
-      <w:r>
-        <w:rPr>
-          <w:b/>
-          <w:bCs/>
-        </w:rPr>
-        <w:t xml:space="preserve">manqué n’infirme pas la démarche</w:t>
-      </w:r>
-      <w:r>
-        <w:t xml:space="preserve"> </w:t>
-      </w:r>
-      <w:r>
-        <w:t xml:space="preserve">: il en délimite le domaine de validité — la bande devra être élargie vers les essais rapides — et illustre, sur un cas réel, la limite annoncée. Run #21 et Run #22 ajoutent par ailleurs deux représentants de la morphologie graduelle ; mais les trois graduels observés demeurent</w:t>
-      </w:r>
-      <w:r>
-        <w:t xml:space="preserve"> </w:t>
-      </w:r>
-      <w:r>
-        <w:rPr>
-          <w:b/>
-          <w:bCs/>
-        </w:rPr>
-        <w:t xml:space="preserve">hétérogènes</w:t>
-      </w:r>
-      <w:r>
-        <w:t xml:space="preserve"> </w:t>
-      </w:r>
-      <w:r>
-        <w:t xml:space="preserve">(Run #1 à 22 h contre Run #21 et #22 à ≈ 12–13 h), ce qui montre que le simple décompte de répétitions ne suffit pas : c’est la répétition au sein d’une morphologie</w:t>
-      </w:r>
-      <w:r>
-        <w:t xml:space="preserve"> </w:t>
-      </w:r>
-      <w:r>
-        <w:rPr>
-          <w:b/>
-          <w:bCs/>
-        </w:rPr>
-        <w:t xml:space="preserve">homogène</w:t>
-      </w:r>
-      <w:r>
-        <w:t xml:space="preserve"> </w:t>
-      </w:r>
-      <w:r>
-        <w:t xml:space="preserve">qui confère la prédictibilité. Il importe enfin de souligner que le jumeau numérique et le modèle XGBoost (§III.3) répondent à deux questions distinctes — le premier estime la</w:t>
-      </w:r>
-      <w:r>
-        <w:t xml:space="preserve"> </w:t>
-      </w:r>
-      <w:r>
-        <w:rPr>
-          <w:b/>
-          <w:bCs/>
-        </w:rPr>
-        <w:t xml:space="preserve">durée de vie</w:t>
-      </w:r>
-      <w:r>
-        <w:t xml:space="preserve"> </w:t>
-      </w:r>
-      <w:r>
-        <w:t xml:space="preserve">(l’instant de rupture), le second le</w:t>
-      </w:r>
-      <w:r>
-        <w:t xml:space="preserve"> </w:t>
-      </w:r>
-      <w:r>
-        <w:rPr>
-          <w:b/>
-          <w:bCs/>
-        </w:rPr>
-        <w:t xml:space="preserve">taux de corrosion instantané</w:t>
-      </w:r>
-      <w:r>
-        <w:t xml:space="preserve"> </w:t>
-      </w:r>
-      <w:r>
-        <w:t xml:space="preserve">— et convergent vers un même enseignement : une prédiction n’est fiable qu’au sein d’une morphologie déjà observée et</w:t>
-      </w:r>
-      <w:r>
-        <w:t xml:space="preserve"> </w:t>
-      </w:r>
-      <w:r>
-        <w:rPr>
-          <w:b/>
-          <w:bCs/>
-        </w:rPr>
-        <w:t xml:space="preserve">suffisamment répétée</w:t>
-      </w:r>
-      <w:r>
-        <w:t xml:space="preserve">. Ces travaux, encore préliminaires, seront validés et étendus dans la suite de la campagne.</w:t>
+        <w:t xml:space="preserve">) sous forme de jauges (figure III.12).</w:t>
       </w:r>
     </w:p>
     <w:p>
@@ -30508,20 +29691,1146 @@
       <w:r>
         <w:drawing>
           <wp:inline>
-            <wp:extent cx="4460240" cy="2617966"/>
+            <wp:extent cx="5129276" cy="2267041"/>
             <wp:effectExtent b="0" l="0" r="0" t="0"/>
-            <wp:docPr descr="Figure III.10 — Jumeau numérique : bande prédictive de durée de vie (P10–P90) issue des trajectoires synthétiques couvrant les deux morphologies de corrosion, et position de l’essai Run #21 — prédiction avant essai 13–20,5 h, rupture observée à 13,1 h, dans la bande" title="" id="167" name="Picture"/>
+            <wp:docPr descr="Figure III.10 — Écran de supervision : synoptique de la chaîne, indicateurs de campagne et registre des essais" title="" id="160" name="Picture"/>
             <a:graphic>
               <a:graphicData uri="http://schemas.openxmlformats.org/drawingml/2006/picture">
                 <pic:pic>
                   <pic:nvPicPr>
-                    <pic:cNvPr descr="figures/fig_simulateur_run21_nonparam.png" id="168" name="Picture"/>
+                    <pic:cNvPr descr="figures/fig_iii5_synoptique.png" id="161" name="Picture"/>
                     <pic:cNvPicPr>
                       <a:picLocks noChangeArrowheads="1" noChangeAspect="1"/>
                     </pic:cNvPicPr>
                   </pic:nvPicPr>
                   <pic:blipFill>
-                    <a:blip r:embed="rId166"/>
+                    <a:blip r:embed="rId159"/>
+                    <a:stretch>
+                      <a:fillRect/>
+                    </a:stretch>
+                  </pic:blipFill>
+                  <pic:spPr bwMode="auto">
+                    <a:xfrm>
+                      <a:off x="0" y="0"/>
+                      <a:ext cx="5129276" cy="2267041"/>
+                    </a:xfrm>
+                    <a:prstGeom prst="rect">
+                      <a:avLst/>
+                    </a:prstGeom>
+                    <a:noFill/>
+                    <a:ln w="9525">
+                      <a:noFill/>
+                      <a:headEnd/>
+                      <a:tailEnd/>
+                    </a:ln>
+                  </pic:spPr>
+                </pic:pic>
+              </a:graphicData>
+            </a:graphic>
+          </wp:inline>
+        </w:drawing>
+      </w:r>
+    </w:p>
+    <w:p>
+      <w:pPr>
+        <w:pStyle w:val="ImageCaption"/>
+      </w:pPr>
+      <w:r>
+        <w:t xml:space="preserve">Figure III.10 — Écran de supervision : synoptique de la chaîne, indicateurs de campagne et registre des essais</w:t>
+      </w:r>
+    </w:p>
+    <w:p>
+      <w:pPr>
+        <w:pStyle w:val="CaptionedFigure"/>
+        <w:jc w:val="center"/>
+      </w:pPr>
+      <w:r>
+        <w:drawing>
+          <wp:inline>
+            <wp:extent cx="5129276" cy="2328075"/>
+            <wp:effectExtent b="0" l="0" r="0" t="0"/>
+            <wp:docPr descr="Figure III.11 — Écran de supervision : analyse détaillée d’un essai — replay de la résistance compensée R(t) et de la température (Run #1)" title="" id="163" name="Picture"/>
+            <a:graphic>
+              <a:graphicData uri="http://schemas.openxmlformats.org/drawingml/2006/picture">
+                <pic:pic>
+                  <pic:nvPicPr>
+                    <pic:cNvPr descr="figures/fig_iii5_supervision_run.png" id="164" name="Picture"/>
+                    <pic:cNvPicPr>
+                      <a:picLocks noChangeArrowheads="1" noChangeAspect="1"/>
+                    </pic:cNvPicPr>
+                  </pic:nvPicPr>
+                  <pic:blipFill>
+                    <a:blip r:embed="rId162"/>
+                    <a:stretch>
+                      <a:fillRect/>
+                    </a:stretch>
+                  </pic:blipFill>
+                  <pic:spPr bwMode="auto">
+                    <a:xfrm>
+                      <a:off x="0" y="0"/>
+                      <a:ext cx="5129276" cy="2328075"/>
+                    </a:xfrm>
+                    <a:prstGeom prst="rect">
+                      <a:avLst/>
+                    </a:prstGeom>
+                    <a:noFill/>
+                    <a:ln w="9525">
+                      <a:noFill/>
+                      <a:headEnd/>
+                      <a:tailEnd/>
+                    </a:ln>
+                  </pic:spPr>
+                </pic:pic>
+              </a:graphicData>
+            </a:graphic>
+          </wp:inline>
+        </w:drawing>
+      </w:r>
+    </w:p>
+    <w:p>
+      <w:pPr>
+        <w:pStyle w:val="ImageCaption"/>
+      </w:pPr>
+      <w:r>
+        <w:t xml:space="preserve">Figure III.11 — Écran de supervision : analyse détaillée d’un essai — replay de la résistance compensée R(t) et de la température (Run #1)</w:t>
+      </w:r>
+    </w:p>
+    <w:p>
+      <w:pPr>
+        <w:pStyle w:val="CaptionedFigure"/>
+        <w:jc w:val="center"/>
+      </w:pPr>
+      <w:r>
+        <w:drawing>
+          <wp:inline>
+            <wp:extent cx="5129276" cy="1445659"/>
+            <wp:effectExtent b="0" l="0" r="0" t="0"/>
+            <wp:docPr descr="Figure III.12 — Écran de supervision : taux de corrosion CR(t) et état final de dégradation (section perdue, CR) en jauges (Run #1)" title="" id="166" name="Picture"/>
+            <a:graphic>
+              <a:graphicData uri="http://schemas.openxmlformats.org/drawingml/2006/picture">
+                <pic:pic>
+                  <pic:nvPicPr>
+                    <pic:cNvPr descr="figures/fig_iii5_cr_etat.png" id="167" name="Picture"/>
+                    <pic:cNvPicPr>
+                      <a:picLocks noChangeArrowheads="1" noChangeAspect="1"/>
+                    </pic:cNvPicPr>
+                  </pic:nvPicPr>
+                  <pic:blipFill>
+                    <a:blip r:embed="rId165"/>
+                    <a:stretch>
+                      <a:fillRect/>
+                    </a:stretch>
+                  </pic:blipFill>
+                  <pic:spPr bwMode="auto">
+                    <a:xfrm>
+                      <a:off x="0" y="0"/>
+                      <a:ext cx="5129276" cy="1445659"/>
+                    </a:xfrm>
+                    <a:prstGeom prst="rect">
+                      <a:avLst/>
+                    </a:prstGeom>
+                    <a:noFill/>
+                    <a:ln w="9525">
+                      <a:noFill/>
+                      <a:headEnd/>
+                      <a:tailEnd/>
+                    </a:ln>
+                  </pic:spPr>
+                </pic:pic>
+              </a:graphicData>
+            </a:graphic>
+          </wp:inline>
+        </w:drawing>
+      </w:r>
+    </w:p>
+    <w:p>
+      <w:pPr>
+        <w:pStyle w:val="ImageCaption"/>
+      </w:pPr>
+      <w:r>
+        <w:t xml:space="preserve">Figure III.12 — Écran de supervision : taux de corrosion CR(t) et état final de dégradation (section perdue, CR) en jauges (Run #1)</w:t>
+      </w:r>
+    </w:p>
+    <w:bookmarkEnd w:id="168"/>
+    <w:bookmarkStart w:id="172" w:name="X58bfb2439e119d7dddd15b2923e61316fba5e9a"/>
+    <w:p>
+      <w:pPr>
+        <w:pStyle w:val="Heading3"/>
+      </w:pPr>
+      <w:r>
+        <w:t xml:space="preserve">III.5.2. Module GMAO maison : génération d’ordres de travail et KPIs</w:t>
+      </w:r>
+    </w:p>
+    <w:p>
+      <w:pPr>
+        <w:pStyle w:val="FirstParagraph"/>
+      </w:pPr>
+      <w:r>
+        <w:t xml:space="preserve">Un</w:t>
+      </w:r>
+      <w:r>
+        <w:t xml:space="preserve"> </w:t>
+      </w:r>
+      <w:r>
+        <w:rPr>
+          <w:b/>
+          <w:bCs/>
+        </w:rPr>
+        <w:t xml:space="preserve">module de gestion des ordres de travail (GMAO maison)</w:t>
+      </w:r>
+      <w:r>
+        <w:t xml:space="preserve"> </w:t>
+      </w:r>
+      <w:r>
+        <w:t xml:space="preserve">a été développé : il persiste les OT dans une table dédiée (</w:t>
+      </w:r>
+      <w:r>
+        <w:rPr>
+          <w:rStyle w:val="VerbatimChar"/>
+        </w:rPr>
+        <w:t xml:space="preserve">cr_work_orders</w:t>
+      </w:r>
+      <w:r>
+        <w:t xml:space="preserve">, Supabase) et expose une page « Ordres de travail » dans l’application (création, assignation, clôture ; figure III.13). À chaque dépassement de seuil, une alerte génère automatiquement un</w:t>
+      </w:r>
+      <w:r>
+        <w:t xml:space="preserve"> </w:t>
+      </w:r>
+      <w:r>
+        <w:rPr>
+          <w:b/>
+          <w:bCs/>
+        </w:rPr>
+        <w:t xml:space="preserve">ordre de travail enrichi</w:t>
+      </w:r>
+      <w:r>
+        <w:t xml:space="preserve"> </w:t>
+      </w:r>
+      <w:r>
+        <w:t xml:space="preserve">(CR, RUL, régime diagnostiqué, section perdue), avec déduplication (un OT ouvert par run et par niveau). Le mapping prédiction → OT (§II.7.5) est défini de façon générique : les mêmes champs se reporteraient sur un</w:t>
+      </w:r>
+      <w:r>
+        <w:t xml:space="preserve"> </w:t>
+      </w:r>
+      <w:r>
+        <w:rPr>
+          <w:b/>
+          <w:bCs/>
+        </w:rPr>
+        <w:t xml:space="preserve">CMMS open-source exposant une API</w:t>
+      </w:r>
+      <w:r>
+        <w:t xml:space="preserve">, transposition restée au stade de</w:t>
+      </w:r>
+      <w:r>
+        <w:t xml:space="preserve"> </w:t>
+      </w:r>
+      <w:r>
+        <w:rPr>
+          <w:b/>
+          <w:bCs/>
+        </w:rPr>
+        <w:t xml:space="preserve">spécification (non déployée)</w:t>
+      </w:r>
+      <w:r>
+        <w:t xml:space="preserve">, l’accès API des solutions gratuites étant restreint. Les KPIs de maintenance (MTBF, MTTR, disponibilité, taux de fausses alertes) sont calculés à partir de l’historique des OT. Toute la chaîne reste à ce stade</w:t>
+      </w:r>
+      <w:r>
+        <w:t xml:space="preserve"> </w:t>
+      </w:r>
+      <w:r>
+        <w:rPr>
+          <w:b/>
+          <w:bCs/>
+        </w:rPr>
+        <w:t xml:space="preserve">interne à Streamlit/Supabase</w:t>
+      </w:r>
+      <w:r>
+        <w:t xml:space="preserve"> </w:t>
+      </w:r>
+      <w:r>
+        <w:t xml:space="preserve">: aucun appel n’est émis vers un CMMS externe.</w:t>
+      </w:r>
+    </w:p>
+    <w:p>
+      <w:pPr>
+        <w:pStyle w:val="CaptionedFigure"/>
+        <w:jc w:val="center"/>
+      </w:pPr>
+      <w:r>
+        <w:drawing>
+          <wp:inline>
+            <wp:extent cx="5129276" cy="2097995"/>
+            <wp:effectExtent b="0" l="0" r="0" t="0"/>
+            <wp:docPr descr="Figure III.13 — Module GMAO maison : ordres de travail générés automatiquement à partir des alertes prédictives (niveau, CR, RUL, section perdue, action recommandée)" title="" id="170" name="Picture"/>
+            <a:graphic>
+              <a:graphicData uri="http://schemas.openxmlformats.org/drawingml/2006/picture">
+                <pic:pic>
+                  <pic:nvPicPr>
+                    <pic:cNvPr descr="figures/fig_iii5_gmao.png" id="171" name="Picture"/>
+                    <pic:cNvPicPr>
+                      <a:picLocks noChangeArrowheads="1" noChangeAspect="1"/>
+                    </pic:cNvPicPr>
+                  </pic:nvPicPr>
+                  <pic:blipFill>
+                    <a:blip r:embed="rId169"/>
+                    <a:stretch>
+                      <a:fillRect/>
+                    </a:stretch>
+                  </pic:blipFill>
+                  <pic:spPr bwMode="auto">
+                    <a:xfrm>
+                      <a:off x="0" y="0"/>
+                      <a:ext cx="5129276" cy="2097995"/>
+                    </a:xfrm>
+                    <a:prstGeom prst="rect">
+                      <a:avLst/>
+                    </a:prstGeom>
+                    <a:noFill/>
+                    <a:ln w="9525">
+                      <a:noFill/>
+                      <a:headEnd/>
+                      <a:tailEnd/>
+                    </a:ln>
+                  </pic:spPr>
+                </pic:pic>
+              </a:graphicData>
+            </a:graphic>
+          </wp:inline>
+        </w:drawing>
+      </w:r>
+    </w:p>
+    <w:p>
+      <w:pPr>
+        <w:pStyle w:val="ImageCaption"/>
+      </w:pPr>
+      <w:r>
+        <w:t xml:space="preserve">Figure III.13 — Module GMAO maison : ordres de travail générés automatiquement à partir des alertes prédictives (niveau, CR, RUL, section perdue, action recommandée)</w:t>
+      </w:r>
+    </w:p>
+    <w:p>
+      <w:pPr>
+        <w:pStyle w:val="BlockText"/>
+      </w:pPr>
+      <w:r>
+        <w:rPr>
+          <w:b/>
+          <w:bCs/>
+        </w:rPr>
+        <w:t xml:space="preserve">État d’avancement.</w:t>
+      </w:r>
+      <w:r>
+        <w:t xml:space="preserve"> </w:t>
+      </w:r>
+      <w:r>
+        <w:t xml:space="preserve">L’écran de supervision et le module GMAO maison (génération/clôture d’OT, KPIs) sont</w:t>
+      </w:r>
+      <w:r>
+        <w:t xml:space="preserve"> </w:t>
+      </w:r>
+      <w:r>
+        <w:rPr>
+          <w:b/>
+          <w:bCs/>
+        </w:rPr>
+        <w:t xml:space="preserve">opérationnels</w:t>
+      </w:r>
+      <w:r>
+        <w:t xml:space="preserve"> </w:t>
+      </w:r>
+      <w:r>
+        <w:t xml:space="preserve">et démontrent la boucle Sonde → ML → OT de bout en bout. L’intégration à un CMMS open-source mature (GLPI) reste au stade de</w:t>
+      </w:r>
+      <w:r>
+        <w:t xml:space="preserve"> </w:t>
+      </w:r>
+      <w:r>
+        <w:rPr>
+          <w:b/>
+          <w:bCs/>
+        </w:rPr>
+        <w:t xml:space="preserve">spécification transposable</w:t>
+      </w:r>
+      <w:r>
+        <w:t xml:space="preserve">. Les KPIs n’auront de valeur statistique que sur un volume d’essais et d’interventions plus important — ils constituent à ce stade une démonstration de la chaîne de calcul.</w:t>
+      </w:r>
+    </w:p>
+    <w:p>
+      <w:r>
+        <w:pict>
+          <v:rect style="width:0;height:1.5pt" o:hralign="center" o:hrstd="t" o:hr="t"/>
+        </w:pict>
+      </w:r>
+    </w:p>
+    <w:bookmarkEnd w:id="172"/>
+    <w:bookmarkEnd w:id="173"/>
+    <w:bookmarkStart w:id="185" w:name="iii.6.-discussions"/>
+    <w:p>
+      <w:pPr>
+        <w:pStyle w:val="Heading2"/>
+      </w:pPr>
+      <w:r>
+        <w:t xml:space="preserve">III.6. Discussions</w:t>
+      </w:r>
+    </w:p>
+    <w:bookmarkStart w:id="174" w:name="Xf68fd1ddeba738769848465616783f4a3e28b38"/>
+    <w:p>
+      <w:pPr>
+        <w:pStyle w:val="Heading3"/>
+      </w:pPr>
+      <w:r>
+        <w:t xml:space="preserve">III.6.1. Le prototype low-cost face aux sondes commerciales (I3.0 → I4.0)</w:t>
+      </w:r>
+    </w:p>
+    <w:p>
+      <w:pPr>
+        <w:pStyle w:val="FirstParagraph"/>
+      </w:pPr>
+      <w:r>
+        <w:t xml:space="preserve">Les sondes ER commerciales (Cosasco, Emerson Roxar, Permasense) offrent une résolution et un durcissement industriels supérieurs, mais restent coûteuses et exploitées à un niveau Industrie 3.0 (seuils fixes, analyse silotée). Le prototype développé ici, à partir de composants accessibles localement, démontre qu’une</w:t>
+      </w:r>
+      <w:r>
+        <w:t xml:space="preserve"> </w:t>
+      </w:r>
+      <w:r>
+        <w:rPr>
+          <w:b/>
+          <w:bCs/>
+        </w:rPr>
+        <w:t xml:space="preserve">couche prédictive (I4.0) peut être ajoutée pour un coût marginal</w:t>
+      </w:r>
+      <w:r>
+        <w:t xml:space="preserve"> </w:t>
+      </w:r>
+      <w:r>
+        <w:t xml:space="preserve">: il ne s’agit pas de remplacer les sondes commerciales mais de brancher en aval une chaîne ML — saut essentiellement logiciel.</w:t>
+      </w:r>
+    </w:p>
+    <w:bookmarkEnd w:id="174"/>
+    <w:bookmarkStart w:id="175" w:name="X5224df022dd07f7852ef1724ca928ea18bf1556"/>
+    <w:p>
+      <w:pPr>
+        <w:pStyle w:val="Heading3"/>
+      </w:pPr>
+      <w:r>
+        <w:t xml:space="preserve">III.6.2. Performance du modèle — confrontation à la littérature</w:t>
+      </w:r>
+    </w:p>
+    <w:p>
+      <w:pPr>
+        <w:pStyle w:val="FirstParagraph"/>
+      </w:pPr>
+      <w:r>
+        <w:t xml:space="preserve">La littérature rapporte d’excellentes performances pour les modèles ML de prédiction du taux de corrosion sur de</w:t>
+      </w:r>
+      <w:r>
+        <w:t xml:space="preserve"> </w:t>
+      </w:r>
+      <w:r>
+        <w:rPr>
+          <w:b/>
+          <w:bCs/>
+        </w:rPr>
+        <w:t xml:space="preserve">grands jeux de données homogènes</w:t>
+      </w:r>
+      <w:r>
+        <w:t xml:space="preserve"> </w:t>
+      </w:r>
+      <w:r>
+        <w:t xml:space="preserve">(Wei et al., 2024 ; Kuang et Long, 2024 ; Hu et al., 2024, avec des R² &gt; 0,96). Nos résultats, plus modestes en valeur absolue, s’expliquent par un nombre d’essais réduit et, surtout, par le caractère</w:t>
+      </w:r>
+      <w:r>
+        <w:t xml:space="preserve"> </w:t>
+      </w:r>
+      <w:r>
+        <w:rPr>
+          <w:b/>
+          <w:bCs/>
+        </w:rPr>
+        <w:t xml:space="preserve">inter-essais</w:t>
+      </w:r>
+      <w:r>
+        <w:t xml:space="preserve"> </w:t>
+      </w:r>
+      <w:r>
+        <w:t xml:space="preserve">de notre validation (LORO), bien plus exigeante qu’une validation intra-jeu. Le résultat marquant n’est pas tant la valeur du R² que sa</w:t>
+      </w:r>
+      <w:r>
+        <w:t xml:space="preserve"> </w:t>
+      </w:r>
+      <w:r>
+        <w:rPr>
+          <w:b/>
+          <w:bCs/>
+        </w:rPr>
+        <w:t xml:space="preserve">structure</w:t>
+      </w:r>
+      <w:r>
+        <w:t xml:space="preserve"> </w:t>
+      </w:r>
+      <w:r>
+        <w:t xml:space="preserve">: positif là où les conditions sont couvertes et répétées, négatif sinon. Cette lecture, rarement explicitée dans la littérature, constitue l’apport méthodologique de ce travail.</w:t>
+      </w:r>
+    </w:p>
+    <w:bookmarkEnd w:id="175"/>
+    <w:bookmarkStart w:id="176" w:name="X1abad3fb650abc5a9d79a3b29b6be42c791f531"/>
+    <w:p>
+      <w:pPr>
+        <w:pStyle w:val="Heading3"/>
+      </w:pPr>
+      <w:r>
+        <w:t xml:space="preserve">III.6.3. Apport d’une boucle GMAO légère et transposable</w:t>
+      </w:r>
+    </w:p>
+    <w:p>
+      <w:pPr>
+        <w:pStyle w:val="FirstParagraph"/>
+      </w:pPr>
+      <w:r>
+        <w:t xml:space="preserve">Structurer la boucle décision → action par un</w:t>
+      </w:r>
+      <w:r>
+        <w:t xml:space="preserve"> </w:t>
+      </w:r>
+      <w:r>
+        <w:rPr>
+          <w:b/>
+          <w:bCs/>
+        </w:rPr>
+        <w:t xml:space="preserve">module GMAO maison léger</w:t>
+      </w:r>
+      <w:r>
+        <w:t xml:space="preserve">, transposable à un CMMS open-source (GLPI) plutôt que par une suite propriétaire, offre un coût total de possession très faible (de l’ordre de quelques dizaines de dollars, contre 50–250 k USD pour SAP PM ou IBM Maximo), ouvrant la maintenance structurée aux PME industrielles africaines. Cette approche reste compatible avec un déploiement on-premise, exigé par les contraintes de sécurité industrielle (cas COTCO).</w:t>
+      </w:r>
+    </w:p>
+    <w:bookmarkEnd w:id="176"/>
+    <w:bookmarkStart w:id="177" w:name="iii.6.4.-limites-du-travail"/>
+    <w:p>
+      <w:pPr>
+        <w:pStyle w:val="Heading3"/>
+      </w:pPr>
+      <w:r>
+        <w:t xml:space="preserve">III.6.4. Limites du travail</w:t>
+      </w:r>
+    </w:p>
+    <w:p>
+      <w:pPr>
+        <w:pStyle w:val="FirstParagraph"/>
+      </w:pPr>
+      <w:r>
+        <w:rPr>
+          <w:b/>
+          <w:bCs/>
+        </w:rPr>
+        <w:t xml:space="preserve">Limites matérielles :</w:t>
+      </w:r>
+      <w:r>
+        <w:t xml:space="preserve"> </w:t>
+      </w:r>
+      <w:r>
+        <w:t xml:space="preserve">le fil de fer utilisé n’est pas le matériau des pipelines COTCO (acier API 5L). Les valeurs absolues de</w:t>
+      </w:r>
+      <w:r>
+        <w:t xml:space="preserve"> </w:t>
+      </w:r>
+      <w:r>
+        <w:rPr>
+          <w:i/>
+          <w:iCs/>
+        </w:rPr>
+        <w:t xml:space="preserve">CR</w:t>
+      </w:r>
+      <w:r>
+        <w:t xml:space="preserve"> </w:t>
+      </w:r>
+      <w:r>
+        <w:t xml:space="preserve">ne sont pas directement transposables — limitation assumée dans une preuve de concept visant à valider la chaîne et la méthode. Par ailleurs, en HCl concentré, l’</w:t>
+      </w:r>
+      <w:r>
+        <w:rPr>
+          <w:b/>
+          <w:bCs/>
+        </w:rPr>
+        <w:t xml:space="preserve">électrolyte conducteur shunte partiellement la mesure ER</w:t>
+      </w:r>
+      <w:r>
+        <w:t xml:space="preserve"> </w:t>
+      </w:r>
+      <w:r>
+        <w:t xml:space="preserve">(un courant parasite circule dans la solution en parallèle du fil), ce qui plafonne la résistance mesurable et peut masquer la rupture des fils épais ; ce phénomène physique impose l’emploi d’un</w:t>
+      </w:r>
+      <w:r>
+        <w:t xml:space="preserve"> </w:t>
+      </w:r>
+      <w:r>
+        <w:rPr>
+          <w:b/>
+          <w:bCs/>
+        </w:rPr>
+        <w:t xml:space="preserve">fil fin</w:t>
+      </w:r>
+      <w:r>
+        <w:t xml:space="preserve"> </w:t>
+      </w:r>
+      <w:r>
+        <w:t xml:space="preserve">(Ø ≈ 1,15 mm), qui rompt sous le plafond de mesure et rend l’événement de défaillance observable. Ce même couplage explique le</w:t>
+      </w:r>
+      <w:r>
+        <w:t xml:space="preserve"> </w:t>
+      </w:r>
+      <w:r>
+        <w:rPr>
+          <w:b/>
+          <w:bCs/>
+        </w:rPr>
+        <w:t xml:space="preserve">comportement post-rupture</w:t>
+      </w:r>
+      <w:r>
+        <w:t xml:space="preserve"> </w:t>
+      </w:r>
+      <w:r>
+        <w:t xml:space="preserve">: une fois le fil sectionné, le courant continue de transiter par l’</w:t>
+      </w:r>
+      <w:r>
+        <w:rPr>
+          <w:b/>
+          <w:bCs/>
+        </w:rPr>
+        <w:t xml:space="preserve">électrolyte</w:t>
+      </w:r>
+      <w:r>
+        <w:t xml:space="preserve"> </w:t>
+      </w:r>
+      <w:r>
+        <w:t xml:space="preserve">(et un éventuel dernier filament métallique), si bien que la résistance apparente</w:t>
+      </w:r>
+      <w:r>
+        <w:t xml:space="preserve"> </w:t>
+      </w:r>
+      <w:r>
+        <w:rPr>
+          <w:b/>
+          <w:bCs/>
+        </w:rPr>
+        <w:t xml:space="preserve">reste élevée et croissante</w:t>
+      </w:r>
+      <w:r>
+        <w:t xml:space="preserve"> </w:t>
+      </w:r>
+      <w:r>
+        <w:t xml:space="preserve">jusqu’à l’ouverture franche du circuit. La portion terminale du signal</w:t>
+      </w:r>
+      <w:r>
+        <w:t xml:space="preserve"> </w:t>
+      </w:r>
+      <w:r>
+        <w:rPr>
+          <w:i/>
+          <w:iCs/>
+        </w:rPr>
+        <w:t xml:space="preserve">R</w:t>
+      </w:r>
+      <w:r>
+        <w:t xml:space="preserve">(t) relève donc d’une</w:t>
+      </w:r>
+      <w:r>
+        <w:t xml:space="preserve"> </w:t>
+      </w:r>
+      <w:r>
+        <w:rPr>
+          <w:b/>
+          <w:bCs/>
+        </w:rPr>
+        <w:t xml:space="preserve">conduction électrolytique, non métallique</w:t>
+      </w:r>
+      <w:r>
+        <w:t xml:space="preserve"> </w:t>
+      </w:r>
+      <w:r>
+        <w:t xml:space="preserve">: elle ne traduit plus l’état du fil et est, à ce titre,</w:t>
+      </w:r>
+      <w:r>
+        <w:t xml:space="preserve"> </w:t>
+      </w:r>
+      <w:r>
+        <w:rPr>
+          <w:b/>
+          <w:bCs/>
+        </w:rPr>
+        <w:t xml:space="preserve">tronquée au seuil de saturation</w:t>
+      </w:r>
+      <w:r>
+        <w:t xml:space="preserve"> </w:t>
+      </w:r>
+      <w:r>
+        <w:t xml:space="preserve">(</w:t>
+      </w:r>
+      <w:r>
+        <w:rPr>
+          <w:rStyle w:val="VerbatimChar"/>
+        </w:rPr>
+        <w:t xml:space="preserve">rx &gt; 100 Ω</w:t>
+      </w:r>
+      <w:r>
+        <w:t xml:space="preserve">) puis exclue de l’apprentissage (§II.4.4). Cette limitation, propre aux sondes ER en milieu très conducteur, est documentée dans la littérature de la mesure de corrosion (Roberge, 2008 ; Mansfeld, 2014).</w:t>
+      </w:r>
+    </w:p>
+    <w:p>
+      <w:pPr>
+        <w:pStyle w:val="BodyText"/>
+      </w:pPr>
+      <w:r>
+        <w:rPr>
+          <w:b/>
+          <w:bCs/>
+        </w:rPr>
+        <w:t xml:space="preserve">Limites du jeu de données :</w:t>
+      </w:r>
+      <w:r>
+        <w:t xml:space="preserve"> </w:t>
+      </w:r>
+      <w:r>
+        <w:t xml:space="preserve">le nombre d’essais exploités à ce stade reste réduit, ce qui rend les métriques</w:t>
+      </w:r>
+      <w:r>
+        <w:t xml:space="preserve"> </w:t>
+      </w:r>
+      <w:r>
+        <w:rPr>
+          <w:b/>
+          <w:bCs/>
+        </w:rPr>
+        <w:t xml:space="preserve">bruitées</w:t>
+      </w:r>
+      <w:r>
+        <w:t xml:space="preserve"> </w:t>
+      </w:r>
+      <w:r>
+        <w:t xml:space="preserve">(un même essai peut voir son R² varier sensiblement selon la composition du jeu d’entraînement). La campagne en cours vise précisément à augmenter ce volume.</w:t>
+      </w:r>
+    </w:p>
+    <w:p>
+      <w:pPr>
+        <w:pStyle w:val="BodyText"/>
+      </w:pPr>
+      <w:r>
+        <w:rPr>
+          <w:b/>
+          <w:bCs/>
+        </w:rPr>
+        <w:t xml:space="preserve">Limites de la couverture thermique :</w:t>
+      </w:r>
+      <w:r>
+        <w:t xml:space="preserve"> </w:t>
+      </w:r>
+      <w:r>
+        <w:t xml:space="preserve">une seule plage (~30 °C) est aujourd’hui couverte par plusieurs essais répétés ; la plage ~32 °C n’est représentée que par un essai unique (Run #11), ce qui interdit encore toute validation croisée à cette température.</w:t>
+      </w:r>
+    </w:p>
+    <w:p>
+      <w:pPr>
+        <w:pStyle w:val="BodyText"/>
+      </w:pPr>
+      <w:r>
+        <w:rPr>
+          <w:b/>
+          <w:bCs/>
+        </w:rPr>
+        <w:t xml:space="preserve">Limites de la validation :</w:t>
+      </w:r>
+      <w:r>
+        <w:t xml:space="preserve"> </w:t>
+      </w:r>
+      <w:r>
+        <w:t xml:space="preserve">l’absence de coupon gravimétrique parallèle prive ce travail d’une validation indépendante du</w:t>
+      </w:r>
+      <w:r>
+        <w:t xml:space="preserve"> </w:t>
+      </w:r>
+      <w:r>
+        <w:rPr>
+          <w:i/>
+          <w:iCs/>
+        </w:rPr>
+        <w:t xml:space="preserve">CR</w:t>
+      </w:r>
+      <w:r>
+        <w:t xml:space="preserve">. Cette double validation ER + gravimétrie est recommandée pour la suite.</w:t>
+      </w:r>
+    </w:p>
+    <w:bookmarkEnd w:id="177"/>
+    <w:bookmarkStart w:id="184" w:name="iii.6.5.-perspectives"/>
+    <w:p>
+      <w:pPr>
+        <w:pStyle w:val="Heading3"/>
+      </w:pPr>
+      <w:r>
+        <w:t xml:space="preserve">III.6.5. Perspectives</w:t>
+      </w:r>
+    </w:p>
+    <w:p>
+      <w:pPr>
+        <w:pStyle w:val="FirstParagraph"/>
+      </w:pPr>
+      <w:r>
+        <w:t xml:space="preserve">La campagne se poursuit selon trois axes : (i)</w:t>
+      </w:r>
+      <w:r>
+        <w:t xml:space="preserve"> </w:t>
+      </w:r>
+      <w:r>
+        <w:rPr>
+          <w:b/>
+          <w:bCs/>
+        </w:rPr>
+        <w:t xml:space="preserve">compléter la couverture thermique</w:t>
+      </w:r>
+      <w:r>
+        <w:t xml:space="preserve"> </w:t>
+      </w:r>
+      <w:r>
+        <w:t xml:space="preserve">par des essais répétés aux consignes 30 °C et 32 °C, afin de transformer la plage 32 °C de « non couverte » à « couverte » ; (ii)</w:t>
+      </w:r>
+      <w:r>
+        <w:t xml:space="preserve"> </w:t>
+      </w:r>
+      <w:r>
+        <w:rPr>
+          <w:b/>
+          <w:bCs/>
+        </w:rPr>
+        <w:t xml:space="preserve">consolider les métriques</w:t>
+      </w:r>
+      <w:r>
+        <w:t xml:space="preserve"> </w:t>
+      </w:r>
+      <w:r>
+        <w:t xml:space="preserve">sur un volume d’essais accru ; (iii)</w:t>
+      </w:r>
+      <w:r>
+        <w:t xml:space="preserve"> </w:t>
+      </w:r>
+      <w:r>
+        <w:rPr>
+          <w:b/>
+          <w:bCs/>
+        </w:rPr>
+        <w:t xml:space="preserve">finaliser l’automatisation</w:t>
+      </w:r>
+      <w:r>
+        <w:t xml:space="preserve"> </w:t>
+      </w:r>
+      <w:r>
+        <w:t xml:space="preserve">de la boucle alerte → ticket CMMS et le calcul des KPIs sur historique. La transposition aux conditions industrielles réelles (acier API 5L, conditions de procédé) constitue l’objet du stage en entreprise prévu à la suite de ce mémoire.</w:t>
+      </w:r>
+    </w:p>
+    <w:p>
+      <w:pPr>
+        <w:pStyle w:val="BodyText"/>
+      </w:pPr>
+      <w:r>
+        <w:t xml:space="preserve">Un quatrième axe, exploratoire, vise à</w:t>
+      </w:r>
+      <w:r>
+        <w:t xml:space="preserve"> </w:t>
+      </w:r>
+      <w:r>
+        <w:rPr>
+          <w:b/>
+          <w:bCs/>
+        </w:rPr>
+        <w:t xml:space="preserve">densifier synthétiquement l’espace des conditions</w:t>
+      </w:r>
+      <w:r>
+        <w:t xml:space="preserve">. Plutôt que de multiplier des essais réels coûteux, un jumeau numérique mécaniste — calibré sur les essais réels et décrivant la cinétique de corrosion par une loi sigmoïde d’Avrami (induction puis emballement, Avrami, 1939) — permet de générer des trajectoires synthétiques et d’en déduire, pour un essai à venir, une</w:t>
+      </w:r>
+      <w:r>
+        <w:t xml:space="preserve"> </w:t>
+      </w:r>
+      <w:r>
+        <w:rPr>
+          <w:b/>
+          <w:bCs/>
+        </w:rPr>
+        <w:t xml:space="preserve">bande prédictive de durée de vie</w:t>
+      </w:r>
+      <w:r>
+        <w:t xml:space="preserve"> </w:t>
+      </w:r>
+      <w:r>
+        <w:t xml:space="preserve">(figure III.14). Cette démarche s’inspire des données</w:t>
+      </w:r>
+      <w:r>
+        <w:t xml:space="preserve"> </w:t>
+      </w:r>
+      <w:r>
+        <w:rPr>
+          <w:i/>
+          <w:iCs/>
+        </w:rPr>
+        <w:t xml:space="preserve">run-to-failure</w:t>
+      </w:r>
+      <w:r>
+        <w:t xml:space="preserve"> </w:t>
+      </w:r>
+      <w:r>
+        <w:t xml:space="preserve">synthétiques largement utilisées en maintenance prédictive (benchmark NASA C-MAPSS ; Saxena et al., 2008). Une première analyse en</w:t>
+      </w:r>
+      <w:r>
+        <w:t xml:space="preserve"> </w:t>
+      </w:r>
+      <w:r>
+        <w:rPr>
+          <w:i/>
+          <w:iCs/>
+        </w:rPr>
+        <w:t xml:space="preserve">leave-one-run-out</w:t>
+      </w:r>
+      <w:r>
+        <w:t xml:space="preserve"> </w:t>
+      </w:r>
+      <w:r>
+        <w:t xml:space="preserve">sur ces trajectoires établit qu’</w:t>
+      </w:r>
+      <w:r>
+        <w:rPr>
+          <w:b/>
+          <w:bCs/>
+        </w:rPr>
+        <w:t xml:space="preserve">une morphologie de corrosion n’est prédictible qu’à partir du moment où elle a été observée au moins deux fois</w:t>
+      </w:r>
+      <w:r>
+        <w:t xml:space="preserve">, ce qui quantifie le besoin de répétition. Deux essais réels, Run #21 puis Run #22, ont depuis fourni deux tests « prédire-puis-confirmer » à l’issue contrastée et instructive (figure III.15). Pour</w:t>
+      </w:r>
+      <w:r>
+        <w:t xml:space="preserve"> </w:t>
+      </w:r>
+      <w:r>
+        <w:rPr>
+          <w:b/>
+          <w:bCs/>
+        </w:rPr>
+        <w:t xml:space="preserve">Run #21</w:t>
+      </w:r>
+      <w:r>
+        <w:t xml:space="preserve">, la bande annoncée</w:t>
+      </w:r>
+      <w:r>
+        <w:t xml:space="preserve"> </w:t>
+      </w:r>
+      <w:r>
+        <w:rPr>
+          <w:i/>
+          <w:iCs/>
+        </w:rPr>
+        <w:t xml:space="preserve">avant</w:t>
+      </w:r>
+      <w:r>
+        <w:t xml:space="preserve"> </w:t>
+      </w:r>
+      <w:r>
+        <w:t xml:space="preserve">l’essai (13–20,5 h, médiane 16 h) a été</w:t>
+      </w:r>
+      <w:r>
+        <w:t xml:space="preserve"> </w:t>
+      </w:r>
+      <w:r>
+        <w:rPr>
+          <w:b/>
+          <w:bCs/>
+        </w:rPr>
+        <w:t xml:space="preserve">vérifiée</w:t>
+      </w:r>
+      <w:r>
+        <w:t xml:space="preserve"> </w:t>
+      </w:r>
+      <w:r>
+        <w:t xml:space="preserve">: rupture à</w:t>
+      </w:r>
+      <w:r>
+        <w:t xml:space="preserve"> </w:t>
+      </w:r>
+      <w:r>
+        <w:rPr>
+          <w:b/>
+          <w:bCs/>
+        </w:rPr>
+        <w:t xml:space="preserve">13,1 h</w:t>
+      </w:r>
+      <w:r>
+        <w:t xml:space="preserve">, à l’intérieur de la bande (borne inférieure). Pour</w:t>
+      </w:r>
+      <w:r>
+        <w:t xml:space="preserve"> </w:t>
+      </w:r>
+      <w:r>
+        <w:rPr>
+          <w:b/>
+          <w:bCs/>
+        </w:rPr>
+        <w:t xml:space="preserve">Run #22</w:t>
+      </w:r>
+      <w:r>
+        <w:t xml:space="preserve">, en revanche, la rupture est survenue à</w:t>
+      </w:r>
+      <w:r>
+        <w:t xml:space="preserve"> </w:t>
+      </w:r>
+      <w:r>
+        <w:rPr>
+          <w:b/>
+          <w:bCs/>
+        </w:rPr>
+        <w:t xml:space="preserve">11,95 h</w:t>
+      </w:r>
+      <w:r>
+        <w:t xml:space="preserve">,</w:t>
+      </w:r>
+      <w:r>
+        <w:t xml:space="preserve"> </w:t>
+      </w:r>
+      <w:r>
+        <w:rPr>
+          <w:b/>
+          <w:bCs/>
+        </w:rPr>
+        <w:t xml:space="preserve">en deçà</w:t>
+      </w:r>
+      <w:r>
+        <w:t xml:space="preserve"> </w:t>
+      </w:r>
+      <w:r>
+        <w:t xml:space="preserve">de la borne basse : l’essai le plus rapide de toute la campagne tombe</w:t>
+      </w:r>
+      <w:r>
+        <w:t xml:space="preserve"> </w:t>
+      </w:r>
+      <w:r>
+        <w:rPr>
+          <w:b/>
+          <w:bCs/>
+        </w:rPr>
+        <w:t xml:space="preserve">sous l’enveloppe des donneurs</w:t>
+      </w:r>
+      <w:r>
+        <w:t xml:space="preserve">, que le jumeau interpole sans l’extrapoler. Ce</w:t>
+      </w:r>
+      <w:r>
+        <w:t xml:space="preserve"> </w:t>
+      </w:r>
+      <w:r>
+        <w:rPr>
+          <w:b/>
+          <w:bCs/>
+        </w:rPr>
+        <w:t xml:space="preserve">manqué n’infirme pas la démarche</w:t>
+      </w:r>
+      <w:r>
+        <w:t xml:space="preserve"> </w:t>
+      </w:r>
+      <w:r>
+        <w:t xml:space="preserve">: il en délimite le domaine de validité — la bande devra être élargie vers les essais rapides — et illustre, sur un cas réel, la limite annoncée. Run #21 et Run #22 ajoutent par ailleurs deux représentants de la morphologie graduelle ; mais les trois graduels observés demeurent</w:t>
+      </w:r>
+      <w:r>
+        <w:t xml:space="preserve"> </w:t>
+      </w:r>
+      <w:r>
+        <w:rPr>
+          <w:b/>
+          <w:bCs/>
+        </w:rPr>
+        <w:t xml:space="preserve">hétérogènes</w:t>
+      </w:r>
+      <w:r>
+        <w:t xml:space="preserve"> </w:t>
+      </w:r>
+      <w:r>
+        <w:t xml:space="preserve">(Run #1 à 22 h contre Run #21 et #22 à ≈ 12–13 h), ce qui montre que le simple décompte de répétitions ne suffit pas : c’est la répétition au sein d’une morphologie</w:t>
+      </w:r>
+      <w:r>
+        <w:t xml:space="preserve"> </w:t>
+      </w:r>
+      <w:r>
+        <w:rPr>
+          <w:b/>
+          <w:bCs/>
+        </w:rPr>
+        <w:t xml:space="preserve">homogène</w:t>
+      </w:r>
+      <w:r>
+        <w:t xml:space="preserve"> </w:t>
+      </w:r>
+      <w:r>
+        <w:t xml:space="preserve">qui confère la prédictibilité. Il importe enfin de souligner que le jumeau numérique et le modèle XGBoost (§III.3) répondent à deux questions distinctes — le premier estime la</w:t>
+      </w:r>
+      <w:r>
+        <w:t xml:space="preserve"> </w:t>
+      </w:r>
+      <w:r>
+        <w:rPr>
+          <w:b/>
+          <w:bCs/>
+        </w:rPr>
+        <w:t xml:space="preserve">durée de vie</w:t>
+      </w:r>
+      <w:r>
+        <w:t xml:space="preserve"> </w:t>
+      </w:r>
+      <w:r>
+        <w:t xml:space="preserve">(l’instant de rupture), le second le</w:t>
+      </w:r>
+      <w:r>
+        <w:t xml:space="preserve"> </w:t>
+      </w:r>
+      <w:r>
+        <w:rPr>
+          <w:b/>
+          <w:bCs/>
+        </w:rPr>
+        <w:t xml:space="preserve">taux de corrosion instantané</w:t>
+      </w:r>
+      <w:r>
+        <w:t xml:space="preserve"> </w:t>
+      </w:r>
+      <w:r>
+        <w:t xml:space="preserve">— et convergent vers un même enseignement : une prédiction n’est fiable qu’au sein d’une morphologie déjà observée et</w:t>
+      </w:r>
+      <w:r>
+        <w:t xml:space="preserve"> </w:t>
+      </w:r>
+      <w:r>
+        <w:rPr>
+          <w:b/>
+          <w:bCs/>
+        </w:rPr>
+        <w:t xml:space="preserve">suffisamment répétée</w:t>
+      </w:r>
+      <w:r>
+        <w:t xml:space="preserve">. Ces travaux, encore préliminaires, seront validés et étendus dans la suite de la campagne.</w:t>
+      </w:r>
+    </w:p>
+    <w:p>
+      <w:pPr>
+        <w:pStyle w:val="CaptionedFigure"/>
+        <w:jc w:val="center"/>
+      </w:pPr>
+      <w:r>
+        <w:drawing>
+          <wp:inline>
+            <wp:extent cx="4460240" cy="2617966"/>
+            <wp:effectExtent b="0" l="0" r="0" t="0"/>
+            <wp:docPr descr="Figure III.14 — Jumeau numérique : bande prédictive de durée de vie (P10–P90) issue des trajectoires synthétiques couvrant les deux morphologies de corrosion, et position de l’essai Run #21 — prédiction avant essai 13–20,5 h, rupture observée à 13,1 h, dans la bande" title="" id="179" name="Picture"/>
+            <a:graphic>
+              <a:graphicData uri="http://schemas.openxmlformats.org/drawingml/2006/picture">
+                <pic:pic>
+                  <pic:nvPicPr>
+                    <pic:cNvPr descr="figures/fig_simulateur_run21_nonparam.png" id="180" name="Picture"/>
+                    <pic:cNvPicPr>
+                      <a:picLocks noChangeArrowheads="1" noChangeAspect="1"/>
+                    </pic:cNvPicPr>
+                  </pic:nvPicPr>
+                  <pic:blipFill>
+                    <a:blip r:embed="rId178"/>
                     <a:stretch>
                       <a:fillRect/>
                     </a:stretch>
@@ -30553,7 +30862,7 @@
         <w:pStyle w:val="ImageCaption"/>
       </w:pPr>
       <w:r>
-        <w:t xml:space="preserve">Figure III.10 — Jumeau numérique : bande prédictive de durée de vie (P10–P90) issue des trajectoires synthétiques couvrant les deux morphologies de corrosion, et position de l’essai Run #21 — prédiction</w:t>
+        <w:t xml:space="preserve">Figure III.14 — Jumeau numérique : bande prédictive de durée de vie (P10–P90) issue des trajectoires synthétiques couvrant les deux morphologies de corrosion, et position de l’essai Run #21 — prédiction</w:t>
       </w:r>
       <w:r>
         <w:t xml:space="preserve"> </w:t>
@@ -30582,18 +30891,18 @@
           <wp:inline>
             <wp:extent cx="4571746" cy="1811855"/>
             <wp:effectExtent b="0" l="0" r="0" t="0"/>
-            <wp:docPr descr="Figure III.11 — Bande prédictive du jumeau confrontée aux deux essais graduels réels : Run #21 (13,1 h) à l’intérieur de la bande, Run #22 (11,95 h) en deçà — bilan « prédire-puis-confirmer » de un sur deux" title="" id="170" name="Picture"/>
+            <wp:docPr descr="Figure III.15 — Bande prédictive du jumeau confrontée aux deux essais graduels réels : Run #21 (13,1 h) à l’intérieur de la bande, Run #22 (11,95 h) en deçà — bilan « prédire-puis-confirmer » de un sur deux" title="" id="182" name="Picture"/>
             <a:graphic>
               <a:graphicData uri="http://schemas.openxmlformats.org/drawingml/2006/picture">
                 <pic:pic>
                   <pic:nvPicPr>
-                    <pic:cNvPr descr="figures/fig_iii3_band_scorecard.png" id="171" name="Picture"/>
+                    <pic:cNvPr descr="figures/fig_iii3_band_scorecard.png" id="183" name="Picture"/>
                     <pic:cNvPicPr>
                       <a:picLocks noChangeArrowheads="1" noChangeAspect="1"/>
                     </pic:cNvPicPr>
                   </pic:nvPicPr>
                   <pic:blipFill>
-                    <a:blip r:embed="rId169"/>
+                    <a:blip r:embed="rId181"/>
                     <a:stretch>
                       <a:fillRect/>
                     </a:stretch>
@@ -30625,7 +30934,7 @@
         <w:pStyle w:val="ImageCaption"/>
       </w:pPr>
       <w:r>
-        <w:t xml:space="preserve">Figure III.11 — Bande prédictive du jumeau confrontée aux deux essais graduels réels : Run #21 (13,1 h) à l’intérieur de la bande, Run #22 (11,95 h) en deçà — bilan « prédire-puis-confirmer » de un sur deux</w:t>
+        <w:t xml:space="preserve">Figure III.15 — Bande prédictive du jumeau confrontée aux deux essais graduels réels : Run #21 (13,1 h) à l’intérieur de la bande, Run #22 (11,95 h) en deçà — bilan « prédire-puis-confirmer » de un sur deux</w:t>
       </w:r>
     </w:p>
     <w:p>
@@ -30635,9 +30944,9 @@
         </w:pict>
       </w:r>
     </w:p>
-    <w:bookmarkEnd w:id="172"/>
-    <w:bookmarkEnd w:id="173"/>
-    <w:bookmarkStart w:id="174" w:name="iii.7.-conclusion-du-chapitre-iii"/>
+    <w:bookmarkEnd w:id="184"/>
+    <w:bookmarkEnd w:id="185"/>
+    <w:bookmarkStart w:id="186" w:name="iii.7.-conclusion-du-chapitre-iii"/>
     <w:p>
       <w:pPr>
         <w:pStyle w:val="Heading2"/>
@@ -30771,9 +31080,9 @@
         <w:br w:type="page"/>
       </w:r>
     </w:p>
-    <w:bookmarkEnd w:id="174"/>
-    <w:bookmarkEnd w:id="175"/>
-    <w:bookmarkStart w:id="176" w:name="conclusion-générale"/>
+    <w:bookmarkEnd w:id="186"/>
+    <w:bookmarkEnd w:id="187"/>
+    <w:bookmarkStart w:id="188" w:name="conclusion-générale"/>
     <w:p>
       <w:pPr>
         <w:pStyle w:val="Heading1"/>
@@ -31180,8 +31489,8 @@
         <w:br w:type="page"/>
       </w:r>
     </w:p>
-    <w:bookmarkEnd w:id="176"/>
-    <w:bookmarkStart w:id="177" w:name="références-bibliographiques"/>
+    <w:bookmarkEnd w:id="188"/>
+    <w:bookmarkStart w:id="189" w:name="références-bibliographiques"/>
     <w:p>
       <w:pPr>
         <w:pStyle w:val="Heading1"/>
@@ -33071,8 +33380,8 @@
         <w:br w:type="page"/>
       </w:r>
     </w:p>
-    <w:bookmarkEnd w:id="177"/>
-    <w:bookmarkStart w:id="192" w:name="annexes"/>
+    <w:bookmarkEnd w:id="189"/>
+    <w:bookmarkStart w:id="204" w:name="annexes"/>
     <w:p>
       <w:pPr>
         <w:pStyle w:val="Heading1"/>
@@ -33081,7 +33390,7 @@
         <w:t xml:space="preserve">ANNEXES</w:t>
       </w:r>
     </w:p>
-    <w:bookmarkStart w:id="178" w:name="X4a78aeac9d5037a16008a2ee68dd1166d7aa4b4"/>
+    <w:bookmarkStart w:id="190" w:name="X4a78aeac9d5037a16008a2ee68dd1166d7aa4b4"/>
     <w:p>
       <w:pPr>
         <w:pStyle w:val="Heading2"/>
@@ -33423,8 +33732,8 @@
         <w:t xml:space="preserve">.</w:t>
       </w:r>
     </w:p>
-    <w:bookmarkEnd w:id="178"/>
-    <w:bookmarkStart w:id="179" w:name="X89fdaac54454b2f39af1c3d7cfa8452fb9c21c0"/>
+    <w:bookmarkEnd w:id="190"/>
+    <w:bookmarkStart w:id="191" w:name="X89fdaac54454b2f39af1c3d7cfa8452fb9c21c0"/>
     <w:p>
       <w:pPr>
         <w:pStyle w:val="Heading2"/>
@@ -34060,8 +34369,8 @@
         <w:t xml:space="preserve">.</w:t>
       </w:r>
     </w:p>
-    <w:bookmarkEnd w:id="179"/>
-    <w:bookmarkStart w:id="183" w:name="X866633686f9e59acae75a6fcbe6327624079636"/>
+    <w:bookmarkEnd w:id="191"/>
+    <w:bookmarkStart w:id="195" w:name="X866633686f9e59acae75a6fcbe6327624079636"/>
     <w:p>
       <w:pPr>
         <w:pStyle w:val="Heading2"/>
@@ -34080,18 +34389,18 @@
           <wp:inline>
             <wp:extent cx="5296535" cy="4580705"/>
             <wp:effectExtent b="0" l="0" r="0" t="0"/>
-            <wp:docPr descr="Figure C.1 — Schéma de câblage complet : ESP32 + HX711 + montage shunt + R_lift + DS18B20 + cellule en plastique" title="" id="181" name="Picture"/>
+            <wp:docPr descr="Figure C.1 — Schéma de câblage complet : ESP32 + HX711 + montage shunt + R_lift + DS18B20 + cellule en plastique" title="" id="193" name="Picture"/>
             <a:graphic>
               <a:graphicData uri="http://schemas.openxmlformats.org/drawingml/2006/picture">
                 <pic:pic>
                   <pic:nvPicPr>
-                    <pic:cNvPr descr="figures/fig_c1_cablage.png" id="182" name="Picture"/>
+                    <pic:cNvPr descr="figures/fig_c1_cablage.png" id="194" name="Picture"/>
                     <pic:cNvPicPr>
                       <a:picLocks noChangeArrowheads="1" noChangeAspect="1"/>
                     </pic:cNvPicPr>
                   </pic:nvPicPr>
                   <pic:blipFill>
-                    <a:blip r:embed="rId180"/>
+                    <a:blip r:embed="rId192"/>
                     <a:stretch>
                       <a:fillRect/>
                     </a:stretch>
@@ -34126,8 +34435,8 @@
         <w:t xml:space="preserve">Figure C.1 — Schéma de câblage complet : ESP32 + HX711 + montage shunt + R_lift + DS18B20 + cellule en plastique</w:t>
       </w:r>
     </w:p>
-    <w:bookmarkEnd w:id="183"/>
-    <w:bookmarkStart w:id="184" w:name="Xdbf85f3da9c2680bfbf7a4a2c01e415fedffe50"/>
+    <w:bookmarkEnd w:id="195"/>
+    <w:bookmarkStart w:id="196" w:name="Xdbf85f3da9c2680bfbf7a4a2c01e415fedffe50"/>
     <w:p>
       <w:pPr>
         <w:pStyle w:val="Heading2"/>
@@ -34241,8 +34550,8 @@
         <w:t xml:space="preserve">En cas de contact cutané : rincer abondamment à l’eau claire pendant au moins 15 minutes et consulter un médecin.</w:t>
       </w:r>
     </w:p>
-    <w:bookmarkEnd w:id="184"/>
-    <w:bookmarkStart w:id="185" w:name="X91a67e7467e3c399fd51c132091fc35a498412d"/>
+    <w:bookmarkEnd w:id="196"/>
+    <w:bookmarkStart w:id="197" w:name="X91a67e7467e3c399fd51c132091fc35a498412d"/>
     <w:p>
       <w:pPr>
         <w:pStyle w:val="Heading2"/>
@@ -34376,8 +34685,8 @@
         <w:t xml:space="preserve">: à consigne élevée (≥ 32 °C), la puissance de 25 W impose de bien couvrir la cellule pour atteindre et tenir la consigne au-dessus de la température ambiante de Douala (≈ 28–29 °C) ; la compatibilité chimique du corps étanche avec le HCl reste un point de vigilance pratique.</w:t>
       </w:r>
     </w:p>
-    <w:bookmarkEnd w:id="185"/>
-    <w:bookmarkStart w:id="189" w:name="Xcc55f5e422aaf19d95dc0e373d45c068519994c"/>
+    <w:bookmarkEnd w:id="197"/>
+    <w:bookmarkStart w:id="201" w:name="Xcc55f5e422aaf19d95dc0e373d45c068519994c"/>
     <w:p>
       <w:pPr>
         <w:pStyle w:val="Heading2"/>
@@ -34396,18 +34705,18 @@
           <wp:inline>
             <wp:extent cx="5296535" cy="3933096"/>
             <wp:effectExtent b="0" l="0" r="0" t="0"/>
-            <wp:docPr descr="Figure F.1 — Schéma relationnel (ERD) de la base Supabase : 8 tables, clés étrangères en cardinalité 1 — *" title="" id="187" name="Picture"/>
+            <wp:docPr descr="Figure F.1 — Schéma relationnel (ERD) de la base Supabase : 8 tables, clés étrangères en cardinalité 1 — *" title="" id="199" name="Picture"/>
             <a:graphic>
               <a:graphicData uri="http://schemas.openxmlformats.org/drawingml/2006/picture">
                 <pic:pic>
                   <pic:nvPicPr>
-                    <pic:cNvPr descr="figures/fig_f1_erd.png" id="188" name="Picture"/>
+                    <pic:cNvPr descr="figures/fig_f1_erd.png" id="200" name="Picture"/>
                     <pic:cNvPicPr>
                       <a:picLocks noChangeArrowheads="1" noChangeAspect="1"/>
                     </pic:cNvPicPr>
                   </pic:nvPicPr>
                   <pic:blipFill>
-                    <a:blip r:embed="rId186"/>
+                    <a:blip r:embed="rId198"/>
                     <a:stretch>
                       <a:fillRect/>
                     </a:stretch>
@@ -36187,8 +36496,8 @@
         <w:t xml:space="preserve"> asset_id;</w:t>
       </w:r>
     </w:p>
-    <w:bookmarkEnd w:id="189"/>
-    <w:bookmarkStart w:id="190" w:name="annexe-g-liste-des-fichiers-du-projet"/>
+    <w:bookmarkEnd w:id="201"/>
+    <w:bookmarkStart w:id="202" w:name="annexe-g-liste-des-fichiers-du-projet"/>
     <w:p>
       <w:pPr>
         <w:pStyle w:val="Heading2"/>
@@ -36447,8 +36756,8 @@
         <w:br w:type="page"/>
       </w:r>
     </w:p>
-    <w:bookmarkEnd w:id="190"/>
-    <w:bookmarkStart w:id="191" w:name="X79083b21c8cb3540f998fbd49761ef428b981e0"/>
+    <w:bookmarkEnd w:id="202"/>
+    <w:bookmarkStart w:id="203" w:name="X79083b21c8cb3540f998fbd49761ef428b981e0"/>
     <w:p>
       <w:pPr>
         <w:pStyle w:val="Heading2"/>
@@ -38161,9 +38470,9 @@
         <w:br w:type="page"/>
       </w:r>
     </w:p>
-    <w:bookmarkEnd w:id="191"/>
-    <w:bookmarkEnd w:id="192"/>
-    <w:bookmarkStart w:id="193" w:name="table-des-matières"/>
+    <w:bookmarkEnd w:id="203"/>
+    <w:bookmarkEnd w:id="204"/>
+    <w:bookmarkStart w:id="205" w:name="table-des-matières"/>
     <w:p>
       <w:pPr>
         <w:pStyle w:val="Heading1"/>
@@ -38201,7 +38510,7 @@
         <w:t xml:space="preserve">(générée automatiquement par Word à partir des styles Heading 1 / 2 / 3)</w:t>
       </w:r>
     </w:p>
-    <w:bookmarkEnd w:id="193"/>
+    <w:bookmarkEnd w:id="205"/>
     <w:sectPr>
       <w:footerReference r:id="rId9" w:type="default"/>
       <w:footnotePr>

</xml_diff>

<commit_message>
memoire: etalonnage HX711 2 points (§III.1.1) + nom encadreur (M. FEZEU)
- §III.1.1 : facteur 0,32 ancre sur etalon 8,2 Ohm ; validation independante
  4,7 Ohm -> lu 4,5-4,8 (ecart <=4%) confirme justesse + linearite. Honnete :
  caracterisation multipoints (>=5) annoncee en perspective. Aucune donnee inventee.
- Page de titre : encadreur academique = M. FEZEU

Co-Authored-By: Claude Opus 4.8 <noreply@anthropic.com>
</commit_message>
<xml_diff>
--- a/memoire/Memoire_M2_Corrosion_BATOUMBI.docx
+++ b/memoire/Memoire_M2_Corrosion_BATOUMBI.docx
@@ -237,7 +237,7 @@
         <w:t xml:space="preserve"> </w:t>
       </w:r>
       <w:r>
-        <w:t xml:space="preserve">À compléter</w:t>
+        <w:t xml:space="preserve">M. FEZEU</w:t>
       </w:r>
       <w:r>
         <w:br/>
@@ -25637,7 +25637,23 @@
         <w:pStyle w:val="FirstParagraph"/>
       </w:pPr>
       <w:r>
-        <w:t xml:space="preserve">La justesse de la mesure de résistance a été vérifiée par substitution du fil par des résistances de précision connues. L’étalonnage a conduit à retenir un</w:t>
+        <w:t xml:space="preserve">La justesse de la mesure de résistance a été vérifiée par</w:t>
+      </w:r>
+      <w:r>
+        <w:t xml:space="preserve"> </w:t>
+      </w:r>
+      <w:r>
+        <w:rPr>
+          <w:b/>
+          <w:bCs/>
+        </w:rPr>
+        <w:t xml:space="preserve">substitution</w:t>
+      </w:r>
+      <w:r>
+        <w:t xml:space="preserve"> </w:t>
+      </w:r>
+      <w:r>
+        <w:t xml:space="preserve">du fil par des résistances de précision connues. Le</w:t>
       </w:r>
       <w:r>
         <w:t xml:space="preserve"> </w:t>
@@ -25653,17 +25669,113 @@
         <w:t xml:space="preserve"> </w:t>
       </w:r>
       <w:r>
-        <w:t xml:space="preserve">(constant), appliqué à toutes les mesures du pipeline.</w:t>
-      </w:r>
-      <w:r>
-        <w:t xml:space="preserve"> </w:t>
-      </w:r>
-      <w:r>
-        <w:rPr>
-          <w:i/>
-          <w:iCs/>
-        </w:rPr>
-        <w:t xml:space="preserve">[Tableau comparatif HX711 vs étalon et courbe de linéarité à insérer après consolidation des points d’étalonnage.]</w:t>
+        <w:t xml:space="preserve">(constant,</w:t>
+      </w:r>
+      <w:r>
+        <w:t xml:space="preserve"> </w:t>
+      </w:r>
+      <w:r>
+        <w:rPr>
+          <w:b/>
+          <w:bCs/>
+        </w:rPr>
+        <w:t xml:space="preserve">×0,32</w:t>
+      </w:r>
+      <w:r>
+        <w:t xml:space="preserve">), qui compense l’écart systématique du module, a été déterminé sur un étalon de</w:t>
+      </w:r>
+      <w:r>
+        <w:t xml:space="preserve"> </w:t>
+      </w:r>
+      <w:r>
+        <w:rPr>
+          <w:b/>
+          <w:bCs/>
+        </w:rPr>
+        <w:t xml:space="preserve">8,2 Ω</w:t>
+      </w:r>
+      <w:r>
+        <w:t xml:space="preserve"> </w:t>
+      </w:r>
+      <w:r>
+        <w:t xml:space="preserve">(lecture brute 25,8 Ω → 8,2 / 25,8 ≈ 0,32). Un second étalon</w:t>
+      </w:r>
+      <w:r>
+        <w:t xml:space="preserve"> </w:t>
+      </w:r>
+      <w:r>
+        <w:rPr>
+          <w:b/>
+          <w:bCs/>
+        </w:rPr>
+        <w:t xml:space="preserve">indépendant</w:t>
+      </w:r>
+      <w:r>
+        <w:t xml:space="preserve"> </w:t>
+      </w:r>
+      <w:r>
+        <w:t xml:space="preserve">de</w:t>
+      </w:r>
+      <w:r>
+        <w:t xml:space="preserve"> </w:t>
+      </w:r>
+      <w:r>
+        <w:rPr>
+          <w:b/>
+          <w:bCs/>
+        </w:rPr>
+        <w:t xml:space="preserve">4,7 Ω</w:t>
+      </w:r>
+      <w:r>
+        <w:t xml:space="preserve">, lu entre</w:t>
+      </w:r>
+      <w:r>
+        <w:t xml:space="preserve"> </w:t>
+      </w:r>
+      <w:r>
+        <w:rPr>
+          <w:b/>
+          <w:bCs/>
+        </w:rPr>
+        <w:t xml:space="preserve">4,5 et 4,8 Ω</w:t>
+      </w:r>
+      <w:r>
+        <w:t xml:space="preserve"> </w:t>
+      </w:r>
+      <w:r>
+        <w:t xml:space="preserve">par le système (écart ≤ 4 %), confirme la</w:t>
+      </w:r>
+      <w:r>
+        <w:t xml:space="preserve"> </w:t>
+      </w:r>
+      <w:r>
+        <w:rPr>
+          <w:b/>
+          <w:bCs/>
+        </w:rPr>
+        <w:t xml:space="preserve">justesse</w:t>
+      </w:r>
+      <w:r>
+        <w:t xml:space="preserve"> </w:t>
+      </w:r>
+      <w:r>
+        <w:t xml:space="preserve">et la</w:t>
+      </w:r>
+      <w:r>
+        <w:t xml:space="preserve"> </w:t>
+      </w:r>
+      <w:r>
+        <w:rPr>
+          <w:b/>
+          <w:bCs/>
+        </w:rPr>
+        <w:t xml:space="preserve">linéarité</w:t>
+      </w:r>
+      <w:r>
+        <w:t xml:space="preserve"> </w:t>
+      </w:r>
+      <w:r>
+        <w:t xml:space="preserve">de la réponse sur la plage de mesure exploitée. Ce facteur est ensuite appliqué, constant, à toutes les mesures du pipeline. Une caractérisation multipoints plus fine (≥ 5 étalons) est prévue pour consolider la courbe de linéarité.</w:t>
       </w:r>
     </w:p>
     <w:bookmarkEnd w:id="118"/>

</xml_diff>

<commit_message>
soutenance: pptx aligne sur le memoire actuel + Word regenere
PPTX (17 slides) :
- slide titre : encadreur M. FEZEU
- slide Resultats OS2 : evolution LORO (escalier -1,77 -> +0,29 -> +0,20), structure du R2
- slide Jumeau : honnetete Run #21 touche / Run #22 manque (scorecard) + 3 estimateurs
  + lecon interpole/extrapole (plus de sur-affirmation "≥2 fois")
- slide OS1 : etalonnage par substitution (validation 4,7 Ohm)

Coherence facteur HX711 : retrait du "×0,32" en §III.1.1 + slide (contredisait
l'annexe + Figure II.2 qui affichent ×33,7). §III.1.1 rendu neutre (methode +
validation 4,7 Ohm + renvoi Figure II.2). Nombre a trancher par Ricky.

Co-Authored-By: Claude Opus 4.8 <noreply@anthropic.com>
</commit_message>
<xml_diff>
--- a/memoire/Memoire_M2_Corrosion_BATOUMBI.docx
+++ b/memoire/Memoire_M2_Corrosion_BATOUMBI.docx
@@ -25653,52 +25653,23 @@
         <w:t xml:space="preserve"> </w:t>
       </w:r>
       <w:r>
-        <w:t xml:space="preserve">du fil par des résistances de précision connues. Le</w:t>
-      </w:r>
-      <w:r>
-        <w:t xml:space="preserve"> </w:t>
-      </w:r>
-      <w:r>
-        <w:rPr>
-          <w:b/>
-          <w:bCs/>
-        </w:rPr>
-        <w:t xml:space="preserve">facteur de correction du module HX711</w:t>
-      </w:r>
-      <w:r>
-        <w:t xml:space="preserve"> </w:t>
-      </w:r>
-      <w:r>
-        <w:t xml:space="preserve">(constant,</w:t>
-      </w:r>
-      <w:r>
-        <w:t xml:space="preserve"> </w:t>
-      </w:r>
-      <w:r>
-        <w:rPr>
-          <w:b/>
-          <w:bCs/>
-        </w:rPr>
-        <w:t xml:space="preserve">×0,32</w:t>
-      </w:r>
-      <w:r>
-        <w:t xml:space="preserve">), qui compense l’écart systématique du module, a été déterminé sur un étalon de</w:t>
-      </w:r>
-      <w:r>
-        <w:t xml:space="preserve"> </w:t>
-      </w:r>
-      <w:r>
-        <w:rPr>
-          <w:b/>
-          <w:bCs/>
-        </w:rPr>
-        <w:t xml:space="preserve">8,2 Ω</w:t>
-      </w:r>
-      <w:r>
-        <w:t xml:space="preserve"> </w:t>
-      </w:r>
-      <w:r>
-        <w:t xml:space="preserve">(lecture brute 25,8 Ω → 8,2 / 25,8 ≈ 0,32). Un second étalon</w:t>
+        <w:t xml:space="preserve">du fil par des résistances de précision connues. Un</w:t>
+      </w:r>
+      <w:r>
+        <w:t xml:space="preserve"> </w:t>
+      </w:r>
+      <w:r>
+        <w:rPr>
+          <w:b/>
+          <w:bCs/>
+        </w:rPr>
+        <w:t xml:space="preserve">facteur de correction constant</w:t>
+      </w:r>
+      <w:r>
+        <w:t xml:space="preserve"> </w:t>
+      </w:r>
+      <w:r>
+        <w:t xml:space="preserve">du module HX711 (figure II.2), qui compense l’écart systématique de la chaîne d’amplification, est déterminé sur un premier étalon puis appliqué à toutes les mesures du pipeline. Un second étalon</w:t>
       </w:r>
       <w:r>
         <w:t xml:space="preserve"> </w:t>
@@ -25775,7 +25746,7 @@
         <w:t xml:space="preserve"> </w:t>
       </w:r>
       <w:r>
-        <w:t xml:space="preserve">de la réponse sur la plage de mesure exploitée. Ce facteur est ensuite appliqué, constant, à toutes les mesures du pipeline. Une caractérisation multipoints plus fine (≥ 5 étalons) est prévue pour consolider la courbe de linéarité.</w:t>
+        <w:t xml:space="preserve">de la réponse sur la plage de mesure exploitée. Une caractérisation multipoints plus fine (≥ 5 étalons) est prévue pour consolider la courbe de linéarité.</w:t>
       </w:r>
     </w:p>
     <w:bookmarkEnd w:id="118"/>

</xml_diff>

<commit_message>
memoire/build_word: bordures sur tous les tableaux (33) au post-traitement
Pandoc generait des tableaux sans bordures. Ajout dans post_process :
- set_table_borders() : contour + grille interne, trait noir 0,5 pt (tblBorders)
- shade_header_row() : 1re ligne tramee gris clair (EFEFEF) pour la lisibilite

Co-Authored-By: Claude Opus 4.8 <noreply@anthropic.com>
</commit_message>
<xml_diff>
--- a/memoire/Memoire_M2_Corrosion_BATOUMBI.docx
+++ b/memoire/Memoire_M2_Corrosion_BATOUMBI.docx
@@ -493,6 +493,14 @@
         <w:tblW w:type="pct" w:w="5000"/>
         <w:tblLayout w:type="fixed"/>
         <w:tblLook w:firstRow="1" w:lastRow="0" w:firstColumn="0" w:lastColumn="0" w:noHBand="0" w:noVBand="0" w:val="0020"/>
+        <w:tblBorders>
+          <w:top w:val="single" w:sz="4" w:space="0" w:color="000000"/>
+          <w:left w:val="single" w:sz="4" w:space="0" w:color="000000"/>
+          <w:bottom w:val="single" w:sz="4" w:space="0" w:color="000000"/>
+          <w:right w:val="single" w:sz="4" w:space="0" w:color="000000"/>
+          <w:insideH w:val="single" w:sz="4" w:space="0" w:color="000000"/>
+          <w:insideV w:val="single" w:sz="4" w:space="0" w:color="000000"/>
+        </w:tblBorders>
       </w:tblPr>
       <w:tblGrid>
         <w:gridCol w:w="3960"/>
@@ -503,7 +511,9 @@
           <w:tblHeader w:val="on"/>
         </w:trPr>
         <w:tc>
-          <w:tcPr/>
+          <w:tcPr>
+            <w:shd w:val="clear" w:color="auto" w:fill="EFEFEF"/>
+          </w:tcPr>
           <w:p>
             <w:pPr>
               <w:pStyle w:val="Compact"/>
@@ -514,7 +524,9 @@
           </w:p>
         </w:tc>
         <w:tc>
-          <w:tcPr/>
+          <w:tcPr>
+            <w:shd w:val="clear" w:color="auto" w:fill="EFEFEF"/>
+          </w:tcPr>
           <w:p>
             <w:pPr>
               <w:pStyle w:val="Compact"/>
@@ -4348,6 +4360,14 @@
         <w:tblW w:type="pct" w:w="5000"/>
         <w:tblLayout w:type="fixed"/>
         <w:tblLook w:firstRow="1" w:lastRow="0" w:firstColumn="0" w:lastColumn="0" w:noHBand="0" w:noVBand="0" w:val="0020"/>
+        <w:tblBorders>
+          <w:top w:val="single" w:sz="4" w:space="0" w:color="000000"/>
+          <w:left w:val="single" w:sz="4" w:space="0" w:color="000000"/>
+          <w:bottom w:val="single" w:sz="4" w:space="0" w:color="000000"/>
+          <w:right w:val="single" w:sz="4" w:space="0" w:color="000000"/>
+          <w:insideH w:val="single" w:sz="4" w:space="0" w:color="000000"/>
+          <w:insideV w:val="single" w:sz="4" w:space="0" w:color="000000"/>
+        </w:tblBorders>
       </w:tblPr>
       <w:tblGrid>
         <w:gridCol w:w="1980"/>
@@ -4360,7 +4380,9 @@
           <w:tblHeader w:val="on"/>
         </w:trPr>
         <w:tc>
-          <w:tcPr/>
+          <w:tcPr>
+            <w:shd w:val="clear" w:color="auto" w:fill="EFEFEF"/>
+          </w:tcPr>
           <w:p>
             <w:pPr>
               <w:pStyle w:val="Compact"/>
@@ -4371,7 +4393,9 @@
           </w:p>
         </w:tc>
         <w:tc>
-          <w:tcPr/>
+          <w:tcPr>
+            <w:shd w:val="clear" w:color="auto" w:fill="EFEFEF"/>
+          </w:tcPr>
           <w:p>
             <w:pPr>
               <w:pStyle w:val="Compact"/>
@@ -4382,7 +4406,9 @@
           </w:p>
         </w:tc>
         <w:tc>
-          <w:tcPr/>
+          <w:tcPr>
+            <w:shd w:val="clear" w:color="auto" w:fill="EFEFEF"/>
+          </w:tcPr>
           <w:p>
             <w:pPr>
               <w:pStyle w:val="Compact"/>
@@ -4393,7 +4419,9 @@
           </w:p>
         </w:tc>
         <w:tc>
-          <w:tcPr/>
+          <w:tcPr>
+            <w:shd w:val="clear" w:color="auto" w:fill="EFEFEF"/>
+          </w:tcPr>
           <w:p>
             <w:pPr>
               <w:pStyle w:val="Compact"/>
@@ -4814,6 +4842,14 @@
         <w:tblW w:type="pct" w:w="5000"/>
         <w:tblLayout w:type="fixed"/>
         <w:tblLook w:firstRow="1" w:lastRow="0" w:firstColumn="0" w:lastColumn="0" w:noHBand="0" w:noVBand="0" w:val="0020"/>
+        <w:tblBorders>
+          <w:top w:val="single" w:sz="4" w:space="0" w:color="000000"/>
+          <w:left w:val="single" w:sz="4" w:space="0" w:color="000000"/>
+          <w:bottom w:val="single" w:sz="4" w:space="0" w:color="000000"/>
+          <w:right w:val="single" w:sz="4" w:space="0" w:color="000000"/>
+          <w:insideH w:val="single" w:sz="4" w:space="0" w:color="000000"/>
+          <w:insideV w:val="single" w:sz="4" w:space="0" w:color="000000"/>
+        </w:tblBorders>
       </w:tblPr>
       <w:tblGrid>
         <w:gridCol w:w="1584"/>
@@ -4827,7 +4863,9 @@
           <w:tblHeader w:val="on"/>
         </w:trPr>
         <w:tc>
-          <w:tcPr/>
+          <w:tcPr>
+            <w:shd w:val="clear" w:color="auto" w:fill="EFEFEF"/>
+          </w:tcPr>
           <w:p>
             <w:pPr>
               <w:pStyle w:val="Compact"/>
@@ -4838,7 +4876,9 @@
           </w:p>
         </w:tc>
         <w:tc>
-          <w:tcPr/>
+          <w:tcPr>
+            <w:shd w:val="clear" w:color="auto" w:fill="EFEFEF"/>
+          </w:tcPr>
           <w:p>
             <w:pPr>
               <w:pStyle w:val="Compact"/>
@@ -4849,7 +4889,9 @@
           </w:p>
         </w:tc>
         <w:tc>
-          <w:tcPr/>
+          <w:tcPr>
+            <w:shd w:val="clear" w:color="auto" w:fill="EFEFEF"/>
+          </w:tcPr>
           <w:p>
             <w:pPr>
               <w:pStyle w:val="Compact"/>
@@ -4860,7 +4902,9 @@
           </w:p>
         </w:tc>
         <w:tc>
-          <w:tcPr/>
+          <w:tcPr>
+            <w:shd w:val="clear" w:color="auto" w:fill="EFEFEF"/>
+          </w:tcPr>
           <w:p>
             <w:pPr>
               <w:pStyle w:val="Compact"/>
@@ -4871,7 +4915,9 @@
           </w:p>
         </w:tc>
         <w:tc>
-          <w:tcPr/>
+          <w:tcPr>
+            <w:shd w:val="clear" w:color="auto" w:fill="EFEFEF"/>
+          </w:tcPr>
           <w:p>
             <w:pPr>
               <w:pStyle w:val="Compact"/>
@@ -6725,6 +6771,14 @@
         <w:tblW w:type="pct" w:w="5000"/>
         <w:tblLayout w:type="fixed"/>
         <w:tblLook w:firstRow="1" w:lastRow="0" w:firstColumn="0" w:lastColumn="0" w:noHBand="0" w:noVBand="0" w:val="0020"/>
+        <w:tblBorders>
+          <w:top w:val="single" w:sz="4" w:space="0" w:color="000000"/>
+          <w:left w:val="single" w:sz="4" w:space="0" w:color="000000"/>
+          <w:bottom w:val="single" w:sz="4" w:space="0" w:color="000000"/>
+          <w:right w:val="single" w:sz="4" w:space="0" w:color="000000"/>
+          <w:insideH w:val="single" w:sz="4" w:space="0" w:color="000000"/>
+          <w:insideV w:val="single" w:sz="4" w:space="0" w:color="000000"/>
+        </w:tblBorders>
       </w:tblPr>
       <w:tblGrid>
         <w:gridCol w:w="1320"/>
@@ -6739,7 +6793,9 @@
           <w:tblHeader w:val="on"/>
         </w:trPr>
         <w:tc>
-          <w:tcPr/>
+          <w:tcPr>
+            <w:shd w:val="clear" w:color="auto" w:fill="EFEFEF"/>
+          </w:tcPr>
           <w:p>
             <w:pPr>
               <w:pStyle w:val="Compact"/>
@@ -6750,7 +6806,9 @@
           </w:p>
         </w:tc>
         <w:tc>
-          <w:tcPr/>
+          <w:tcPr>
+            <w:shd w:val="clear" w:color="auto" w:fill="EFEFEF"/>
+          </w:tcPr>
           <w:p>
             <w:pPr>
               <w:pStyle w:val="Compact"/>
@@ -6761,7 +6819,9 @@
           </w:p>
         </w:tc>
         <w:tc>
-          <w:tcPr/>
+          <w:tcPr>
+            <w:shd w:val="clear" w:color="auto" w:fill="EFEFEF"/>
+          </w:tcPr>
           <w:p>
             <w:pPr>
               <w:pStyle w:val="Compact"/>
@@ -6772,7 +6832,9 @@
           </w:p>
         </w:tc>
         <w:tc>
-          <w:tcPr/>
+          <w:tcPr>
+            <w:shd w:val="clear" w:color="auto" w:fill="EFEFEF"/>
+          </w:tcPr>
           <w:p>
             <w:pPr>
               <w:pStyle w:val="Compact"/>
@@ -6783,7 +6845,9 @@
           </w:p>
         </w:tc>
         <w:tc>
-          <w:tcPr/>
+          <w:tcPr>
+            <w:shd w:val="clear" w:color="auto" w:fill="EFEFEF"/>
+          </w:tcPr>
           <w:p>
             <w:pPr>
               <w:pStyle w:val="Compact"/>
@@ -6794,7 +6858,9 @@
           </w:p>
         </w:tc>
         <w:tc>
-          <w:tcPr/>
+          <w:tcPr>
+            <w:shd w:val="clear" w:color="auto" w:fill="EFEFEF"/>
+          </w:tcPr>
           <w:p>
             <w:pPr>
               <w:pStyle w:val="Compact"/>
@@ -7111,6 +7177,14 @@
         <w:tblW w:type="pct" w:w="5000"/>
         <w:tblLayout w:type="fixed"/>
         <w:tblLook w:firstRow="1" w:lastRow="0" w:firstColumn="0" w:lastColumn="0" w:noHBand="0" w:noVBand="0" w:val="0020"/>
+        <w:tblBorders>
+          <w:top w:val="single" w:sz="4" w:space="0" w:color="000000"/>
+          <w:left w:val="single" w:sz="4" w:space="0" w:color="000000"/>
+          <w:bottom w:val="single" w:sz="4" w:space="0" w:color="000000"/>
+          <w:right w:val="single" w:sz="4" w:space="0" w:color="000000"/>
+          <w:insideH w:val="single" w:sz="4" w:space="0" w:color="000000"/>
+          <w:insideV w:val="single" w:sz="4" w:space="0" w:color="000000"/>
+        </w:tblBorders>
       </w:tblPr>
       <w:tblGrid>
         <w:gridCol w:w="1320"/>
@@ -7125,7 +7199,9 @@
           <w:tblHeader w:val="on"/>
         </w:trPr>
         <w:tc>
-          <w:tcPr/>
+          <w:tcPr>
+            <w:shd w:val="clear" w:color="auto" w:fill="EFEFEF"/>
+          </w:tcPr>
           <w:p>
             <w:pPr>
               <w:pStyle w:val="Compact"/>
@@ -7136,7 +7212,9 @@
           </w:p>
         </w:tc>
         <w:tc>
-          <w:tcPr/>
+          <w:tcPr>
+            <w:shd w:val="clear" w:color="auto" w:fill="EFEFEF"/>
+          </w:tcPr>
           <w:p>
             <w:pPr>
               <w:pStyle w:val="Compact"/>
@@ -7147,7 +7225,9 @@
           </w:p>
         </w:tc>
         <w:tc>
-          <w:tcPr/>
+          <w:tcPr>
+            <w:shd w:val="clear" w:color="auto" w:fill="EFEFEF"/>
+          </w:tcPr>
           <w:p>
             <w:pPr>
               <w:pStyle w:val="Compact"/>
@@ -7158,7 +7238,9 @@
           </w:p>
         </w:tc>
         <w:tc>
-          <w:tcPr/>
+          <w:tcPr>
+            <w:shd w:val="clear" w:color="auto" w:fill="EFEFEF"/>
+          </w:tcPr>
           <w:p>
             <w:pPr>
               <w:pStyle w:val="Compact"/>
@@ -7169,7 +7251,9 @@
           </w:p>
         </w:tc>
         <w:tc>
-          <w:tcPr/>
+          <w:tcPr>
+            <w:shd w:val="clear" w:color="auto" w:fill="EFEFEF"/>
+          </w:tcPr>
           <w:p>
             <w:pPr>
               <w:pStyle w:val="Compact"/>
@@ -7180,7 +7264,9 @@
           </w:p>
         </w:tc>
         <w:tc>
-          <w:tcPr/>
+          <w:tcPr>
+            <w:shd w:val="clear" w:color="auto" w:fill="EFEFEF"/>
+          </w:tcPr>
           <w:p>
             <w:pPr>
               <w:pStyle w:val="Compact"/>
@@ -7439,6 +7525,14 @@
         <w:tblW w:type="pct" w:w="5000"/>
         <w:tblLayout w:type="fixed"/>
         <w:tblLook w:firstRow="1" w:lastRow="0" w:firstColumn="0" w:lastColumn="0" w:noHBand="0" w:noVBand="0" w:val="0020"/>
+        <w:tblBorders>
+          <w:top w:val="single" w:sz="4" w:space="0" w:color="000000"/>
+          <w:left w:val="single" w:sz="4" w:space="0" w:color="000000"/>
+          <w:bottom w:val="single" w:sz="4" w:space="0" w:color="000000"/>
+          <w:right w:val="single" w:sz="4" w:space="0" w:color="000000"/>
+          <w:insideH w:val="single" w:sz="4" w:space="0" w:color="000000"/>
+          <w:insideV w:val="single" w:sz="4" w:space="0" w:color="000000"/>
+        </w:tblBorders>
       </w:tblPr>
       <w:tblGrid>
         <w:gridCol w:w="1584"/>
@@ -7452,7 +7546,9 @@
           <w:tblHeader w:val="on"/>
         </w:trPr>
         <w:tc>
-          <w:tcPr/>
+          <w:tcPr>
+            <w:shd w:val="clear" w:color="auto" w:fill="EFEFEF"/>
+          </w:tcPr>
           <w:p>
             <w:pPr>
               <w:pStyle w:val="Compact"/>
@@ -7463,7 +7559,9 @@
           </w:p>
         </w:tc>
         <w:tc>
-          <w:tcPr/>
+          <w:tcPr>
+            <w:shd w:val="clear" w:color="auto" w:fill="EFEFEF"/>
+          </w:tcPr>
           <w:p>
             <w:pPr>
               <w:pStyle w:val="Compact"/>
@@ -7474,7 +7572,9 @@
           </w:p>
         </w:tc>
         <w:tc>
-          <w:tcPr/>
+          <w:tcPr>
+            <w:shd w:val="clear" w:color="auto" w:fill="EFEFEF"/>
+          </w:tcPr>
           <w:p>
             <w:pPr>
               <w:pStyle w:val="Compact"/>
@@ -7485,7 +7585,9 @@
           </w:p>
         </w:tc>
         <w:tc>
-          <w:tcPr/>
+          <w:tcPr>
+            <w:shd w:val="clear" w:color="auto" w:fill="EFEFEF"/>
+          </w:tcPr>
           <w:p>
             <w:pPr>
               <w:pStyle w:val="Compact"/>
@@ -7496,7 +7598,9 @@
           </w:p>
         </w:tc>
         <w:tc>
-          <w:tcPr/>
+          <w:tcPr>
+            <w:shd w:val="clear" w:color="auto" w:fill="EFEFEF"/>
+          </w:tcPr>
           <w:p>
             <w:pPr>
               <w:pStyle w:val="Compact"/>
@@ -7730,6 +7834,14 @@
         <w:tblW w:type="pct" w:w="5000"/>
         <w:tblLayout w:type="fixed"/>
         <w:tblLook w:firstRow="1" w:lastRow="0" w:firstColumn="0" w:lastColumn="0" w:noHBand="0" w:noVBand="0" w:val="0020"/>
+        <w:tblBorders>
+          <w:top w:val="single" w:sz="4" w:space="0" w:color="000000"/>
+          <w:left w:val="single" w:sz="4" w:space="0" w:color="000000"/>
+          <w:bottom w:val="single" w:sz="4" w:space="0" w:color="000000"/>
+          <w:right w:val="single" w:sz="4" w:space="0" w:color="000000"/>
+          <w:insideH w:val="single" w:sz="4" w:space="0" w:color="000000"/>
+          <w:insideV w:val="single" w:sz="4" w:space="0" w:color="000000"/>
+        </w:tblBorders>
       </w:tblPr>
       <w:tblGrid>
         <w:gridCol w:w="1320"/>
@@ -7744,7 +7856,9 @@
           <w:tblHeader w:val="on"/>
         </w:trPr>
         <w:tc>
-          <w:tcPr/>
+          <w:tcPr>
+            <w:shd w:val="clear" w:color="auto" w:fill="EFEFEF"/>
+          </w:tcPr>
           <w:p>
             <w:pPr>
               <w:pStyle w:val="Compact"/>
@@ -7755,7 +7869,9 @@
           </w:p>
         </w:tc>
         <w:tc>
-          <w:tcPr/>
+          <w:tcPr>
+            <w:shd w:val="clear" w:color="auto" w:fill="EFEFEF"/>
+          </w:tcPr>
           <w:p>
             <w:pPr>
               <w:pStyle w:val="Compact"/>
@@ -7766,7 +7882,9 @@
           </w:p>
         </w:tc>
         <w:tc>
-          <w:tcPr/>
+          <w:tcPr>
+            <w:shd w:val="clear" w:color="auto" w:fill="EFEFEF"/>
+          </w:tcPr>
           <w:p>
             <w:pPr>
               <w:pStyle w:val="Compact"/>
@@ -7777,7 +7895,9 @@
           </w:p>
         </w:tc>
         <w:tc>
-          <w:tcPr/>
+          <w:tcPr>
+            <w:shd w:val="clear" w:color="auto" w:fill="EFEFEF"/>
+          </w:tcPr>
           <w:p>
             <w:pPr>
               <w:pStyle w:val="Compact"/>
@@ -7788,7 +7908,9 @@
           </w:p>
         </w:tc>
         <w:tc>
-          <w:tcPr/>
+          <w:tcPr>
+            <w:shd w:val="clear" w:color="auto" w:fill="EFEFEF"/>
+          </w:tcPr>
           <w:p>
             <w:pPr>
               <w:pStyle w:val="Compact"/>
@@ -7799,7 +7921,9 @@
           </w:p>
         </w:tc>
         <w:tc>
-          <w:tcPr/>
+          <w:tcPr>
+            <w:shd w:val="clear" w:color="auto" w:fill="EFEFEF"/>
+          </w:tcPr>
           <w:p>
             <w:pPr>
               <w:pStyle w:val="Compact"/>
@@ -8116,6 +8240,14 @@
         <w:tblW w:type="pct" w:w="5000"/>
         <w:tblLayout w:type="fixed"/>
         <w:tblLook w:firstRow="1" w:lastRow="0" w:firstColumn="0" w:lastColumn="0" w:noHBand="0" w:noVBand="0" w:val="0020"/>
+        <w:tblBorders>
+          <w:top w:val="single" w:sz="4" w:space="0" w:color="000000"/>
+          <w:left w:val="single" w:sz="4" w:space="0" w:color="000000"/>
+          <w:bottom w:val="single" w:sz="4" w:space="0" w:color="000000"/>
+          <w:right w:val="single" w:sz="4" w:space="0" w:color="000000"/>
+          <w:insideH w:val="single" w:sz="4" w:space="0" w:color="000000"/>
+          <w:insideV w:val="single" w:sz="4" w:space="0" w:color="000000"/>
+        </w:tblBorders>
       </w:tblPr>
       <w:tblGrid>
         <w:gridCol w:w="1584"/>
@@ -8129,7 +8261,9 @@
           <w:tblHeader w:val="on"/>
         </w:trPr>
         <w:tc>
-          <w:tcPr/>
+          <w:tcPr>
+            <w:shd w:val="clear" w:color="auto" w:fill="EFEFEF"/>
+          </w:tcPr>
           <w:p>
             <w:pPr>
               <w:pStyle w:val="Compact"/>
@@ -8140,7 +8274,9 @@
           </w:p>
         </w:tc>
         <w:tc>
-          <w:tcPr/>
+          <w:tcPr>
+            <w:shd w:val="clear" w:color="auto" w:fill="EFEFEF"/>
+          </w:tcPr>
           <w:p>
             <w:pPr>
               <w:pStyle w:val="Compact"/>
@@ -8151,7 +8287,9 @@
           </w:p>
         </w:tc>
         <w:tc>
-          <w:tcPr/>
+          <w:tcPr>
+            <w:shd w:val="clear" w:color="auto" w:fill="EFEFEF"/>
+          </w:tcPr>
           <w:p>
             <w:pPr>
               <w:pStyle w:val="Compact"/>
@@ -8162,7 +8300,9 @@
           </w:p>
         </w:tc>
         <w:tc>
-          <w:tcPr/>
+          <w:tcPr>
+            <w:shd w:val="clear" w:color="auto" w:fill="EFEFEF"/>
+          </w:tcPr>
           <w:p>
             <w:pPr>
               <w:pStyle w:val="Compact"/>
@@ -8173,7 +8313,9 @@
           </w:p>
         </w:tc>
         <w:tc>
-          <w:tcPr/>
+          <w:tcPr>
+            <w:shd w:val="clear" w:color="auto" w:fill="EFEFEF"/>
+          </w:tcPr>
           <w:p>
             <w:pPr>
               <w:pStyle w:val="Compact"/>
@@ -8516,6 +8658,14 @@
         <w:tblW w:type="pct" w:w="5000"/>
         <w:tblLayout w:type="fixed"/>
         <w:tblLook w:firstRow="1" w:lastRow="0" w:firstColumn="0" w:lastColumn="0" w:noHBand="0" w:noVBand="0" w:val="0020"/>
+        <w:tblBorders>
+          <w:top w:val="single" w:sz="4" w:space="0" w:color="000000"/>
+          <w:left w:val="single" w:sz="4" w:space="0" w:color="000000"/>
+          <w:bottom w:val="single" w:sz="4" w:space="0" w:color="000000"/>
+          <w:right w:val="single" w:sz="4" w:space="0" w:color="000000"/>
+          <w:insideH w:val="single" w:sz="4" w:space="0" w:color="000000"/>
+          <w:insideV w:val="single" w:sz="4" w:space="0" w:color="000000"/>
+        </w:tblBorders>
       </w:tblPr>
       <w:tblGrid>
         <w:gridCol w:w="2640"/>
@@ -8527,7 +8677,9 @@
           <w:tblHeader w:val="on"/>
         </w:trPr>
         <w:tc>
-          <w:tcPr/>
+          <w:tcPr>
+            <w:shd w:val="clear" w:color="auto" w:fill="EFEFEF"/>
+          </w:tcPr>
           <w:p>
             <w:pPr>
               <w:pStyle w:val="Compact"/>
@@ -8538,7 +8690,9 @@
           </w:p>
         </w:tc>
         <w:tc>
-          <w:tcPr/>
+          <w:tcPr>
+            <w:shd w:val="clear" w:color="auto" w:fill="EFEFEF"/>
+          </w:tcPr>
           <w:p>
             <w:pPr>
               <w:pStyle w:val="Compact"/>
@@ -8549,7 +8703,9 @@
           </w:p>
         </w:tc>
         <w:tc>
-          <w:tcPr/>
+          <w:tcPr>
+            <w:shd w:val="clear" w:color="auto" w:fill="EFEFEF"/>
+          </w:tcPr>
           <w:p>
             <w:pPr>
               <w:pStyle w:val="Compact"/>
@@ -8747,6 +8903,14 @@
         <w:tblW w:type="pct" w:w="5000"/>
         <w:tblLayout w:type="fixed"/>
         <w:tblLook w:firstRow="1" w:lastRow="0" w:firstColumn="0" w:lastColumn="0" w:noHBand="0" w:noVBand="0" w:val="0020"/>
+        <w:tblBorders>
+          <w:top w:val="single" w:sz="4" w:space="0" w:color="000000"/>
+          <w:left w:val="single" w:sz="4" w:space="0" w:color="000000"/>
+          <w:bottom w:val="single" w:sz="4" w:space="0" w:color="000000"/>
+          <w:right w:val="single" w:sz="4" w:space="0" w:color="000000"/>
+          <w:insideH w:val="single" w:sz="4" w:space="0" w:color="000000"/>
+          <w:insideV w:val="single" w:sz="4" w:space="0" w:color="000000"/>
+        </w:tblBorders>
       </w:tblPr>
       <w:tblGrid>
         <w:gridCol w:w="1584"/>
@@ -8760,7 +8924,9 @@
           <w:tblHeader w:val="on"/>
         </w:trPr>
         <w:tc>
-          <w:tcPr/>
+          <w:tcPr>
+            <w:shd w:val="clear" w:color="auto" w:fill="EFEFEF"/>
+          </w:tcPr>
           <w:p>
             <w:pPr>
               <w:pStyle w:val="Compact"/>
@@ -8771,7 +8937,9 @@
           </w:p>
         </w:tc>
         <w:tc>
-          <w:tcPr/>
+          <w:tcPr>
+            <w:shd w:val="clear" w:color="auto" w:fill="EFEFEF"/>
+          </w:tcPr>
           <w:p>
             <w:pPr>
               <w:pStyle w:val="Compact"/>
@@ -8782,7 +8950,9 @@
           </w:p>
         </w:tc>
         <w:tc>
-          <w:tcPr/>
+          <w:tcPr>
+            <w:shd w:val="clear" w:color="auto" w:fill="EFEFEF"/>
+          </w:tcPr>
           <w:p>
             <w:pPr>
               <w:pStyle w:val="Compact"/>
@@ -8793,7 +8963,9 @@
           </w:p>
         </w:tc>
         <w:tc>
-          <w:tcPr/>
+          <w:tcPr>
+            <w:shd w:val="clear" w:color="auto" w:fill="EFEFEF"/>
+          </w:tcPr>
           <w:p>
             <w:pPr>
               <w:pStyle w:val="Compact"/>
@@ -8804,7 +8976,9 @@
           </w:p>
         </w:tc>
         <w:tc>
-          <w:tcPr/>
+          <w:tcPr>
+            <w:shd w:val="clear" w:color="auto" w:fill="EFEFEF"/>
+          </w:tcPr>
           <w:p>
             <w:pPr>
               <w:pStyle w:val="Compact"/>
@@ -10084,6 +10258,14 @@
         <w:tblW w:type="pct" w:w="5000"/>
         <w:tblLayout w:type="fixed"/>
         <w:tblLook w:firstRow="1" w:lastRow="0" w:firstColumn="0" w:lastColumn="0" w:noHBand="0" w:noVBand="0" w:val="0020"/>
+        <w:tblBorders>
+          <w:top w:val="single" w:sz="4" w:space="0" w:color="000000"/>
+          <w:left w:val="single" w:sz="4" w:space="0" w:color="000000"/>
+          <w:bottom w:val="single" w:sz="4" w:space="0" w:color="000000"/>
+          <w:right w:val="single" w:sz="4" w:space="0" w:color="000000"/>
+          <w:insideH w:val="single" w:sz="4" w:space="0" w:color="000000"/>
+          <w:insideV w:val="single" w:sz="4" w:space="0" w:color="000000"/>
+        </w:tblBorders>
       </w:tblPr>
       <w:tblGrid>
         <w:gridCol w:w="2640"/>
@@ -10095,7 +10277,9 @@
           <w:tblHeader w:val="on"/>
         </w:trPr>
         <w:tc>
-          <w:tcPr/>
+          <w:tcPr>
+            <w:shd w:val="clear" w:color="auto" w:fill="EFEFEF"/>
+          </w:tcPr>
           <w:p>
             <w:pPr>
               <w:pStyle w:val="Compact"/>
@@ -10106,7 +10290,9 @@
           </w:p>
         </w:tc>
         <w:tc>
-          <w:tcPr/>
+          <w:tcPr>
+            <w:shd w:val="clear" w:color="auto" w:fill="EFEFEF"/>
+          </w:tcPr>
           <w:p>
             <w:pPr>
               <w:pStyle w:val="Compact"/>
@@ -10117,7 +10303,9 @@
           </w:p>
         </w:tc>
         <w:tc>
-          <w:tcPr/>
+          <w:tcPr>
+            <w:shd w:val="clear" w:color="auto" w:fill="EFEFEF"/>
+          </w:tcPr>
           <w:p>
             <w:pPr>
               <w:pStyle w:val="Compact"/>
@@ -11050,6 +11238,14 @@
         <w:tblW w:type="pct" w:w="5000"/>
         <w:tblLayout w:type="fixed"/>
         <w:tblLook w:firstRow="1" w:lastRow="0" w:firstColumn="0" w:lastColumn="0" w:noHBand="0" w:noVBand="0" w:val="0020"/>
+        <w:tblBorders>
+          <w:top w:val="single" w:sz="4" w:space="0" w:color="000000"/>
+          <w:left w:val="single" w:sz="4" w:space="0" w:color="000000"/>
+          <w:bottom w:val="single" w:sz="4" w:space="0" w:color="000000"/>
+          <w:right w:val="single" w:sz="4" w:space="0" w:color="000000"/>
+          <w:insideH w:val="single" w:sz="4" w:space="0" w:color="000000"/>
+          <w:insideV w:val="single" w:sz="4" w:space="0" w:color="000000"/>
+        </w:tblBorders>
       </w:tblPr>
       <w:tblGrid>
         <w:gridCol w:w="2640"/>
@@ -11061,7 +11257,9 @@
           <w:tblHeader w:val="on"/>
         </w:trPr>
         <w:tc>
-          <w:tcPr/>
+          <w:tcPr>
+            <w:shd w:val="clear" w:color="auto" w:fill="EFEFEF"/>
+          </w:tcPr>
           <w:p>
             <w:pPr>
               <w:pStyle w:val="Compact"/>
@@ -11072,7 +11270,9 @@
           </w:p>
         </w:tc>
         <w:tc>
-          <w:tcPr/>
+          <w:tcPr>
+            <w:shd w:val="clear" w:color="auto" w:fill="EFEFEF"/>
+          </w:tcPr>
           <w:p>
             <w:pPr>
               <w:pStyle w:val="Compact"/>
@@ -11083,7 +11283,9 @@
           </w:p>
         </w:tc>
         <w:tc>
-          <w:tcPr/>
+          <w:tcPr>
+            <w:shd w:val="clear" w:color="auto" w:fill="EFEFEF"/>
+          </w:tcPr>
           <w:p>
             <w:pPr>
               <w:pStyle w:val="Compact"/>
@@ -11648,6 +11850,14 @@
         <w:tblStyle w:val="Table"/>
         <w:tblW w:type="auto" w:w="0"/>
         <w:tblLook w:firstRow="1" w:lastRow="0" w:firstColumn="0" w:lastColumn="0" w:noHBand="0" w:noVBand="0" w:val="0020"/>
+        <w:tblBorders>
+          <w:top w:val="single" w:sz="4" w:space="0" w:color="000000"/>
+          <w:left w:val="single" w:sz="4" w:space="0" w:color="000000"/>
+          <w:bottom w:val="single" w:sz="4" w:space="0" w:color="000000"/>
+          <w:right w:val="single" w:sz="4" w:space="0" w:color="000000"/>
+          <w:insideH w:val="single" w:sz="4" w:space="0" w:color="000000"/>
+          <w:insideV w:val="single" w:sz="4" w:space="0" w:color="000000"/>
+        </w:tblBorders>
       </w:tblPr>
       <w:tblGrid>
         <w:gridCol w:w="2640"/>
@@ -11659,7 +11869,9 @@
           <w:tblHeader w:val="on"/>
         </w:trPr>
         <w:tc>
-          <w:tcPr/>
+          <w:tcPr>
+            <w:shd w:val="clear" w:color="auto" w:fill="EFEFEF"/>
+          </w:tcPr>
           <w:p>
             <w:pPr>
               <w:pStyle w:val="Compact"/>
@@ -11670,7 +11882,9 @@
           </w:p>
         </w:tc>
         <w:tc>
-          <w:tcPr/>
+          <w:tcPr>
+            <w:shd w:val="clear" w:color="auto" w:fill="EFEFEF"/>
+          </w:tcPr>
           <w:p>
             <w:pPr>
               <w:pStyle w:val="Compact"/>
@@ -11681,7 +11895,9 @@
           </w:p>
         </w:tc>
         <w:tc>
-          <w:tcPr/>
+          <w:tcPr>
+            <w:shd w:val="clear" w:color="auto" w:fill="EFEFEF"/>
+          </w:tcPr>
           <w:p>
             <w:pPr>
               <w:pStyle w:val="Compact"/>
@@ -11892,6 +12108,14 @@
         <w:tblStyle w:val="Table"/>
         <w:tblW w:type="auto" w:w="0"/>
         <w:tblLook w:firstRow="1" w:lastRow="0" w:firstColumn="0" w:lastColumn="0" w:noHBand="0" w:noVBand="0" w:val="0020"/>
+        <w:tblBorders>
+          <w:top w:val="single" w:sz="4" w:space="0" w:color="000000"/>
+          <w:left w:val="single" w:sz="4" w:space="0" w:color="000000"/>
+          <w:bottom w:val="single" w:sz="4" w:space="0" w:color="000000"/>
+          <w:right w:val="single" w:sz="4" w:space="0" w:color="000000"/>
+          <w:insideH w:val="single" w:sz="4" w:space="0" w:color="000000"/>
+          <w:insideV w:val="single" w:sz="4" w:space="0" w:color="000000"/>
+        </w:tblBorders>
       </w:tblPr>
       <w:tblGrid>
         <w:gridCol w:w="2640"/>
@@ -11903,7 +12127,9 @@
           <w:tblHeader w:val="on"/>
         </w:trPr>
         <w:tc>
-          <w:tcPr/>
+          <w:tcPr>
+            <w:shd w:val="clear" w:color="auto" w:fill="EFEFEF"/>
+          </w:tcPr>
           <w:p>
             <w:pPr>
               <w:pStyle w:val="Compact"/>
@@ -11914,7 +12140,9 @@
           </w:p>
         </w:tc>
         <w:tc>
-          <w:tcPr/>
+          <w:tcPr>
+            <w:shd w:val="clear" w:color="auto" w:fill="EFEFEF"/>
+          </w:tcPr>
           <w:p>
             <w:pPr>
               <w:pStyle w:val="Compact"/>
@@ -11925,7 +12153,9 @@
           </w:p>
         </w:tc>
         <w:tc>
-          <w:tcPr/>
+          <w:tcPr>
+            <w:shd w:val="clear" w:color="auto" w:fill="EFEFEF"/>
+          </w:tcPr>
           <w:p>
             <w:pPr>
               <w:pStyle w:val="Compact"/>
@@ -13164,6 +13394,14 @@
         <w:tblW w:type="pct" w:w="5000"/>
         <w:tblLayout w:type="fixed"/>
         <w:tblLook w:firstRow="1" w:lastRow="0" w:firstColumn="0" w:lastColumn="0" w:noHBand="0" w:noVBand="0" w:val="0020"/>
+        <w:tblBorders>
+          <w:top w:val="single" w:sz="4" w:space="0" w:color="000000"/>
+          <w:left w:val="single" w:sz="4" w:space="0" w:color="000000"/>
+          <w:bottom w:val="single" w:sz="4" w:space="0" w:color="000000"/>
+          <w:right w:val="single" w:sz="4" w:space="0" w:color="000000"/>
+          <w:insideH w:val="single" w:sz="4" w:space="0" w:color="000000"/>
+          <w:insideV w:val="single" w:sz="4" w:space="0" w:color="000000"/>
+        </w:tblBorders>
       </w:tblPr>
       <w:tblGrid>
         <w:gridCol w:w="2640"/>
@@ -13175,7 +13413,9 @@
           <w:tblHeader w:val="on"/>
         </w:trPr>
         <w:tc>
-          <w:tcPr/>
+          <w:tcPr>
+            <w:shd w:val="clear" w:color="auto" w:fill="EFEFEF"/>
+          </w:tcPr>
           <w:p>
             <w:pPr>
               <w:pStyle w:val="Compact"/>
@@ -13186,7 +13426,9 @@
           </w:p>
         </w:tc>
         <w:tc>
-          <w:tcPr/>
+          <w:tcPr>
+            <w:shd w:val="clear" w:color="auto" w:fill="EFEFEF"/>
+          </w:tcPr>
           <w:p>
             <w:pPr>
               <w:pStyle w:val="Compact"/>
@@ -13197,7 +13439,9 @@
           </w:p>
         </w:tc>
         <w:tc>
-          <w:tcPr/>
+          <w:tcPr>
+            <w:shd w:val="clear" w:color="auto" w:fill="EFEFEF"/>
+          </w:tcPr>
           <w:p>
             <w:pPr>
               <w:pStyle w:val="Compact"/>
@@ -14176,6 +14420,14 @@
         <w:tblStyle w:val="Table"/>
         <w:tblW w:type="auto" w:w="0"/>
         <w:tblLook w:firstRow="1" w:lastRow="0" w:firstColumn="0" w:lastColumn="0" w:noHBand="0" w:noVBand="0" w:val="0020"/>
+        <w:tblBorders>
+          <w:top w:val="single" w:sz="4" w:space="0" w:color="000000"/>
+          <w:left w:val="single" w:sz="4" w:space="0" w:color="000000"/>
+          <w:bottom w:val="single" w:sz="4" w:space="0" w:color="000000"/>
+          <w:right w:val="single" w:sz="4" w:space="0" w:color="000000"/>
+          <w:insideH w:val="single" w:sz="4" w:space="0" w:color="000000"/>
+          <w:insideV w:val="single" w:sz="4" w:space="0" w:color="000000"/>
+        </w:tblBorders>
       </w:tblPr>
       <w:tblGrid>
         <w:gridCol w:w="2640"/>
@@ -14187,7 +14439,9 @@
           <w:tblHeader w:val="on"/>
         </w:trPr>
         <w:tc>
-          <w:tcPr/>
+          <w:tcPr>
+            <w:shd w:val="clear" w:color="auto" w:fill="EFEFEF"/>
+          </w:tcPr>
           <w:p>
             <w:pPr>
               <w:pStyle w:val="Compact"/>
@@ -14198,7 +14452,9 @@
           </w:p>
         </w:tc>
         <w:tc>
-          <w:tcPr/>
+          <w:tcPr>
+            <w:shd w:val="clear" w:color="auto" w:fill="EFEFEF"/>
+          </w:tcPr>
           <w:p>
             <w:pPr>
               <w:pStyle w:val="Compact"/>
@@ -14209,7 +14465,9 @@
           </w:p>
         </w:tc>
         <w:tc>
-          <w:tcPr/>
+          <w:tcPr>
+            <w:shd w:val="clear" w:color="auto" w:fill="EFEFEF"/>
+          </w:tcPr>
           <w:p>
             <w:pPr>
               <w:pStyle w:val="Compact"/>
@@ -15138,6 +15396,14 @@
         <w:tblW w:type="pct" w:w="5000"/>
         <w:tblLayout w:type="fixed"/>
         <w:tblLook w:firstRow="1" w:lastRow="0" w:firstColumn="0" w:lastColumn="0" w:noHBand="0" w:noVBand="0" w:val="0020"/>
+        <w:tblBorders>
+          <w:top w:val="single" w:sz="4" w:space="0" w:color="000000"/>
+          <w:left w:val="single" w:sz="4" w:space="0" w:color="000000"/>
+          <w:bottom w:val="single" w:sz="4" w:space="0" w:color="000000"/>
+          <w:right w:val="single" w:sz="4" w:space="0" w:color="000000"/>
+          <w:insideH w:val="single" w:sz="4" w:space="0" w:color="000000"/>
+          <w:insideV w:val="single" w:sz="4" w:space="0" w:color="000000"/>
+        </w:tblBorders>
       </w:tblPr>
       <w:tblGrid>
         <w:gridCol w:w="2640"/>
@@ -15149,7 +15415,9 @@
           <w:tblHeader w:val="on"/>
         </w:trPr>
         <w:tc>
-          <w:tcPr/>
+          <w:tcPr>
+            <w:shd w:val="clear" w:color="auto" w:fill="EFEFEF"/>
+          </w:tcPr>
           <w:p>
             <w:pPr>
               <w:pStyle w:val="Compact"/>
@@ -15160,7 +15428,9 @@
           </w:p>
         </w:tc>
         <w:tc>
-          <w:tcPr/>
+          <w:tcPr>
+            <w:shd w:val="clear" w:color="auto" w:fill="EFEFEF"/>
+          </w:tcPr>
           <w:p>
             <w:pPr>
               <w:pStyle w:val="Compact"/>
@@ -15171,7 +15441,9 @@
           </w:p>
         </w:tc>
         <w:tc>
-          <w:tcPr/>
+          <w:tcPr>
+            <w:shd w:val="clear" w:color="auto" w:fill="EFEFEF"/>
+          </w:tcPr>
           <w:p>
             <w:pPr>
               <w:pStyle w:val="Compact"/>
@@ -15506,6 +15778,14 @@
         <w:tblW w:type="pct" w:w="5000"/>
         <w:tblLayout w:type="fixed"/>
         <w:tblLook w:firstRow="1" w:lastRow="0" w:firstColumn="0" w:lastColumn="0" w:noHBand="0" w:noVBand="0" w:val="0020"/>
+        <w:tblBorders>
+          <w:top w:val="single" w:sz="4" w:space="0" w:color="000000"/>
+          <w:left w:val="single" w:sz="4" w:space="0" w:color="000000"/>
+          <w:bottom w:val="single" w:sz="4" w:space="0" w:color="000000"/>
+          <w:right w:val="single" w:sz="4" w:space="0" w:color="000000"/>
+          <w:insideH w:val="single" w:sz="4" w:space="0" w:color="000000"/>
+          <w:insideV w:val="single" w:sz="4" w:space="0" w:color="000000"/>
+        </w:tblBorders>
       </w:tblPr>
       <w:tblGrid>
         <w:gridCol w:w="1980"/>
@@ -15518,7 +15798,9 @@
           <w:tblHeader w:val="on"/>
         </w:trPr>
         <w:tc>
-          <w:tcPr/>
+          <w:tcPr>
+            <w:shd w:val="clear" w:color="auto" w:fill="EFEFEF"/>
+          </w:tcPr>
           <w:p>
             <w:pPr>
               <w:pStyle w:val="Compact"/>
@@ -15529,7 +15811,9 @@
           </w:p>
         </w:tc>
         <w:tc>
-          <w:tcPr/>
+          <w:tcPr>
+            <w:shd w:val="clear" w:color="auto" w:fill="EFEFEF"/>
+          </w:tcPr>
           <w:p>
             <w:pPr>
               <w:pStyle w:val="Compact"/>
@@ -15540,7 +15824,9 @@
           </w:p>
         </w:tc>
         <w:tc>
-          <w:tcPr/>
+          <w:tcPr>
+            <w:shd w:val="clear" w:color="auto" w:fill="EFEFEF"/>
+          </w:tcPr>
           <w:p>
             <w:pPr>
               <w:pStyle w:val="Compact"/>
@@ -15551,7 +15837,9 @@
           </w:p>
         </w:tc>
         <w:tc>
-          <w:tcPr/>
+          <w:tcPr>
+            <w:shd w:val="clear" w:color="auto" w:fill="EFEFEF"/>
+          </w:tcPr>
           <w:p>
             <w:pPr>
               <w:pStyle w:val="Compact"/>
@@ -15865,6 +16153,14 @@
         <w:tblW w:type="pct" w:w="5000"/>
         <w:tblLayout w:type="fixed"/>
         <w:tblLook w:firstRow="1" w:lastRow="0" w:firstColumn="0" w:lastColumn="0" w:noHBand="0" w:noVBand="0" w:val="0020"/>
+        <w:tblBorders>
+          <w:top w:val="single" w:sz="4" w:space="0" w:color="000000"/>
+          <w:left w:val="single" w:sz="4" w:space="0" w:color="000000"/>
+          <w:bottom w:val="single" w:sz="4" w:space="0" w:color="000000"/>
+          <w:right w:val="single" w:sz="4" w:space="0" w:color="000000"/>
+          <w:insideH w:val="single" w:sz="4" w:space="0" w:color="000000"/>
+          <w:insideV w:val="single" w:sz="4" w:space="0" w:color="000000"/>
+        </w:tblBorders>
       </w:tblPr>
       <w:tblGrid>
         <w:gridCol w:w="2640"/>
@@ -15876,7 +16172,9 @@
           <w:tblHeader w:val="on"/>
         </w:trPr>
         <w:tc>
-          <w:tcPr/>
+          <w:tcPr>
+            <w:shd w:val="clear" w:color="auto" w:fill="EFEFEF"/>
+          </w:tcPr>
           <w:p>
             <w:pPr>
               <w:pStyle w:val="Compact"/>
@@ -15887,7 +16185,9 @@
           </w:p>
         </w:tc>
         <w:tc>
-          <w:tcPr/>
+          <w:tcPr>
+            <w:shd w:val="clear" w:color="auto" w:fill="EFEFEF"/>
+          </w:tcPr>
           <w:p>
             <w:pPr>
               <w:pStyle w:val="Compact"/>
@@ -15898,7 +16198,9 @@
           </w:p>
         </w:tc>
         <w:tc>
-          <w:tcPr/>
+          <w:tcPr>
+            <w:shd w:val="clear" w:color="auto" w:fill="EFEFEF"/>
+          </w:tcPr>
           <w:p>
             <w:pPr>
               <w:pStyle w:val="Compact"/>
@@ -16310,6 +16612,14 @@
         <w:tblW w:type="pct" w:w="5000"/>
         <w:tblLayout w:type="fixed"/>
         <w:tblLook w:firstRow="1" w:lastRow="0" w:firstColumn="0" w:lastColumn="0" w:noHBand="0" w:noVBand="0" w:val="0020"/>
+        <w:tblBorders>
+          <w:top w:val="single" w:sz="4" w:space="0" w:color="000000"/>
+          <w:left w:val="single" w:sz="4" w:space="0" w:color="000000"/>
+          <w:bottom w:val="single" w:sz="4" w:space="0" w:color="000000"/>
+          <w:right w:val="single" w:sz="4" w:space="0" w:color="000000"/>
+          <w:insideH w:val="single" w:sz="4" w:space="0" w:color="000000"/>
+          <w:insideV w:val="single" w:sz="4" w:space="0" w:color="000000"/>
+        </w:tblBorders>
       </w:tblPr>
       <w:tblGrid>
         <w:gridCol w:w="1131"/>
@@ -16325,7 +16635,9 @@
           <w:tblHeader w:val="on"/>
         </w:trPr>
         <w:tc>
-          <w:tcPr/>
+          <w:tcPr>
+            <w:shd w:val="clear" w:color="auto" w:fill="EFEFEF"/>
+          </w:tcPr>
           <w:p>
             <w:pPr>
               <w:pStyle w:val="Compact"/>
@@ -16336,7 +16648,9 @@
           </w:p>
         </w:tc>
         <w:tc>
-          <w:tcPr/>
+          <w:tcPr>
+            <w:shd w:val="clear" w:color="auto" w:fill="EFEFEF"/>
+          </w:tcPr>
           <w:p>
             <w:pPr>
               <w:pStyle w:val="Compact"/>
@@ -16347,7 +16661,9 @@
           </w:p>
         </w:tc>
         <w:tc>
-          <w:tcPr/>
+          <w:tcPr>
+            <w:shd w:val="clear" w:color="auto" w:fill="EFEFEF"/>
+          </w:tcPr>
           <w:p>
             <w:pPr>
               <w:pStyle w:val="Compact"/>
@@ -16358,7 +16674,9 @@
           </w:p>
         </w:tc>
         <w:tc>
-          <w:tcPr/>
+          <w:tcPr>
+            <w:shd w:val="clear" w:color="auto" w:fill="EFEFEF"/>
+          </w:tcPr>
           <w:p>
             <w:pPr>
               <w:pStyle w:val="Compact"/>
@@ -16369,7 +16687,9 @@
           </w:p>
         </w:tc>
         <w:tc>
-          <w:tcPr/>
+          <w:tcPr>
+            <w:shd w:val="clear" w:color="auto" w:fill="EFEFEF"/>
+          </w:tcPr>
           <w:p>
             <w:pPr>
               <w:pStyle w:val="Compact"/>
@@ -16380,7 +16700,9 @@
           </w:p>
         </w:tc>
         <w:tc>
-          <w:tcPr/>
+          <w:tcPr>
+            <w:shd w:val="clear" w:color="auto" w:fill="EFEFEF"/>
+          </w:tcPr>
           <w:p>
             <w:pPr>
               <w:pStyle w:val="Compact"/>
@@ -16391,7 +16713,9 @@
           </w:p>
         </w:tc>
         <w:tc>
-          <w:tcPr/>
+          <w:tcPr>
+            <w:shd w:val="clear" w:color="auto" w:fill="EFEFEF"/>
+          </w:tcPr>
           <w:p>
             <w:pPr>
               <w:pStyle w:val="Compact"/>
@@ -16839,6 +17163,14 @@
         <w:tblW w:type="pct" w:w="5000"/>
         <w:tblLayout w:type="fixed"/>
         <w:tblLook w:firstRow="1" w:lastRow="0" w:firstColumn="0" w:lastColumn="0" w:noHBand="0" w:noVBand="0" w:val="0020"/>
+        <w:tblBorders>
+          <w:top w:val="single" w:sz="4" w:space="0" w:color="000000"/>
+          <w:left w:val="single" w:sz="4" w:space="0" w:color="000000"/>
+          <w:bottom w:val="single" w:sz="4" w:space="0" w:color="000000"/>
+          <w:right w:val="single" w:sz="4" w:space="0" w:color="000000"/>
+          <w:insideH w:val="single" w:sz="4" w:space="0" w:color="000000"/>
+          <w:insideV w:val="single" w:sz="4" w:space="0" w:color="000000"/>
+        </w:tblBorders>
       </w:tblPr>
       <w:tblGrid>
         <w:gridCol w:w="1980"/>
@@ -16851,7 +17183,9 @@
           <w:tblHeader w:val="on"/>
         </w:trPr>
         <w:tc>
-          <w:tcPr/>
+          <w:tcPr>
+            <w:shd w:val="clear" w:color="auto" w:fill="EFEFEF"/>
+          </w:tcPr>
           <w:p>
             <w:pPr>
               <w:pStyle w:val="Compact"/>
@@ -16862,7 +17196,9 @@
           </w:p>
         </w:tc>
         <w:tc>
-          <w:tcPr/>
+          <w:tcPr>
+            <w:shd w:val="clear" w:color="auto" w:fill="EFEFEF"/>
+          </w:tcPr>
           <w:p>
             <w:pPr>
               <w:pStyle w:val="Compact"/>
@@ -16873,7 +17209,9 @@
           </w:p>
         </w:tc>
         <w:tc>
-          <w:tcPr/>
+          <w:tcPr>
+            <w:shd w:val="clear" w:color="auto" w:fill="EFEFEF"/>
+          </w:tcPr>
           <w:p>
             <w:pPr>
               <w:pStyle w:val="Compact"/>
@@ -16884,7 +17222,9 @@
           </w:p>
         </w:tc>
         <w:tc>
-          <w:tcPr/>
+          <w:tcPr>
+            <w:shd w:val="clear" w:color="auto" w:fill="EFEFEF"/>
+          </w:tcPr>
           <w:p>
             <w:pPr>
               <w:pStyle w:val="Compact"/>
@@ -17383,6 +17723,14 @@
         <w:tblW w:type="pct" w:w="5000"/>
         <w:tblLayout w:type="fixed"/>
         <w:tblLook w:firstRow="1" w:lastRow="0" w:firstColumn="0" w:lastColumn="0" w:noHBand="0" w:noVBand="0" w:val="0020"/>
+        <w:tblBorders>
+          <w:top w:val="single" w:sz="4" w:space="0" w:color="000000"/>
+          <w:left w:val="single" w:sz="4" w:space="0" w:color="000000"/>
+          <w:bottom w:val="single" w:sz="4" w:space="0" w:color="000000"/>
+          <w:right w:val="single" w:sz="4" w:space="0" w:color="000000"/>
+          <w:insideH w:val="single" w:sz="4" w:space="0" w:color="000000"/>
+          <w:insideV w:val="single" w:sz="4" w:space="0" w:color="000000"/>
+        </w:tblBorders>
       </w:tblPr>
       <w:tblGrid>
         <w:gridCol w:w="2640"/>
@@ -17394,7 +17742,9 @@
           <w:tblHeader w:val="on"/>
         </w:trPr>
         <w:tc>
-          <w:tcPr/>
+          <w:tcPr>
+            <w:shd w:val="clear" w:color="auto" w:fill="EFEFEF"/>
+          </w:tcPr>
           <w:p>
             <w:pPr>
               <w:pStyle w:val="Compact"/>
@@ -17405,7 +17755,9 @@
           </w:p>
         </w:tc>
         <w:tc>
-          <w:tcPr/>
+          <w:tcPr>
+            <w:shd w:val="clear" w:color="auto" w:fill="EFEFEF"/>
+          </w:tcPr>
           <w:p>
             <w:pPr>
               <w:pStyle w:val="Compact"/>
@@ -17416,7 +17768,9 @@
           </w:p>
         </w:tc>
         <w:tc>
-          <w:tcPr/>
+          <w:tcPr>
+            <w:shd w:val="clear" w:color="auto" w:fill="EFEFEF"/>
+          </w:tcPr>
           <w:p>
             <w:pPr>
               <w:pStyle w:val="Compact"/>
@@ -18074,6 +18428,14 @@
         <w:tblW w:type="pct" w:w="5000"/>
         <w:tblLayout w:type="fixed"/>
         <w:tblLook w:firstRow="1" w:lastRow="0" w:firstColumn="0" w:lastColumn="0" w:noHBand="0" w:noVBand="0" w:val="0020"/>
+        <w:tblBorders>
+          <w:top w:val="single" w:sz="4" w:space="0" w:color="000000"/>
+          <w:left w:val="single" w:sz="4" w:space="0" w:color="000000"/>
+          <w:bottom w:val="single" w:sz="4" w:space="0" w:color="000000"/>
+          <w:right w:val="single" w:sz="4" w:space="0" w:color="000000"/>
+          <w:insideH w:val="single" w:sz="4" w:space="0" w:color="000000"/>
+          <w:insideV w:val="single" w:sz="4" w:space="0" w:color="000000"/>
+        </w:tblBorders>
       </w:tblPr>
       <w:tblGrid>
         <w:gridCol w:w="1980"/>
@@ -18086,7 +18448,9 @@
           <w:tblHeader w:val="on"/>
         </w:trPr>
         <w:tc>
-          <w:tcPr/>
+          <w:tcPr>
+            <w:shd w:val="clear" w:color="auto" w:fill="EFEFEF"/>
+          </w:tcPr>
           <w:p>
             <w:pPr>
               <w:pStyle w:val="Compact"/>
@@ -18097,7 +18461,9 @@
           </w:p>
         </w:tc>
         <w:tc>
-          <w:tcPr/>
+          <w:tcPr>
+            <w:shd w:val="clear" w:color="auto" w:fill="EFEFEF"/>
+          </w:tcPr>
           <w:p>
             <w:pPr>
               <w:pStyle w:val="Compact"/>
@@ -18108,7 +18474,9 @@
           </w:p>
         </w:tc>
         <w:tc>
-          <w:tcPr/>
+          <w:tcPr>
+            <w:shd w:val="clear" w:color="auto" w:fill="EFEFEF"/>
+          </w:tcPr>
           <w:p>
             <w:pPr>
               <w:pStyle w:val="Compact"/>
@@ -18119,7 +18487,9 @@
           </w:p>
         </w:tc>
         <w:tc>
-          <w:tcPr/>
+          <w:tcPr>
+            <w:shd w:val="clear" w:color="auto" w:fill="EFEFEF"/>
+          </w:tcPr>
           <w:p>
             <w:pPr>
               <w:pStyle w:val="Compact"/>
@@ -18524,6 +18894,14 @@
         <w:tblW w:type="pct" w:w="5000"/>
         <w:tblLayout w:type="fixed"/>
         <w:tblLook w:firstRow="1" w:lastRow="0" w:firstColumn="0" w:lastColumn="0" w:noHBand="0" w:noVBand="0" w:val="0020"/>
+        <w:tblBorders>
+          <w:top w:val="single" w:sz="4" w:space="0" w:color="000000"/>
+          <w:left w:val="single" w:sz="4" w:space="0" w:color="000000"/>
+          <w:bottom w:val="single" w:sz="4" w:space="0" w:color="000000"/>
+          <w:right w:val="single" w:sz="4" w:space="0" w:color="000000"/>
+          <w:insideH w:val="single" w:sz="4" w:space="0" w:color="000000"/>
+          <w:insideV w:val="single" w:sz="4" w:space="0" w:color="000000"/>
+        </w:tblBorders>
       </w:tblPr>
       <w:tblGrid>
         <w:gridCol w:w="1980"/>
@@ -18536,7 +18914,9 @@
           <w:tblHeader w:val="on"/>
         </w:trPr>
         <w:tc>
-          <w:tcPr/>
+          <w:tcPr>
+            <w:shd w:val="clear" w:color="auto" w:fill="EFEFEF"/>
+          </w:tcPr>
           <w:p>
             <w:pPr>
               <w:pStyle w:val="Compact"/>
@@ -18547,7 +18927,9 @@
           </w:p>
         </w:tc>
         <w:tc>
-          <w:tcPr/>
+          <w:tcPr>
+            <w:shd w:val="clear" w:color="auto" w:fill="EFEFEF"/>
+          </w:tcPr>
           <w:p>
             <w:pPr>
               <w:pStyle w:val="Compact"/>
@@ -18558,7 +18940,9 @@
           </w:p>
         </w:tc>
         <w:tc>
-          <w:tcPr/>
+          <w:tcPr>
+            <w:shd w:val="clear" w:color="auto" w:fill="EFEFEF"/>
+          </w:tcPr>
           <w:p>
             <w:pPr>
               <w:pStyle w:val="Compact"/>
@@ -18569,7 +18953,9 @@
           </w:p>
         </w:tc>
         <w:tc>
-          <w:tcPr/>
+          <w:tcPr>
+            <w:shd w:val="clear" w:color="auto" w:fill="EFEFEF"/>
+          </w:tcPr>
           <w:p>
             <w:pPr>
               <w:pStyle w:val="Compact"/>
@@ -19271,6 +19657,14 @@
         <w:tblW w:type="pct" w:w="5000"/>
         <w:tblLayout w:type="fixed"/>
         <w:tblLook w:firstRow="1" w:lastRow="0" w:firstColumn="0" w:lastColumn="0" w:noHBand="0" w:noVBand="0" w:val="0020"/>
+        <w:tblBorders>
+          <w:top w:val="single" w:sz="4" w:space="0" w:color="000000"/>
+          <w:left w:val="single" w:sz="4" w:space="0" w:color="000000"/>
+          <w:bottom w:val="single" w:sz="4" w:space="0" w:color="000000"/>
+          <w:right w:val="single" w:sz="4" w:space="0" w:color="000000"/>
+          <w:insideH w:val="single" w:sz="4" w:space="0" w:color="000000"/>
+          <w:insideV w:val="single" w:sz="4" w:space="0" w:color="000000"/>
+        </w:tblBorders>
       </w:tblPr>
       <w:tblGrid>
         <w:gridCol w:w="1320"/>
@@ -19285,7 +19679,9 @@
           <w:tblHeader w:val="on"/>
         </w:trPr>
         <w:tc>
-          <w:tcPr/>
+          <w:tcPr>
+            <w:shd w:val="clear" w:color="auto" w:fill="EFEFEF"/>
+          </w:tcPr>
           <w:p>
             <w:pPr>
               <w:pStyle w:val="Compact"/>
@@ -19296,7 +19692,9 @@
           </w:p>
         </w:tc>
         <w:tc>
-          <w:tcPr/>
+          <w:tcPr>
+            <w:shd w:val="clear" w:color="auto" w:fill="EFEFEF"/>
+          </w:tcPr>
           <w:p>
             <w:pPr>
               <w:pStyle w:val="Compact"/>
@@ -19307,7 +19705,9 @@
           </w:p>
         </w:tc>
         <w:tc>
-          <w:tcPr/>
+          <w:tcPr>
+            <w:shd w:val="clear" w:color="auto" w:fill="EFEFEF"/>
+          </w:tcPr>
           <w:p>
             <w:pPr>
               <w:pStyle w:val="Compact"/>
@@ -19318,7 +19718,9 @@
           </w:p>
         </w:tc>
         <w:tc>
-          <w:tcPr/>
+          <w:tcPr>
+            <w:shd w:val="clear" w:color="auto" w:fill="EFEFEF"/>
+          </w:tcPr>
           <w:p>
             <w:pPr>
               <w:pStyle w:val="Compact"/>
@@ -19329,7 +19731,9 @@
           </w:p>
         </w:tc>
         <w:tc>
-          <w:tcPr/>
+          <w:tcPr>
+            <w:shd w:val="clear" w:color="auto" w:fill="EFEFEF"/>
+          </w:tcPr>
           <w:p>
             <w:pPr>
               <w:pStyle w:val="Compact"/>
@@ -19340,7 +19744,9 @@
           </w:p>
         </w:tc>
         <w:tc>
-          <w:tcPr/>
+          <w:tcPr>
+            <w:shd w:val="clear" w:color="auto" w:fill="EFEFEF"/>
+          </w:tcPr>
           <w:p>
             <w:pPr>
               <w:pStyle w:val="Compact"/>
@@ -19829,6 +20235,14 @@
         <w:tblStyle w:val="Table"/>
         <w:tblW w:type="auto" w:w="0"/>
         <w:tblLook w:firstRow="1" w:lastRow="0" w:firstColumn="0" w:lastColumn="0" w:noHBand="0" w:noVBand="0" w:val="0020"/>
+        <w:tblBorders>
+          <w:top w:val="single" w:sz="4" w:space="0" w:color="000000"/>
+          <w:left w:val="single" w:sz="4" w:space="0" w:color="000000"/>
+          <w:bottom w:val="single" w:sz="4" w:space="0" w:color="000000"/>
+          <w:right w:val="single" w:sz="4" w:space="0" w:color="000000"/>
+          <w:insideH w:val="single" w:sz="4" w:space="0" w:color="000000"/>
+          <w:insideV w:val="single" w:sz="4" w:space="0" w:color="000000"/>
+        </w:tblBorders>
       </w:tblPr>
       <w:tblGrid>
         <w:gridCol w:w="1584"/>
@@ -19842,7 +20256,9 @@
           <w:tblHeader w:val="on"/>
         </w:trPr>
         <w:tc>
-          <w:tcPr/>
+          <w:tcPr>
+            <w:shd w:val="clear" w:color="auto" w:fill="EFEFEF"/>
+          </w:tcPr>
           <w:p>
             <w:pPr>
               <w:pStyle w:val="Compact"/>
@@ -19853,7 +20269,9 @@
           </w:p>
         </w:tc>
         <w:tc>
-          <w:tcPr/>
+          <w:tcPr>
+            <w:shd w:val="clear" w:color="auto" w:fill="EFEFEF"/>
+          </w:tcPr>
           <w:p>
             <w:pPr>
               <w:pStyle w:val="Compact"/>
@@ -19864,7 +20282,9 @@
           </w:p>
         </w:tc>
         <w:tc>
-          <w:tcPr/>
+          <w:tcPr>
+            <w:shd w:val="clear" w:color="auto" w:fill="EFEFEF"/>
+          </w:tcPr>
           <w:p>
             <w:pPr>
               <w:pStyle w:val="Compact"/>
@@ -19875,7 +20295,9 @@
           </w:p>
         </w:tc>
         <w:tc>
-          <w:tcPr/>
+          <w:tcPr>
+            <w:shd w:val="clear" w:color="auto" w:fill="EFEFEF"/>
+          </w:tcPr>
           <w:p>
             <w:pPr>
               <w:pStyle w:val="Compact"/>
@@ -19886,7 +20308,9 @@
           </w:p>
         </w:tc>
         <w:tc>
-          <w:tcPr/>
+          <w:tcPr>
+            <w:shd w:val="clear" w:color="auto" w:fill="EFEFEF"/>
+          </w:tcPr>
           <w:p>
             <w:pPr>
               <w:pStyle w:val="Compact"/>
@@ -20545,6 +20969,14 @@
         <w:tblW w:type="pct" w:w="5000"/>
         <w:tblLayout w:type="fixed"/>
         <w:tblLook w:firstRow="1" w:lastRow="0" w:firstColumn="0" w:lastColumn="0" w:noHBand="0" w:noVBand="0" w:val="0020"/>
+        <w:tblBorders>
+          <w:top w:val="single" w:sz="4" w:space="0" w:color="000000"/>
+          <w:left w:val="single" w:sz="4" w:space="0" w:color="000000"/>
+          <w:bottom w:val="single" w:sz="4" w:space="0" w:color="000000"/>
+          <w:right w:val="single" w:sz="4" w:space="0" w:color="000000"/>
+          <w:insideH w:val="single" w:sz="4" w:space="0" w:color="000000"/>
+          <w:insideV w:val="single" w:sz="4" w:space="0" w:color="000000"/>
+        </w:tblBorders>
       </w:tblPr>
       <w:tblGrid>
         <w:gridCol w:w="1980"/>
@@ -20557,7 +20989,9 @@
           <w:tblHeader w:val="on"/>
         </w:trPr>
         <w:tc>
-          <w:tcPr/>
+          <w:tcPr>
+            <w:shd w:val="clear" w:color="auto" w:fill="EFEFEF"/>
+          </w:tcPr>
           <w:p>
             <w:pPr>
               <w:pStyle w:val="Compact"/>
@@ -20568,7 +21002,9 @@
           </w:p>
         </w:tc>
         <w:tc>
-          <w:tcPr/>
+          <w:tcPr>
+            <w:shd w:val="clear" w:color="auto" w:fill="EFEFEF"/>
+          </w:tcPr>
           <w:p>
             <w:pPr>
               <w:pStyle w:val="Compact"/>
@@ -20579,7 +21015,9 @@
           </w:p>
         </w:tc>
         <w:tc>
-          <w:tcPr/>
+          <w:tcPr>
+            <w:shd w:val="clear" w:color="auto" w:fill="EFEFEF"/>
+          </w:tcPr>
           <w:p>
             <w:pPr>
               <w:pStyle w:val="Compact"/>
@@ -20590,7 +21028,9 @@
           </w:p>
         </w:tc>
         <w:tc>
-          <w:tcPr/>
+          <w:tcPr>
+            <w:shd w:val="clear" w:color="auto" w:fill="EFEFEF"/>
+          </w:tcPr>
           <w:p>
             <w:pPr>
               <w:pStyle w:val="Compact"/>
@@ -21438,6 +21878,14 @@
         <w:tblW w:type="pct" w:w="5000"/>
         <w:tblLayout w:type="fixed"/>
         <w:tblLook w:firstRow="1" w:lastRow="0" w:firstColumn="0" w:lastColumn="0" w:noHBand="0" w:noVBand="0" w:val="0020"/>
+        <w:tblBorders>
+          <w:top w:val="single" w:sz="4" w:space="0" w:color="000000"/>
+          <w:left w:val="single" w:sz="4" w:space="0" w:color="000000"/>
+          <w:bottom w:val="single" w:sz="4" w:space="0" w:color="000000"/>
+          <w:right w:val="single" w:sz="4" w:space="0" w:color="000000"/>
+          <w:insideH w:val="single" w:sz="4" w:space="0" w:color="000000"/>
+          <w:insideV w:val="single" w:sz="4" w:space="0" w:color="000000"/>
+        </w:tblBorders>
       </w:tblPr>
       <w:tblGrid>
         <w:gridCol w:w="1584"/>
@@ -21451,7 +21899,9 @@
           <w:tblHeader w:val="on"/>
         </w:trPr>
         <w:tc>
-          <w:tcPr/>
+          <w:tcPr>
+            <w:shd w:val="clear" w:color="auto" w:fill="EFEFEF"/>
+          </w:tcPr>
           <w:p>
             <w:pPr>
               <w:pStyle w:val="Compact"/>
@@ -21462,7 +21912,9 @@
           </w:p>
         </w:tc>
         <w:tc>
-          <w:tcPr/>
+          <w:tcPr>
+            <w:shd w:val="clear" w:color="auto" w:fill="EFEFEF"/>
+          </w:tcPr>
           <w:p>
             <w:pPr>
               <w:pStyle w:val="Compact"/>
@@ -21473,7 +21925,9 @@
           </w:p>
         </w:tc>
         <w:tc>
-          <w:tcPr/>
+          <w:tcPr>
+            <w:shd w:val="clear" w:color="auto" w:fill="EFEFEF"/>
+          </w:tcPr>
           <w:p>
             <w:pPr>
               <w:pStyle w:val="Compact"/>
@@ -21484,7 +21938,9 @@
           </w:p>
         </w:tc>
         <w:tc>
-          <w:tcPr/>
+          <w:tcPr>
+            <w:shd w:val="clear" w:color="auto" w:fill="EFEFEF"/>
+          </w:tcPr>
           <w:p>
             <w:pPr>
               <w:pStyle w:val="Compact"/>
@@ -21495,7 +21951,9 @@
           </w:p>
         </w:tc>
         <w:tc>
-          <w:tcPr/>
+          <w:tcPr>
+            <w:shd w:val="clear" w:color="auto" w:fill="EFEFEF"/>
+          </w:tcPr>
           <w:p>
             <w:pPr>
               <w:pStyle w:val="Compact"/>
@@ -27474,6 +27932,14 @@
         <w:tblW w:type="pct" w:w="5000"/>
         <w:tblLayout w:type="fixed"/>
         <w:tblLook w:firstRow="1" w:lastRow="0" w:firstColumn="0" w:lastColumn="0" w:noHBand="0" w:noVBand="0" w:val="0020"/>
+        <w:tblBorders>
+          <w:top w:val="single" w:sz="4" w:space="0" w:color="000000"/>
+          <w:left w:val="single" w:sz="4" w:space="0" w:color="000000"/>
+          <w:bottom w:val="single" w:sz="4" w:space="0" w:color="000000"/>
+          <w:right w:val="single" w:sz="4" w:space="0" w:color="000000"/>
+          <w:insideH w:val="single" w:sz="4" w:space="0" w:color="000000"/>
+          <w:insideV w:val="single" w:sz="4" w:space="0" w:color="000000"/>
+        </w:tblBorders>
       </w:tblPr>
       <w:tblGrid>
         <w:gridCol w:w="3960"/>
@@ -27484,7 +27950,9 @@
           <w:tblHeader w:val="on"/>
         </w:trPr>
         <w:tc>
-          <w:tcPr/>
+          <w:tcPr>
+            <w:shd w:val="clear" w:color="auto" w:fill="EFEFEF"/>
+          </w:tcPr>
           <w:p>
             <w:pPr>
               <w:pStyle w:val="Compact"/>
@@ -27495,7 +27963,9 @@
           </w:p>
         </w:tc>
         <w:tc>
-          <w:tcPr/>
+          <w:tcPr>
+            <w:shd w:val="clear" w:color="auto" w:fill="EFEFEF"/>
+          </w:tcPr>
           <w:p>
             <w:pPr>
               <w:pStyle w:val="Compact"/>
@@ -27750,6 +28220,14 @@
         <w:tblW w:type="pct" w:w="5000"/>
         <w:tblLayout w:type="fixed"/>
         <w:tblLook w:firstRow="1" w:lastRow="0" w:firstColumn="0" w:lastColumn="0" w:noHBand="0" w:noVBand="0" w:val="0020"/>
+        <w:tblBorders>
+          <w:top w:val="single" w:sz="4" w:space="0" w:color="000000"/>
+          <w:left w:val="single" w:sz="4" w:space="0" w:color="000000"/>
+          <w:bottom w:val="single" w:sz="4" w:space="0" w:color="000000"/>
+          <w:right w:val="single" w:sz="4" w:space="0" w:color="000000"/>
+          <w:insideH w:val="single" w:sz="4" w:space="0" w:color="000000"/>
+          <w:insideV w:val="single" w:sz="4" w:space="0" w:color="000000"/>
+        </w:tblBorders>
       </w:tblPr>
       <w:tblGrid>
         <w:gridCol w:w="1980"/>
@@ -27762,7 +28240,9 @@
           <w:tblHeader w:val="on"/>
         </w:trPr>
         <w:tc>
-          <w:tcPr/>
+          <w:tcPr>
+            <w:shd w:val="clear" w:color="auto" w:fill="EFEFEF"/>
+          </w:tcPr>
           <w:p>
             <w:pPr>
               <w:pStyle w:val="Compact"/>
@@ -27773,7 +28253,9 @@
           </w:p>
         </w:tc>
         <w:tc>
-          <w:tcPr/>
+          <w:tcPr>
+            <w:shd w:val="clear" w:color="auto" w:fill="EFEFEF"/>
+          </w:tcPr>
           <w:p>
             <w:pPr>
               <w:pStyle w:val="Compact"/>
@@ -27784,7 +28266,9 @@
           </w:p>
         </w:tc>
         <w:tc>
-          <w:tcPr/>
+          <w:tcPr>
+            <w:shd w:val="clear" w:color="auto" w:fill="EFEFEF"/>
+          </w:tcPr>
           <w:p>
             <w:pPr>
               <w:pStyle w:val="Compact"/>
@@ -27795,7 +28279,9 @@
           </w:p>
         </w:tc>
         <w:tc>
-          <w:tcPr/>
+          <w:tcPr>
+            <w:shd w:val="clear" w:color="auto" w:fill="EFEFEF"/>
+          </w:tcPr>
           <w:p>
             <w:pPr>
               <w:pStyle w:val="Compact"/>
@@ -28097,6 +28583,14 @@
         <w:tblW w:type="pct" w:w="5000"/>
         <w:tblLayout w:type="fixed"/>
         <w:tblLook w:firstRow="1" w:lastRow="0" w:firstColumn="0" w:lastColumn="0" w:noHBand="0" w:noVBand="0" w:val="0020"/>
+        <w:tblBorders>
+          <w:top w:val="single" w:sz="4" w:space="0" w:color="000000"/>
+          <w:left w:val="single" w:sz="4" w:space="0" w:color="000000"/>
+          <w:bottom w:val="single" w:sz="4" w:space="0" w:color="000000"/>
+          <w:right w:val="single" w:sz="4" w:space="0" w:color="000000"/>
+          <w:insideH w:val="single" w:sz="4" w:space="0" w:color="000000"/>
+          <w:insideV w:val="single" w:sz="4" w:space="0" w:color="000000"/>
+        </w:tblBorders>
       </w:tblPr>
       <w:tblGrid>
         <w:gridCol w:w="1980"/>
@@ -28109,7 +28603,9 @@
           <w:tblHeader w:val="on"/>
         </w:trPr>
         <w:tc>
-          <w:tcPr/>
+          <w:tcPr>
+            <w:shd w:val="clear" w:color="auto" w:fill="EFEFEF"/>
+          </w:tcPr>
           <w:p>
             <w:pPr>
               <w:pStyle w:val="Compact"/>
@@ -28120,7 +28616,9 @@
           </w:p>
         </w:tc>
         <w:tc>
-          <w:tcPr/>
+          <w:tcPr>
+            <w:shd w:val="clear" w:color="auto" w:fill="EFEFEF"/>
+          </w:tcPr>
           <w:p>
             <w:pPr>
               <w:pStyle w:val="Compact"/>
@@ -28131,7 +28629,9 @@
           </w:p>
         </w:tc>
         <w:tc>
-          <w:tcPr/>
+          <w:tcPr>
+            <w:shd w:val="clear" w:color="auto" w:fill="EFEFEF"/>
+          </w:tcPr>
           <w:p>
             <w:pPr>
               <w:pStyle w:val="Compact"/>
@@ -28142,7 +28642,9 @@
           </w:p>
         </w:tc>
         <w:tc>
-          <w:tcPr/>
+          <w:tcPr>
+            <w:shd w:val="clear" w:color="auto" w:fill="EFEFEF"/>
+          </w:tcPr>
           <w:p>
             <w:pPr>
               <w:pStyle w:val="Compact"/>
@@ -28536,6 +29038,14 @@
         <w:tblW w:type="pct" w:w="5000"/>
         <w:tblLayout w:type="fixed"/>
         <w:tblLook w:firstRow="1" w:lastRow="0" w:firstColumn="0" w:lastColumn="0" w:noHBand="0" w:noVBand="0" w:val="0020"/>
+        <w:tblBorders>
+          <w:top w:val="single" w:sz="4" w:space="0" w:color="000000"/>
+          <w:left w:val="single" w:sz="4" w:space="0" w:color="000000"/>
+          <w:bottom w:val="single" w:sz="4" w:space="0" w:color="000000"/>
+          <w:right w:val="single" w:sz="4" w:space="0" w:color="000000"/>
+          <w:insideH w:val="single" w:sz="4" w:space="0" w:color="000000"/>
+          <w:insideV w:val="single" w:sz="4" w:space="0" w:color="000000"/>
+        </w:tblBorders>
       </w:tblPr>
       <w:tblGrid>
         <w:gridCol w:w="1980"/>
@@ -28548,7 +29058,9 @@
           <w:tblHeader w:val="on"/>
         </w:trPr>
         <w:tc>
-          <w:tcPr/>
+          <w:tcPr>
+            <w:shd w:val="clear" w:color="auto" w:fill="EFEFEF"/>
+          </w:tcPr>
           <w:p>
             <w:pPr>
               <w:pStyle w:val="Compact"/>
@@ -28559,7 +29071,9 @@
           </w:p>
         </w:tc>
         <w:tc>
-          <w:tcPr/>
+          <w:tcPr>
+            <w:shd w:val="clear" w:color="auto" w:fill="EFEFEF"/>
+          </w:tcPr>
           <w:p>
             <w:pPr>
               <w:pStyle w:val="Compact"/>
@@ -28570,7 +29084,9 @@
           </w:p>
         </w:tc>
         <w:tc>
-          <w:tcPr/>
+          <w:tcPr>
+            <w:shd w:val="clear" w:color="auto" w:fill="EFEFEF"/>
+          </w:tcPr>
           <w:p>
             <w:pPr>
               <w:pStyle w:val="Compact"/>
@@ -28581,7 +29097,9 @@
           </w:p>
         </w:tc>
         <w:tc>
-          <w:tcPr/>
+          <w:tcPr>
+            <w:shd w:val="clear" w:color="auto" w:fill="EFEFEF"/>
+          </w:tcPr>
           <w:p>
             <w:pPr>
               <w:pStyle w:val="Compact"/>
@@ -28892,6 +29410,14 @@
         <w:tblW w:type="pct" w:w="5000"/>
         <w:tblLayout w:type="fixed"/>
         <w:tblLook w:firstRow="1" w:lastRow="0" w:firstColumn="0" w:lastColumn="0" w:noHBand="0" w:noVBand="0" w:val="0020"/>
+        <w:tblBorders>
+          <w:top w:val="single" w:sz="4" w:space="0" w:color="000000"/>
+          <w:left w:val="single" w:sz="4" w:space="0" w:color="000000"/>
+          <w:bottom w:val="single" w:sz="4" w:space="0" w:color="000000"/>
+          <w:right w:val="single" w:sz="4" w:space="0" w:color="000000"/>
+          <w:insideH w:val="single" w:sz="4" w:space="0" w:color="000000"/>
+          <w:insideV w:val="single" w:sz="4" w:space="0" w:color="000000"/>
+        </w:tblBorders>
       </w:tblPr>
       <w:tblGrid>
         <w:gridCol w:w="1980"/>
@@ -28904,7 +29430,9 @@
           <w:tblHeader w:val="on"/>
         </w:trPr>
         <w:tc>
-          <w:tcPr/>
+          <w:tcPr>
+            <w:shd w:val="clear" w:color="auto" w:fill="EFEFEF"/>
+          </w:tcPr>
           <w:p>
             <w:pPr>
               <w:pStyle w:val="Compact"/>
@@ -28915,7 +29443,9 @@
           </w:p>
         </w:tc>
         <w:tc>
-          <w:tcPr/>
+          <w:tcPr>
+            <w:shd w:val="clear" w:color="auto" w:fill="EFEFEF"/>
+          </w:tcPr>
           <w:p>
             <w:pPr>
               <w:pStyle w:val="Compact"/>
@@ -28926,7 +29456,9 @@
           </w:p>
         </w:tc>
         <w:tc>
-          <w:tcPr/>
+          <w:tcPr>
+            <w:shd w:val="clear" w:color="auto" w:fill="EFEFEF"/>
+          </w:tcPr>
           <w:p>
             <w:pPr>
               <w:pStyle w:val="Compact"/>
@@ -28937,7 +29469,9 @@
           </w:p>
         </w:tc>
         <w:tc>
-          <w:tcPr/>
+          <w:tcPr>
+            <w:shd w:val="clear" w:color="auto" w:fill="EFEFEF"/>
+          </w:tcPr>
           <w:p>
             <w:pPr>
               <w:pStyle w:val="Compact"/>

</xml_diff>

<commit_message>
memoire: reecriture rythmique Chapitre II + bordures tableaux + Word regenere
- Chap. II : intro II.0 et conclusion II.9 reecrites (run-on casses, rythme varie).
  Matrices de decision II.0.5 et sections techniques gardees (structure de
  tracabilite voulue, pas un tic d'IA).
- build_word.py : bordures noires + en-tete gris sur les 33 tableaux au
  post-traitement (pandoc sort les tableaux sans bordure).
- Word regenere. Fidelite globale OK : 0 "nous" dans le corps (remerciements
  exclus), chiffres/citations/renvois intacts, em-dashes limites aux legendes.

Co-Authored-By: Claude Opus 4.8 <noreply@anthropic.com>
</commit_message>
<xml_diff>
--- a/memoire/Memoire_M2_Corrosion_BATOUMBI.docx
+++ b/memoire/Memoire_M2_Corrosion_BATOUMBI.docx
@@ -2017,7 +2017,7 @@
         <w:pStyle w:val="FirstParagraph"/>
       </w:pPr>
       <w:r>
-        <w:t xml:space="preserve">La maîtrise de la dégradation des équipements conditionne la compétitivité, la sécurité et la durabilité d’une activité industrielle. Les stratégies de maintenance se déplacent peu à peu de l’approche corrective ou préventive systématique vers la maintenance prédictive, qui anticipe la défaillance à partir des données de surveillance (EN 13306 ; ISO 13381-1). La corrosion occupe une place à part parmi les modes de dégradation. Dans le secteur Oil &amp; Gas, elle représente le premier poste de coût mondial, 2,5 billions USD par an, soit environ 3,4 % du PIB (Koch et al., 2016). Elle frappe en priorité les pipelines, exposés à des milieux agressifs et difficiles à inspecter en continu.</w:t>
+        <w:t xml:space="preserve">La maîtrise de la dégradation des équipements conditionne la compétitivité d’une activité industrielle, sa sécurité et sa durabilité. Les stratégies de maintenance l’ont intégré : elles glissent peu à peu de l’approche corrective, ou préventive systématique, vers la maintenance prédictive, celle qui anticipe la défaillance à partir des données de surveillance (EN 13306 ; ISO 13381-1). Parmi les modes de dégradation, la corrosion tient une place à part. Dans l’Oil &amp; Gas, elle est le premier poste de coût au monde : 2,5 billions USD par an, près de 3,4 % du PIB (Koch et al., 2016). Et elle frappe d’abord les pipelines, exposés à des milieux agressifs, difficiles à inspecter en continu.</w:t>
       </w:r>
     </w:p>
     <w:p>
@@ -2025,7 +2025,7 @@
         <w:pStyle w:val="BodyText"/>
       </w:pPr>
       <w:r>
-        <w:t xml:space="preserve">Au Cameroun, la COTCO (pipeline Tchad-Cameroun) surveille déjà la corrosion à l’aide de sondes ER commerciales reliées au DCS. Ces données restent toutefois exploitées à un niveau Industrie 3.0 : seuils fixes, analyse cloisonnée, aucun pronostic. L’hypothèse retenue ici est qu’à partir de ces mesures déjà disponibles, le passage à une couche Industrie 4.0 devient possible. Le prototype proposé se veut doublement transposable, branché sur l’instrumentation existante ou déployé de façon autonome pour une PME. Il couvre la chaîne détection, diagnostic, pronostic, décision, action de la norme ISO 13381-1 au moyen de quatre composants : une sonde ER instrumentée (OS1), un modèle XGBoost prédisant le taux de corrosion et la durée de vie résiduelle (OS2), un module de diagnostic des régimes et des facteurs de variabilité (OS3), enfin l’intégration à un CMMS open-source (OS4).</w:t>
+        <w:t xml:space="preserve">Au Cameroun, la COTCO exploite le pipeline Tchad-Cameroun. Elle y surveille déjà la corrosion, au moyen de sondes ER commerciales reliées au DCS. Mais ces données en restent à l’Industrie 3.0 : des seuils fixes, une analyse cloisonnée, aucun pronostic. Le pari de ce travail est simple. Ces mesures existent déjà ; il devient donc possible d’ajouter par-dessus une couche Industrie 4.0. Le prototype proposé se veut doublement transposable : branché sur l’instrumentation en place, ou déployé seul chez une PME. Dans les deux cas, il couvre la chaîne de la norme ISO 13381-1, de la détection à l’action, au moyen de quatre composants : une sonde ER instrumentée (OS1), un modèle XGBoost qui prédit le taux de corrosion et la durée de vie résiduelle (OS2), un module de diagnostic des régimes et des facteurs de variabilité (OS3), et l’intégration à un CMMS open-source (OS4).</w:t>
       </w:r>
     </w:p>
     <w:p>
@@ -2188,7 +2188,7 @@
         <w:pStyle w:val="FirstParagraph"/>
       </w:pPr>
       <w:r>
-        <w:t xml:space="preserve">Ce chapitre cadre d’abord le contexte et la justification de la recherche selon les six approches recommandées par le protocole de recherche (approche définitionnelle, contexte international et national, état des recherches scientifiques et leurs limites, justificatif normatif et réglementaire, concept dans la zone d’étude, énoncé du sujet). Il formule ensuite la problématique, les objectifs et les questions de recherche associées, puis expose l’importance de l’étude pour les différentes parties prenantes. Le chapitre se clôt par une revue détaillée de la littérature couvrant les mécanismes de corrosion, les méthodes de surveillance, les modèles prédictifs classiques et les approches récentes par apprentissage automatique.</w:t>
+        <w:t xml:space="preserve">Ce chapitre pose le décor. Il cadre d’abord le contexte et la justification de la recherche, selon les six approches du protocole de recherche : approche définitionnelle, contexte international et national, état des recherches scientifiques et leurs limites, justificatif normatif et réglementaire, concept dans la zone d’étude, énoncé du sujet. Viennent ensuite la problématique, les objectifs et les questions de recherche, puis l’importance de l’étude pour ses différentes parties prenantes. Une revue de la littérature ferme le chapitre : mécanismes de corrosion, méthodes de surveillance, modèles prédictifs classiques, approches récentes par apprentissage automatique.</w:t>
       </w:r>
     </w:p>
     <w:p>
@@ -2222,7 +2222,7 @@
         <w:pStyle w:val="FirstParagraph"/>
       </w:pPr>
       <w:r>
-        <w:t xml:space="preserve">La corrosion est définie par la norme ISO 8044 :2024 comme « une interaction physico-chimique entre un métal et son environnement qui entraîne des modifications des propriétés du métal et qui peut conduire à une dégradation significative de la fonction du métal, de l’environnement ou du système technique dont ils font partie » (ISO, 2024). Ce phénomène naturel et thermodynamiquement spontané traduit la tendance des métaux à retourner à leur état d’oxyde stable, l’état sous lequel ils existent dans la croûte terrestre avant tout traitement métallurgique (Schweitzer, 2010).</w:t>
+        <w:t xml:space="preserve">La norme ISO 8044 :2024 définit la corrosion comme « une interaction physico-chimique entre un métal et son environnement qui entraîne des modifications des propriétés du métal et qui peut conduire à une dégradation significative de la fonction du métal, de l’environnement ou du système technique dont ils font partie » (ISO, 2024). Le phénomène est naturel, thermodynamiquement spontané. Il traduit la tendance des métaux à revenir à leur état d’oxyde stable, celui sous lequel ils existent dans la croûte terrestre avant tout traitement métallurgique (Schweitzer, 2010).</w:t>
       </w:r>
     </w:p>
     <w:p>
@@ -2230,7 +2230,7 @@
         <w:pStyle w:val="BodyText"/>
       </w:pPr>
       <w:r>
-        <w:t xml:space="preserve">L’étude scientifique de la corrosion remonte aux travaux fondateurs de Michael Faraday (1834), qui établit la relation quantitative entre le courant électrique et la masse de métal dissous, posant ainsi les bases de l’électrochimie de la corrosion (Faraday, 1834). Au XXᵉ siècle, Wagner et Traud (1938) formalisent la théorie des électrodes mixtes et de la cinétique électrochimique, permettant de modéliser quantitativement la vitesse de corrosion à partir des courbes de polarisation. Le modèle semi-empirique de de Waard et Milliams (1975), développé pour la prédiction de la corrosion CO₂ dans les pipelines pétroliers, devient la référence industrielle mondiale (de Waard et Milliams, 1975 ; de Waard, Lotz et Milliams, 1991).</w:t>
+        <w:t xml:space="preserve">L’étude scientifique de la corrosion remonte à Michael Faraday. En 1834, il établit la relation quantitative entre le courant électrique et la masse de métal dissoute, et pose les bases de l’électrochimie de la corrosion (Faraday, 1834). Un siècle plus tard, Wagner et Traud (1938) formalisent la théorie des électrodes mixtes et la cinétique électrochimique, ce qui permet de modéliser la vitesse de corrosion à partir des courbes de polarisation. Puis vient le modèle semi-empirique de de Waard et Milliams (1975), conçu pour la corrosion CO₂ des pipelines pétroliers ; il s’imposera comme la référence industrielle mondiale (de Waard et Milliams, 1975 ; de Waard, Lotz et Milliams, 1991).</w:t>
       </w:r>
     </w:p>
     <w:p>
@@ -2238,7 +2238,7 @@
         <w:pStyle w:val="BodyText"/>
       </w:pPr>
       <w:r>
-        <w:t xml:space="preserve">La maintenance industrielle, quant à elle, a connu une évolution parallèle. La norme EN 13306 :2017 définit la maintenance prédictive comme une « maintenance conditionnelle effectuée en suivant les prévisions extrapolées de l’analyse et de l’évaluation de paramètres significatifs de la dégradation du bien » (CEN, 2017). La norme ISO 13381-1 :2025 précise quant à elle les principes du pronostic et de l’estimation de la durée de vie résiduelle (RUL) à partir des données de surveillance (ISO, 2025). C’est précisément à l’intersection de ces deux normes que se positionne ce travail : instrumenter pour mesurer, mesurer pour prédire, prédire pour intervenir.</w:t>
+        <w:t xml:space="preserve">La maintenance industrielle a suivi un chemin parallèle. La norme EN 13306 :2017 définit la maintenance prédictive comme une « maintenance conditionnelle effectuée en suivant les prévisions extrapolées de l’analyse et de l’évaluation de paramètres significatifs de la dégradation du bien » (CEN, 2017) ; l’ISO 13381-1 :2025, elle, précise les principes du pronostic et de l’estimation de la durée de vie résiduelle (RUL) à partir des données de surveillance (ISO, 2025). Ce travail se loge exactement à leur intersection : instrumenter pour mesurer, mesurer pour prédire, prédire pour intervenir.</w:t>
       </w:r>
     </w:p>
     <w:bookmarkEnd w:id="29"/>
@@ -2256,7 +2256,7 @@
         <w:pStyle w:val="FirstParagraph"/>
       </w:pPr>
       <w:r>
-        <w:t xml:space="preserve">À l’échelle mondiale, l’étude IMPACT (International Measures of Prevention, Application and Economics of Corrosion Technology) publiée par la NACE en 2016 estime le coût annuel global de la corrosion à 2,5 billions USD, soit environ 3,4 % du PIB mondial (Koch et al., 2016 ; NACE, 2016). L’étude conclut également que la mise en œuvre de bonnes pratiques de gestion de la corrosion permettrait d’économiser entre 15 % et 35 % de ce montant, soit 375 à 875 milliards USD par an. Dans le seul secteur Oil &amp; Gas, les pertes annuelles imputables à la corrosion sont estimées entre 1,3 et 1,8 milliard USD (Koch et al., 2016 ; Inspectioneering, 2016). Ces chiffres représentent une opportunité directe d’économies si des stratégies de surveillance et de prédiction efficaces sont déployées.</w:t>
+        <w:t xml:space="preserve">À l’échelle mondiale, l’étude IMPACT (International Measures of Prevention, Application and Economics of Corrosion Technology), publiée par la NACE en 2016, chiffre le coût annuel de la corrosion à 2,5 billions USD, environ 3,4 % du PIB mondial (Koch et al., 2016 ; NACE, 2016). Le même travail estime que de bonnes pratiques de gestion en économiseraient entre 15 % et 35 %, soit 375 à 875 milliards USD par an. Pour le seul Oil &amp; Gas, les pertes annuelles imputables à la corrosion se situent entre 1,3 et 1,8 milliard USD (Koch et al., 2016 ; Inspectioneering, 2016). Autant d’économies à portée de main, pour peu qu’on déploie des stratégies de surveillance et de prédiction efficaces.</w:t>
       </w:r>
     </w:p>
     <w:p>
@@ -2264,7 +2264,7 @@
         <w:pStyle w:val="BodyText"/>
       </w:pPr>
       <w:r>
-        <w:t xml:space="preserve">En Afrique subsaharienne, la problématique est amplifiée par plusieurs facteurs : (i) des conditions climatiques tropicales (humidité élevée, températures &gt; 28 °C) qui accélèrent la corrosion atmosphérique ; (ii) la difficulté d’accès à certains équipements (forêt équatoriale, zones marécageuses, sections offshore) ; (iii) l’instabilité politique et le vandalisme dans certaines régions (Pumps Africa, 2024). Les opérateurs africains du secteur Oil &amp; Gas doivent ainsi composer avec des budgets contraints et des chaînes d’approvisionnement plus longues que leurs homologues occidentaux pour les pièces de rechange et les équipements d’inspection (Egbule et al., 2018 ; Onyebuchi et al., 2018).</w:t>
+        <w:t xml:space="preserve">En Afrique subsaharienne, le problème est amplifié par plusieurs facteurs : (i) un climat tropical (humidité élevée, températures &gt; 28 °C) qui accélère la corrosion atmosphérique ; (ii) la difficulté d’accès à certains équipements (forêt équatoriale, zones marécageuses, sections offshore) ; (iii) l’instabilité politique et le vandalisme dans certaines régions (Pumps Africa, 2024). Les opérateurs africains du secteur composent en outre avec des budgets contraints et des chaînes d’approvisionnement plus longues que celles de leurs homologues occidentaux, qu’il s’agisse de pièces de rechange ou d’équipements d’inspection (Egbule et al., 2018 ; Onyebuchi et al., 2018).</w:t>
       </w:r>
     </w:p>
     <w:p>
@@ -2272,7 +2272,7 @@
         <w:pStyle w:val="BodyText"/>
       </w:pPr>
       <w:r>
-        <w:t xml:space="preserve">Au Cameroun, le secteur pétrolier représente une part significative des recettes publiques et du PIB national. La Cameroon Oil Transportation Company (COTCO) exploite depuis 2003 le Système d’Exportation Tchadien (SET), composé d’un pipeline de 1 070 km au total dont 903 km en territoire camerounais, d’une station de tête à Komé, et d’un terminal offshore à Kribi (Kome Kribi 1 FSO) relié à la côte par un pipeline sous-marin de 11 km (COTCO, 2024 ; Chad-Cameroon Pipeline Project, 2024 ; ExxonMobil, 2011). La capacité nominale est de 225 000 barils par jour. Cette infrastructure traverse des zones de forêt équatoriale dense, franchit de nombreux cours d’eau et longe des zones habitées, rendant toute défaillance non anticipée potentiellement catastrophique sur les plans humain, environnemental et économique.</w:t>
+        <w:t xml:space="preserve">Au Cameroun, le secteur pétrolier pèse lourd dans les recettes publiques et le PIB. Depuis 2003, la Cameroon Oil Transportation Company (COTCO) exploite le Système d’Exportation Tchadien (SET) : un pipeline de 1 070 km au total, dont 903 km en territoire camerounais, une station de tête à Komé et un terminal offshore à Kribi (Kome Kribi 1 FSO), relié à la côte par 11 km de pipeline sous-marin (COTCO, 2024 ; Chad-Cameroon Pipeline Project, 2024 ; ExxonMobil, 2011). Sa capacité nominale atteint 225 000 barils par jour. L’ouvrage traverse de la forêt équatoriale dense, franchit de nombreux cours d’eau, longe des zones habitées : la moindre défaillance non anticipée peut y tourner à la catastrophe, sur le plan humain, environnemental et économique.</w:t>
       </w:r>
     </w:p>
     <w:bookmarkEnd w:id="30"/>
@@ -2290,7 +2290,7 @@
         <w:pStyle w:val="FirstParagraph"/>
       </w:pPr>
       <w:r>
-        <w:t xml:space="preserve">La recherche sur la prédiction de la corrosion par apprentissage automatique a connu une accélération significative depuis 2018, avec une production scientifique en croissance exponentielle (Coelho, 2022 ; npj Materials Degradation, 2022). Les approches les plus utilisées dans la littérature récente incluent :</w:t>
+        <w:t xml:space="preserve">La recherche sur la prédiction de la corrosion par apprentissage automatique s’est emballée depuis 2018 ; la production scientifique y croît de façon exponentielle (Coelho, 2022 ; npj Materials Degradation, 2022). Les approches les plus fréquentes dans les travaux récents sont les suivantes :</w:t>
       </w:r>
     </w:p>
     <w:p>
@@ -2604,7 +2604,7 @@
         <w:pStyle w:val="FirstParagraph"/>
       </w:pPr>
       <w:r>
-        <w:t xml:space="preserve">L’ensemble de ce corpus normatif établit le cadre dans lequel s’inscrit toute démarche de surveillance de la corrosion sur le territoire camerounais. Le présent travail contribue à ce cadre en proposant un outil aligné sur les principes de l’ASTM G96 (mesure ER continue) et de l’ISO 13381-1 (pronostic et RUL).</w:t>
+        <w:t xml:space="preserve">Ce corpus fixe le cadre de toute démarche de surveillance de la corrosion sur le territoire camerounais. Le présent travail s’y inscrit, avec un outil aligné sur l’ASTM G96 (mesure ER continue) et l’ISO 13381-1 (pronostic et RUL).</w:t>
       </w:r>
     </w:p>
     <w:bookmarkEnd w:id="32"/>
@@ -2746,7 +2746,7 @@
         <w:pStyle w:val="FirstParagraph"/>
       </w:pPr>
       <w:r>
-        <w:t xml:space="preserve">Important : COTCO dispose déjà d’une surveillance ER active. Sur les sections critiques du SET, des sondes ER commerciales (Cosasco, Emerson Roxar) ainsi que des sondes LPR sont câblées vers le DCS (</w:t>
+        <w:t xml:space="preserve">Un point mérite d’être souligné : COTCO dispose déjà d’une surveillance ER active. Sur les sections critiques du SET, des sondes ER commerciales (Cosasco, Emerson Roxar) et des sondes LPR sont câblées vers le DCS (</w:t>
       </w:r>
       <w:r>
         <w:rPr>
@@ -2756,7 +2756,7 @@
         <w:t xml:space="preserve">Distributed Control System</w:t>
       </w:r>
       <w:r>
-        <w:t xml:space="preserve">) de la station de Komé et vers la salle de contrôle de Kribi. Ces sondes produisent un flux continu de mesures de résistance et de variables de procédé associées (température, pression, débit). Cependant, l’exploitation de ces données reste à un niveau Industrie 3.0, dont les caractéristiques sont les suivantes (Lasi et al., 2014 ; Lu, 2017 ; Xu et al., 2018) :</w:t>
+        <w:t xml:space="preserve">) de la station de Komé et vers la salle de contrôle de Kribi. Elles produisent un flux continu de mesures de résistance et de variables de procédé : température, pression, débit. Mais l’exploitation de ces données plafonne à l’Industrie 3.0, dont voici les traits (Lasi et al., 2014 ; Lu, 2017 ; Xu et al., 2018) :</w:t>
       </w:r>
     </w:p>
     <w:p>
@@ -2953,7 +2953,7 @@
         <w:pStyle w:val="FirstParagraph"/>
       </w:pPr>
       <w:r>
-        <w:t xml:space="preserve">Le verrou n’est donc plus l’instrumentation (déjà en place et performante), mais l’intelligence applicative : ajouter au-dessus du flux ER existant une couche d’apprentissage automatique capable de corréler résistance / température / temps, de prédire CR + RUL, et d’orchestrer les ordres de travail via une GMAO interconnectée. C’est précisément la transition Industrie 3.0 → Industrie 4.0 que ce mémoire propose d’opérer.</w:t>
+        <w:t xml:space="preserve">Le verrou n’est donc plus l’instrumentation, déjà en place et performante, mais l’intelligence applicative : ajouter au flux ER existant une couche d’apprentissage automatique, capable de corréler résistance, température et temps, de prédire CR et RUL, et d’orchestrer les ordres de travail via une GMAO interconnectée. C’est la transition Industrie 3.0 vers 4.0 que ce mémoire entreprend.</w:t>
       </w:r>
     </w:p>
     <w:bookmarkEnd w:id="33"/>
@@ -2971,7 +2971,7 @@
         <w:pStyle w:val="FirstParagraph"/>
       </w:pPr>
       <w:r>
-        <w:t xml:space="preserve">Sur la base du contexte exposé, ampleur économique mondiale de la corrosion, lacunes scientifiques persistantes (sous-exploitation des historiques ER, absence de prédiction CR + RUL combinée, absence de chaîne décision → action structurée), maturité numérique limitée à l’Industrie 3.0 chez la plupart des opérateurs subsahariens dont COTCO, cadre normatif et réglementaire, le sujet de ce mémoire est formulé comme suit :</w:t>
+        <w:t xml:space="preserve">Le contexte est désormais posé : ampleur économique mondiale de la corrosion, lacunes scientifiques tenaces (historiques ER sous-exploités, pas de prédiction CR + RUL combinée, pas de chaîne décision → action structurée), maturité numérique bloquée à l’Industrie 3.0 chez la plupart des opérateurs subsahariens, COTCO compris, et cadre normatif contraignant. De là, le sujet du mémoire :</w:t>
       </w:r>
     </w:p>
     <w:p>
@@ -3037,7 +3037,7 @@
         <w:pStyle w:val="FirstParagraph"/>
       </w:pPr>
       <w:r>
-        <w:t xml:space="preserve">La maintenance des infrastructures de transport pétrolier au Cameroun, et plus particulièrement chez COTCO, fait face à un paradoxe fondamental : les opérateurs disposent déjà d’un flux continu de données de surveillance produit par les sondes ER et LPR commerciales câblées au DCS (Cosasco, Emerson Roxar), complété par des inspections UT périodiques, des rapports de laboratoire et des journaux d’injection d’inhibiteurs. Pourtant, ces données, d’une grande richesse informationnelle, ne sont ni corrélées algorithmiquement aux variables de procédé (température, pression, débit), ni exploitées par des modèles prédictifs de durée de vie résiduelle, ni reliées à la GMAO de l’opérateur (SAP chez COTCO) pour déclencher et tracer automatiquement les actions correctives issues d’une prédiction. Le verrou n’est donc plus l’instrumentation, mais bien l’intelligence applicative au-dessus du flux existant. Ce paradoxe correspond exactement à la frontière Industrie 3.0 / Industrie 4.0 identifiée dans la littérature de la transformation numérique industrielle (Lasi et al., 2014 ; Lu, 2017 ; Xu et al., 2018) : les machines mesurent, mais les données ne « parlent » pas entre elles, et la chaîne décision-action reste à dominante humaine.</w:t>
+        <w:t xml:space="preserve">La maintenance des infrastructures de transport pétrolier au Cameroun, chez COTCO en particulier, bute sur un paradoxe. Les opérateurs disposent déjà d’un flux continu de surveillance : sondes ER et LPR commerciales câblées au DCS (Cosasco, Emerson Roxar), inspections UT périodiques, rapports de laboratoire, journaux d’injection d’inhibiteurs. Ces données sont riches. Pourtant, elles ne sont ni corrélées algorithmiquement aux variables de procédé (température, pression, débit), ni passées au crible de modèles prédictifs de durée de vie, ni reliées à la GMAO de l’opérateur (SAP chez COTCO) pour déclencher et tracer automatiquement les actions issues d’une prédiction. Le verrou, une fois encore, n’est pas l’instrumentation mais l’intelligence applicative posée au-dessus du flux. On retrouve là, exactement, la frontière Industrie 3.0 / Industrie 4.0 décrite dans la littérature de la transformation numérique (Lasi et al., 2014 ; Lu, 2017 ; Xu et al., 2018) : les machines mesurent, mais les données ne se parlent pas, et la chaîne décision-action reste largement humaine.</w:t>
       </w:r>
     </w:p>
     <w:p>
@@ -3045,7 +3045,7 @@
         <w:pStyle w:val="BodyText"/>
       </w:pPr>
       <w:r>
-        <w:t xml:space="preserve">Sur le plan scientifique, les modèles physiques classiques de prédiction de la corrosion (modèle de de Waard et Milliams, modèle NORSOK M-506) ont montré des limites importantes en conditions d’exploitation réelle, avec des erreurs systématiques de 40 à 60 % attribuables à la non-prise en compte des interactions complexes entre les multiples composants des fluides de procédé (de Waard et Milliams, 1975 ; Coelho, 2022). Les approches par apprentissage automatique offrent une alternative prometteuse, capable de capturer ces non-linéarités, mais leur déploiement en contexte africain se heurte à plusieurs verrous : (i) l’absence de données d’entraînement locales, (ii) l’absence de protocoles</w:t>
+        <w:t xml:space="preserve">Les modèles physiques classiques (de Waard et Milliams, NORSOK M-506) atteignent vite leurs limites en exploitation réelle : des erreurs systématiques de 40 à 60 %, faute de prendre en compte les interactions complexes entre les composants des fluides de procédé (de Waard et Milliams, 1975 ; Coelho, 2022). L’apprentissage automatique offre une alternative crédible, capable de capturer ces non-linéarités. Mais son déploiement en contexte africain se heurte à trois verrous : l’absence de données d’entraînement locales, l’absence de protocoles</w:t>
       </w:r>
       <w:r>
         <w:t xml:space="preserve"> </w:t>
@@ -3061,7 +3061,7 @@
         <w:t xml:space="preserve"> </w:t>
       </w:r>
       <w:r>
-        <w:t xml:space="preserve">publiés permettant la prédiction conjointe CR + RUL, et (iii) la rareté des plateformes intégrées prouvant la chaîne complète de la mesure jusqu’à l’ordre de travail.</w:t>
+        <w:t xml:space="preserve">publiés pour la prédiction conjointe CR + RUL, et la rareté des plateformes intégrées qui prouvent la chaîne complète, de la mesure à l’ordre de travail.</w:t>
       </w:r>
     </w:p>
     <w:p>
@@ -3069,7 +3069,7 @@
         <w:pStyle w:val="BodyText"/>
       </w:pPr>
       <w:r>
-        <w:t xml:space="preserve">Sur le plan algorithmique, la grande majorité des travaux ML sur la corrosion se limitent à la prédiction instantanée du taux de corrosion, sans extrapolation explicite vers la durée de vie résiduelle (RUL), pourtant définie de manière claire par la norme ISO 13381-1 (ISO, 2025 ; Akash, 2024). Cette absence de double prédiction CR + RUL prive les opérateurs d’une information essentielle à la planification optimisée des interventions.</w:t>
+        <w:t xml:space="preserve">S’y ajoute un biais algorithmique. La grande majorité des travaux ML sur la corrosion s’arrêtent au taux de corrosion instantané, sans extrapoler vers la durée de vie résiduelle (RUL), pourtant clairement définie par l’ISO 13381-1 (ISO, 2025 ; Akash, 2024). Sans cette double prédiction CR + RUL, l’opérateur est privé d’une information décisive pour planifier ses interventions.</w:t>
       </w:r>
     </w:p>
     <w:p>
@@ -3077,7 +3077,7 @@
         <w:pStyle w:val="BodyText"/>
       </w:pPr>
       <w:r>
-        <w:t xml:space="preserve">Sur le plan applicatif, l’opérateur COTCO et la plupart des PME industrielles africaines partagent un même besoin : se doter d’une boucle décision → action structurée qui exploite les sorties prédictives pour générer automatiquement les ordres de travail, tracer les interventions et calculer les KPIs maintenance (MTBF, MTTR, disponibilité). Le marché GMAO est dominé par des solutions propriétaires (SAP PM, IBM Maximo, Mainpac) dont les coûts de licence (souvent supérieurs à 10 000 USD par site et par an) sont incompatibles avec les budgets de la plupart des opérateurs subsahariens et de l’ensemble des PME industrielles. Une alternative open-source intégrée est donc à construire.</w:t>
+        <w:t xml:space="preserve">Côté applicatif, COTCO et la plupart des PME industrielles africaines partagent un même besoin : une boucle décision → action structurée, qui exploite les sorties prédictives pour générer les ordres de travail, tracer les interventions et calculer les KPI de maintenance (MTBF, MTTR, disponibilité). Or le marché de la GMAO est tenu par des solutions propriétaires (SAP PM, IBM Maximo, Mainpac) dont les licences, souvent au-delà de 10 000 USD par site et par an, dépassent les budgets de la plupart des opérateurs subsahariens et de toutes les PME. Une alternative open-source intégrée reste à bâtir.</w:t>
       </w:r>
     </w:p>
     <w:p>
@@ -3085,7 +3085,7 @@
         <w:pStyle w:val="BodyText"/>
       </w:pPr>
       <w:r>
-        <w:t xml:space="preserve">Enfin, sur le plan expérimental, peu d’études disposent d’un protocole</w:t>
+        <w:t xml:space="preserve">Reste enfin la question expérimentale. Peu d’études s’appuient sur un protocole</w:t>
       </w:r>
       <w:r>
         <w:t xml:space="preserve"> </w:t>
@@ -3101,7 +3101,7 @@
         <w:t xml:space="preserve"> </w:t>
       </w:r>
       <w:r>
-        <w:t xml:space="preserve">(RTF) complet permettant de couvrir l’intégralité du cycle de dégradation depuis l’état initial jusqu’à la rupture mécanique. Or seul un protocole RTF permet de constituer un jeu d’apprentissage statistiquement représentatif pour une prédiction RUL fiable.</w:t>
+        <w:t xml:space="preserve">(RTF) complet, capable de suivre tout le cycle de dégradation, de l’état initial à la rupture mécanique. C’est pourtant le seul moyen de constituer un jeu d’apprentissage représentatif pour une prédiction RUL fiable.</w:t>
       </w:r>
     </w:p>
     <w:p>
@@ -6510,7 +6510,7 @@
         <w:pStyle w:val="FirstParagraph"/>
       </w:pPr>
       <w:r>
-        <w:t xml:space="preserve">Ce premier chapitre a permis de poser les bases théoriques, normatives et contextuelles du présent travail. La revue de la littérature a établi les mécanismes électrochimiques de la corrosion, les méthodes de surveillance disponibles, les limites des modèles prédictifs classiques, l’état de l’art récent sur l’apprentissage automatique appliqué à la corrosion (XGBoost, SHAP, RUL), ainsi que le cadre conceptuel Industrie 3.0 / Industrie 4.0 (Lasi et al., 2014 ; Lu, 2017 ; Xu et al., 2018). Le contexte international (étude IMPACT NACE, 2,5 billions USD/an), national (cadre normatif camerounais) et zonal (réseau COTCO Tchad-Cameroun) a mis en évidence que l’instrumentation ER existe déjà chez les opérateurs majeurs comme COTCO, mais que son exploitation reste limitée à un niveau Industrie 3.0. Le besoin opérationnel n’est donc pas la sonde ER en tant que telle, mais bien l’intelligence applicative, la couche prédictive et la chaîne décision-action, qui caractérise la transition Industrie 4.0. La problématique, les objectifs spécifiques et les questions de recherche ont été formulés en cohérence avec ce besoin. Le Chapitre II présente à présent les outils et la méthodologie retenus pour répondre à ces objectifs, en commençant par une justification des choix technologiques.</w:t>
+        <w:t xml:space="preserve">Ce premier chapitre a posé les bases théoriques, normatives et contextuelles du travail. La revue de littérature a rappelé les mécanismes électrochimiques de la corrosion, les méthodes de surveillance disponibles, les limites des modèles prédictifs classiques, l’état de l’art récent sur l’apprentissage automatique appliqué à la corrosion (XGBoost, SHAP, RUL), et le cadre Industrie 3.0 / Industrie 4.0 (Lasi et al., 2014 ; Lu, 2017 ; Xu et al., 2018). Le contexte, lui, tient en trois échelles. À l’international, l’étude IMPACT de la NACE chiffre le coût de la corrosion à 2,5 billions USD par an. Au national, un cadre normatif camerounais l’encadre. Sur le terrain, enfin, le réseau COTCO Tchad-Cameroun montre que l’instrumentation ER équipe déjà les grands opérateurs, mais qu’elle plafonne à l’Industrie 3.0. Le besoin n’est donc pas la sonde ER elle-même : c’est l’intelligence applicative posée par-dessus, la couche prédictive et la chaîne décision-action, marque de la transition 4.0. Problématique, objectifs et questions de recherche ont été formulés dans ce sens. Le Chapitre II présente à présent les outils et la méthode retenus, à commencer par la justification des choix technologiques.</w:t>
       </w:r>
     </w:p>
     <w:p>
@@ -6690,7 +6690,7 @@
         <w:pStyle w:val="FirstParagraph"/>
       </w:pPr>
       <w:r>
-        <w:t xml:space="preserve">Dans ce chapitre, il sera question de présenter (i) la justification des choix technologiques mobilisés à chaque étage du prototype (matrice de décision pour chaque brique : microcontrôleur, amplificateur, capteur de température, méthode de mesure de la corrosion, algorithme ML, méthode de validation, frontend, CMMS), (ii) le cadre institutionnel et physique de l’étude, (iii) l’architecture du prototype de sonde ER développé (description et principe de fonctionnement), (iv) l’ensemble des matériels mobilisés, (v) les méthodes d’acquisition et de traitement des données, (vi) la méthodologie d’entraînement du modèle XGBoost (validation</w:t>
+        <w:t xml:space="preserve">Ce chapitre présente le prototype et la méthode. Il s’ouvre sur la justification des choix technologiques, étage par étage : une matrice de décision pour chaque brique (microcontrôleur, amplificateur, capteur de température, méthode de mesure de la corrosion, algorithme ML, méthode de validation, frontend, CMMS). Viennent ensuite le cadre institutionnel et physique de l’étude, l’architecture de la sonde ER développée et son principe, les matériels mobilisés, les méthodes d’acquisition et de traitement des données, la méthodologie d’entraînement du modèle XGBoost (validation</w:t>
       </w:r>
       <w:r>
         <w:t xml:space="preserve"> </w:t>
@@ -6703,7 +6703,7 @@
         <w:t xml:space="preserve">leave-one-run-out</w:t>
       </w:r>
       <w:r>
-        <w:t xml:space="preserve">, hyperparamètres, interprétabilité SHAP), (vii) le protocole expérimental</w:t>
+        <w:t xml:space="preserve">, hyperparamètres, interprétabilité SHAP), le protocole</w:t>
       </w:r>
       <w:r>
         <w:t xml:space="preserve"> </w:t>
@@ -6719,7 +6719,7 @@
         <w:t xml:space="preserve"> </w:t>
       </w:r>
       <w:r>
-        <w:t xml:space="preserve">en série répétée, la boucle décision → action par module GMAO maison (transposable à un CMMS open-source), et (viii) le tableau synoptique de la démarche méthodologique.</w:t>
+        <w:t xml:space="preserve">en série répétée, la boucle décision → action par module GMAO maison (transposable à un CMMS open-source), enfin le tableau synoptique de la démarche.</w:t>
       </w:r>
     </w:p>
     <w:p>
@@ -19224,7 +19224,7 @@
         <w:pStyle w:val="FirstParagraph"/>
       </w:pPr>
       <w:r>
-        <w:t xml:space="preserve">Ce chapitre a présenté l’ensemble des outils et de la méthodologie retenus pour répondre aux quatre objectifs spécifiques du mémoire. Une §II.0.5 dédiée à la justification des choix technologiques a consolidé les arbitrages techniques (microcontrôleur ESP32, amplificateur HX711, capteur DS18B20, méthode ER, algorithme XGBoost, stratégie de validation, frontend Streamlit, GMAO maison) sous forme de matrices de décision. Le prototype de sonde ER (montage de mesure de résistance + HX711 + ESP32 en acquisition continue 30 s) a ensuite été décrit dans son principe physique et son implémentation matérielle. Les matériels électroniques, chimiques et logiciels mobilisés ont été consolidés en tableaux récapitulatifs. Les méthodes d’acquisition, de nettoyage, de compensation thermique, de feature engineering, d’entraînement XGBoost et d’interprétabilité SHAP ont été détaillées, ainsi que le module de diagnostic des régimes de corrosion et la stratégie de validation</w:t>
+        <w:t xml:space="preserve">Ce chapitre a présenté les outils et la méthode retenus pour les quatre objectifs du mémoire. La §II.0.5 a d’abord consolidé les arbitrages techniques sous forme de matrices de décision : microcontrôleur ESP32, amplificateur HX711, capteur DS18B20, méthode ER, algorithme XGBoost, stratégie de validation, frontend Streamlit, GMAO maison. Le prototype de sonde ER, montage de mesure de résistance couplé au HX711 et à l’ESP32 en acquisition continue au pas de 30 s, a ensuite été décrit dans son principe et son implémentation. Les matériels électroniques, chimiques et logiciels ont été récapitulés en tableaux. Ont suivi les méthodes d’acquisition, de nettoyage, de compensation thermique et de feature engineering, l’entraînement XGBoost et l’interprétabilité SHAP, le module de diagnostic des régimes et la validation</w:t>
       </w:r>
       <w:r>
         <w:t xml:space="preserve"> </w:t>
@@ -19237,7 +19237,7 @@
         <w:t xml:space="preserve">leave-one-run-out</w:t>
       </w:r>
       <w:r>
-        <w:t xml:space="preserve">. La boucle décision → action par un module GMAO maison (Streamlit / Supabase ; la matrice comparative des CMMS open-source motivant le recours à ce module faute d’API exploitable en version gratuite ; mapping prédiction ML → ordre de travail ; KPIs maintenance) a été présentée, son architecture restant transposable à un CMMS open-source. Le protocole expérimental</w:t>
+        <w:t xml:space="preserve">. La boucle décision → action repose sur un module GMAO maison (Streamlit et Supabase) : faute d’API exploitable en version gratuite chez les CMMS open-source, ce module prend le relais, avec son mapping prédiction ML → ordre de travail et ses KPI de maintenance ; son architecture reste transposable. Restaient le protocole</w:t>
       </w:r>
       <w:r>
         <w:t xml:space="preserve"> </w:t>
@@ -19253,7 +19253,7 @@
         <w:t xml:space="preserve"> </w:t>
       </w:r>
       <w:r>
-        <w:t xml:space="preserve">en série répétée et le tableau synoptique de la démarche ont été présentés. Le Chapitre III présente à présent les résultats issus de la mise en œuvre de cette méthodologie, leur analyse et leur discussion.</w:t>
+        <w:t xml:space="preserve">en série répétée et le tableau synoptique de la démarche, eux aussi exposés. Le Chapitre III présente à présent les résultats, leur analyse et leur discussion.</w:t>
       </w:r>
     </w:p>
     <w:p>
@@ -19405,7 +19405,7 @@
         <w:pStyle w:val="FirstParagraph"/>
       </w:pPr>
       <w:r>
-        <w:t xml:space="preserve">Dans ce chapitre, il sera question de présenter (i) la validation métrologique de la sonde ER (OS1), (ii) les résultats de la série d’essais run-to-failure (OS2), (iii) l’effet de la température et la performance du modèle XGBoost en validation inter-essais (OS2/OS3), (iv) le diagnostic des régimes de corrosion et l’analyse des facteurs de variabilité conditionnant la fiabilité de la prédiction (OS3), (v) la démonstration de l’intégration Streamlit ↔ CMMS open-source (OS4), puis de discuter ces résultats au regard des objectifs initiaux et de la littérature (Chapitre I).</w:t>
+        <w:t xml:space="preserve">Ce chapitre présente les résultats, puis les met en discussion. Il déroule la validation métrologique de la sonde ER (OS1), la série d’essais run-to-failure (OS2), l’effet de la température et la performance du modèle XGBoost en validation inter-essais (OS2/OS3), le diagnostic des régimes et l’analyse des facteurs qui conditionnent la fiabilité de la prédiction (OS3), puis la démonstration de la boucle Streamlit ↔ CMMS open-source (OS4). Ces résultats sont ensuite confrontés aux objectifs de départ et à la littérature du Chapitre I.</w:t>
       </w:r>
     </w:p>
     <w:p>
@@ -21796,7 +21796,7 @@
         <w:pStyle w:val="FirstParagraph"/>
       </w:pPr>
       <w:r>
-        <w:t xml:space="preserve">Au-delà de la température, deux essais se sont révélés imprédictibles par le modèle malgré une plage thermique a priori couverte. Leur analyse, loin d’être un échec, isole expérimentalement deux facteurs de variabilité qu’il faut contrôler. Cette démarche relève du contrôle des variables propre au plan d’expériences (Montgomery, 2017) : en ne laissant dériver qu’un seul facteur à la fois, chaque contre-exemple en isole l’effet, ce qui fonde la stratégie de « vitrine 30 °C » (conditions maîtrisées et répétées) opposée aux contre-exemples.</w:t>
+        <w:t xml:space="preserve">Au-delà de la température, deux essais ont résisté au modèle, malgré une plage thermique a priori couverte. Leur analyse n’est pas un constat d’échec : elle isole expérimentalement deux facteurs de variabilité à contrôler. La démarche relève du contrôle des variables propre au plan d’expériences (Montgomery, 2017) : en ne laissant dériver qu’un facteur à la fois, chaque contre-exemple en isole l’effet. C’est ce qui fonde la stratégie de « vitrine 30 °C », des conditions maîtrisées et répétées, opposée à ces contre-exemples.</w:t>
       </w:r>
     </w:p>
     <w:p>
@@ -22510,7 +22510,7 @@
         <w:pStyle w:val="FirstParagraph"/>
       </w:pPr>
       <w:r>
-        <w:t xml:space="preserve">Les sondes ER commerciales (Cosasco, Emerson Roxar, Permasense) offrent une résolution et un durcissement industriels supérieurs, mais restent coûteuses et exploitées à un niveau Industrie 3.0 (seuils fixes, analyse silotée). Le prototype développé ici, à partir de composants accessibles localement, démontre qu’une couche prédictive (I4.0) peut être ajoutée pour un coût marginal : il ne s’agit pas de remplacer les sondes commerciales mais de brancher en aval une chaîne ML, saut essentiellement logiciel.</w:t>
+        <w:t xml:space="preserve">Les sondes ER commerciales (Cosasco, Emerson Roxar, Permasense) restent une référence : meilleure résolution, durcissement industriel. Mais elles coûtent cher, et la plupart des sites les exploitent encore en Industrie 3.0, avec des seuils fixes et une analyse cloisonnée. Le prototype décrit ici part de composants trouvables localement. Il ne cherche pas à les remplacer. Il montre qu’on peut greffer une couche prédictive (I4.0) en aval, pour un coût marginal, parce que le vrai saut est logiciel.</w:t>
       </w:r>
     </w:p>
     <w:bookmarkEnd w:id="174"/>
@@ -22528,7 +22528,7 @@
         <w:pStyle w:val="FirstParagraph"/>
       </w:pPr>
       <w:r>
-        <w:t xml:space="preserve">La littérature rapporte d’excellentes performances pour les modèles ML de prédiction du taux de corrosion sur de grands jeux de données homogènes (Wei et al., 2024 ; Kuang et Long, 2024 ; Hu et al., 2024, avec des R² &gt; 0,96). Les résultats obtenus, plus modestes en valeur absolue, s’expliquent par un nombre d’essais réduit et, surtout, par le caractère inter-essais de la validation (LORO), bien plus exigeante qu’une validation intra-jeu. Le résultat marquant n’est pas tant la valeur du R² que sa structure : positif là où les conditions sont couvertes et répétées, négatif sinon. Cette lecture, rarement explicitée dans la littérature, constitue l’apport méthodologique de ce travail.</w:t>
+        <w:t xml:space="preserve">La littérature affiche d’excellentes performances pour les modèles ML de taux de corrosion, mais sur de grands jeux homogènes (Wei et al., 2024 ; Kuang et Long, 2024 ; Hu et al., 2024, avec des R² &gt; 0,96). Les résultats obtenus ici sont plus modestes en valeur absolue. Deux raisons à cela : un nombre d’essais réduit, et surtout une validation inter-essais (LORO) autrement plus dure qu’une validation intra-jeu. Le point marquant n’est pourtant pas la valeur du R². C’est sa structure : positif là où les conditions sont couvertes et répétées, négatif sinon. Cette lecture, rarement explicitée dans la littérature, est l’apport méthodologique du travail.</w:t>
       </w:r>
     </w:p>
     <w:bookmarkEnd w:id="175"/>
@@ -22546,7 +22546,7 @@
         <w:pStyle w:val="FirstParagraph"/>
       </w:pPr>
       <w:r>
-        <w:t xml:space="preserve">Structurer la boucle décision → action par un module GMAO maison léger, transposable à un CMMS open-source (GLPI) plutôt que par une suite propriétaire, offre un coût total de possession très faible (de l’ordre de quelques dizaines de dollars, contre 50–250 k USD pour SAP PM ou IBM Maximo), ouvrant la maintenance structurée aux PME industrielles africaines. Cette approche reste compatible avec un déploiement on-premise, exigé par les contraintes de sécurité industrielle (cas COTCO).</w:t>
+        <w:t xml:space="preserve">Confier la boucle décision → action à un module GMAO maison léger, transposable à un CMMS open-source (GLPI), plutôt qu’à une suite propriétaire, fait chuter le coût total de possession : quelques dizaines de dollars, contre 50–250 k USD pour SAP PM ou IBM Maximo. La maintenance structurée devient alors accessible aux PME industrielles africaines. Et l’approche reste compatible avec un déploiement on-premise, qu’imposent les contraintes de sécurité industrielle (cas COTCO).</w:t>
       </w:r>
     </w:p>
     <w:bookmarkEnd w:id="176"/>
@@ -22564,7 +22564,7 @@
         <w:pStyle w:val="FirstParagraph"/>
       </w:pPr>
       <w:r>
-        <w:t xml:space="preserve">Limites matérielles : le fil de fer utilisé n’est pas le matériau des pipelines COTCO (acier API 5L). Les valeurs absolues de</w:t>
+        <w:t xml:space="preserve">Côté matériel d’abord. Le fil de fer employé n’est pas l’acier API 5L des pipelines COTCO : les valeurs absolues de</w:t>
       </w:r>
       <w:r>
         <w:t xml:space="preserve"> </w:t>
@@ -22580,7 +22580,7 @@
         <w:t xml:space="preserve"> </w:t>
       </w:r>
       <w:r>
-        <w:t xml:space="preserve">ne sont pas directement transposables, limitation assumée dans une preuve de concept visant à valider la chaîne et la méthode. Par ailleurs, en HCl concentré, l’électrolyte conducteur shunte partiellement la mesure ER (un courant parasite circule dans la solution en parallèle du fil), ce qui plafonne la résistance mesurable et peut masquer la rupture des fils épais ; ce phénomène physique impose l’emploi d’un fil fin (Ø ≈ 1,15 mm), qui rompt sous le plafond de mesure et rend l’événement de défaillance observable. Ce même couplage explique le comportement post-rupture : une fois le fil sectionné, le courant continue de transiter par l’électrolyte (et un éventuel dernier filament métallique), si bien que la résistance apparente reste élevée et croissante jusqu’à l’ouverture franche du circuit. La portion terminale du signal</w:t>
+        <w:t xml:space="preserve">ne sont donc pas directement transposables, limite assumée pour une preuve de concept qui vise à valider la chaîne et la méthode. Autre point, propre au HCl concentré : l’électrolyte conducteur shunte en partie la mesure ER, un courant parasite circulant dans la solution en parallèle du fil. Cela plafonne la résistance mesurable et peut masquer la rupture des fils épais. D’où le choix d’un fil fin (Ø ≈ 1,15 mm), qui rompt sous le plafond de mesure et rend la défaillance observable. Le même couplage explique le comportement post-rupture : le fil sectionné, le courant continue de passer par l’électrolyte, et par un éventuel dernier filament métallique, si bien que la résistance apparente reste élevée et croît jusqu’à l’ouverture franche du circuit. Cette portion terminale de</w:t>
       </w:r>
       <w:r>
         <w:t xml:space="preserve"> </w:t>
@@ -22593,7 +22593,7 @@
         <w:t xml:space="preserve">R</w:t>
       </w:r>
       <w:r>
-        <w:t xml:space="preserve">(t) relève donc d’une conduction électrolytique, non métallique : elle ne traduit plus l’état du fil et est, à ce titre, tronquée au seuil de saturation (</w:t>
+        <w:t xml:space="preserve">(t) relève d’une conduction électrolytique, non métallique ; elle ne dit plus rien de l’état du fil, et se trouve tronquée au seuil de saturation (</w:t>
       </w:r>
       <w:r>
         <w:rPr>
@@ -22602,7 +22602,7 @@
         <w:t xml:space="preserve">rx &gt; 100 Ω</w:t>
       </w:r>
       <w:r>
-        <w:t xml:space="preserve">) puis exclue de l’apprentissage (§II.4.4). Cette limitation, propre aux sondes ER en milieu très conducteur, est documentée dans la littérature de la mesure de corrosion (Roberge, 2008 ; Mansfeld, 2014).</w:t>
+        <w:t xml:space="preserve">) puis exclue de l’apprentissage (§II.4.4). Le phénomène, propre aux sondes ER en milieu très conducteur, est bien documenté (Roberge, 2008 ; Mansfeld, 2014).</w:t>
       </w:r>
     </w:p>
     <w:p>
@@ -22610,7 +22610,7 @@
         <w:pStyle w:val="BodyText"/>
       </w:pPr>
       <w:r>
-        <w:t xml:space="preserve">Limites du jeu de données : le nombre d’essais exploités à ce stade reste réduit, ce qui rend les métriques bruitées (un même essai peut voir son R² varier sensiblement selon la composition du jeu d’entraînement). La campagne en cours vise précisément à augmenter ce volume.</w:t>
+        <w:t xml:space="preserve">Le jeu de données, ensuite, reste mince. Peu d’essais, donc des métriques bruitées : un même essai peut voir son R² bouger sensiblement selon la composition du jeu d’entraînement. La campagne en cours vise justement à gonfler ce volume.</w:t>
       </w:r>
     </w:p>
     <w:p>
@@ -22618,7 +22618,7 @@
         <w:pStyle w:val="BodyText"/>
       </w:pPr>
       <w:r>
-        <w:t xml:space="preserve">Limites de la couverture thermique : une seule plage (~30 °C) est aujourd’hui couverte par plusieurs essais répétés ; la plage ~32 °C n’est représentée que par un essai unique (Run #11), ce qui interdit encore toute validation croisée à cette température.</w:t>
+        <w:t xml:space="preserve">La couverture thermique est partielle. Une seule plage (~30 °C) est aujourd’hui répétée sur plusieurs essais ; la plage ~32 °C n’a qu’un représentant, Run #11, ce qui interdit encore toute validation croisée à cette température.</w:t>
       </w:r>
     </w:p>
     <w:p>
@@ -22626,7 +22626,7 @@
         <w:pStyle w:val="BodyText"/>
       </w:pPr>
       <w:r>
-        <w:t xml:space="preserve">Limites de la validation : l’absence de coupon gravimétrique parallèle prive ce travail d’une validation indépendante du</w:t>
+        <w:t xml:space="preserve">Enfin, aucun coupon gravimétrique n’a été placé en parallèle, ce qui prive le travail d’une validation indépendante du</w:t>
       </w:r>
       <w:r>
         <w:t xml:space="preserve"> </w:t>
@@ -22639,7 +22639,7 @@
         <w:t xml:space="preserve">CR</w:t>
       </w:r>
       <w:r>
-        <w:t xml:space="preserve">. Cette double validation ER + gravimétrie est recommandée pour la suite.</w:t>
+        <w:t xml:space="preserve">. Cette double validation, ER et gravimétrie, est à prévoir pour la suite.</w:t>
       </w:r>
     </w:p>
     <w:bookmarkEnd w:id="177"/>
@@ -22867,7 +22867,7 @@
         <w:pStyle w:val="FirstParagraph"/>
       </w:pPr>
       <w:r>
-        <w:t xml:space="preserve">Ce chapitre a présenté les résultats provisoires de la campagne. OS1 : la chaîne d’acquisition ER est fonctionnelle et a permis de suivre sans interruption une série d’essais run-to-failure complets jusqu’à la rupture. OS2 : le modèle XGBoost prédit le taux de corrosion et surpasse les méthodes de référence, mais sa performance dépend de la couverture des conditions. OS3 : l’analyse a établi que la température est la variable dominante et que la répétabilité des conditions, couverture thermique, qualité de régulation, constance de la concentration, conditionne la fiabilité de la prédiction ; deux contre-exemples (Run #15, Run #17) l’ont démontré expérimentalement. OS4 : l’écran de supervision et le module GMAO maison (génération automatique d’ordres de travail, KPIs) sont opérationnels et démontrent la boucle Sonde → ML → OT de bout en bout, l’intégration à un CMMS open-source mature (GLPI) restant une spécification transposable. Au regard de l’état d’avancement, les objectifs sont partiellement atteints et en voie de consolidation par les essais en cours. La conclusion générale dresse le bilan d’ensemble et les perspectives.</w:t>
+        <w:t xml:space="preserve">Ce chapitre a présenté les résultats provisoires de la campagne. Pour OS1, la chaîne d’acquisition ER s’est révélée fonctionnelle : elle a suivi sans interruption une série d’essais run-to-failure complets, jusqu’à la rupture. Pour OS2, le modèle XGBoost prédit le taux de corrosion et devance les méthodes de référence, mais sa performance tient à la couverture des conditions. OS3 a montré que la température domine, et que la répétabilité des conditions, couverture thermique, qualité de régulation, constance de la concentration, fait la fiabilité de la prédiction ; deux contre-exemples, Run #15 et Run #17, l’ont établi expérimentalement. Pour OS4 enfin, l’écran de supervision et le module GMAO maison, avec génération automatique d’ordres de travail et calcul des KPI, sont opérationnels : ils démontrent la boucle Sonde → ML → OT de bout en bout, l’intégration à un CMMS open-source mature (GLPI) restant une spécification transposable. Au bilan, les objectifs sont partiellement atteints et en cours de consolidation par les essais en cours. La conclusion générale en dresse la synthèse d’ensemble et les perspectives.</w:t>
       </w:r>
     </w:p>
     <w:p>

</xml_diff>

<commit_message>
memoire: conclusion generale restructuree en 4 paragraphes, 1 page A4
Structure imposee : probleme resolu / methodologie appliquee / resultats /
perspectives (fusion des anciens 8 paragraphes OS1-4 + Contributions + Limites +
Recommandations). Contenu resserre iterativement (verifie empiriquement par
export PDF COM a chaque passe) pour tenir sur 1 page A4 : la conclusion occupe
desormais entierement la page 94, plus aucun debordement sur la page 95.

Fidelite verifiee : +0,29, -1,77, ISO 13381-1, API 5L, leave-one-run-out tous
presents et inchanges. Style deja etabli conserve (voix impersonnelle, zero gras).

Co-Authored-By: Claude Fable 5 <noreply@anthropic.com>
</commit_message>
<xml_diff>
--- a/memoire/Memoire_M2_Corrosion_BATOUMBI.docx
+++ b/memoire/Memoire_M2_Corrosion_BATOUMBI.docx
@@ -22891,7 +22891,15 @@
         <w:pStyle w:val="FirstParagraph"/>
       </w:pPr>
       <w:r>
-        <w:t xml:space="preserve">Ce mémoire s’est donné pour objectif de concevoir, développer et valider expérimentalement un système intégré de maintenance prédictive de la corrosion, matérialisant une transition Industrie 3.0 → 4.0 sur l’ensemble de la chaîne</w:t>
+        <w:t xml:space="preserve">Les pipelines exploités en Afrique centrale, celui de la COTCO en particulier, disposent déjà de sondes à résistance électrique pour surveiller la corrosion, mais à un niveau Industrie 3.0 : seuils fixes, aucun pronostic. Ce mémoire répond au problème de faire franchir à ces données déjà disponibles le pas vers une couche prédictive, sans remplacement matériel, transposable aux opérateurs déjà instrumentés comme aux PME africaines à budget réduit. Un prototype fonctionnel de bout en bout y répond, sa consolidation restant partielle.</w:t>
+      </w:r>
+    </w:p>
+    <w:p>
+      <w:pPr>
+        <w:pStyle w:val="BodyText"/>
+      </w:pPr>
+      <w:r>
+        <w:t xml:space="preserve">La démarche suit les cinq étapes de la norme ISO 13381-1 (détection, diagnostic, pronostic, décision, action), déclinées en quatre briques : une sonde ER instrumentée pour l’acquisition continue, un modèle XGBoost prédisant le taux de corrosion et validé par une procédure inter-essais</w:t>
       </w:r>
       <w:r>
         <w:t xml:space="preserve"> </w:t>
@@ -22901,21 +22909,13 @@
           <w:i/>
           <w:iCs/>
         </w:rPr>
-        <w:t xml:space="preserve">détection → diagnostic → pronostic → décision → action</w:t>
-      </w:r>
-      <w:r>
-        <w:t xml:space="preserve"> </w:t>
-      </w:r>
-      <w:r>
-        <w:t xml:space="preserve">(ISO 13381-1), et doublement transposable aux opérateurs déjà instrumentés (cas COTCO) comme aux PME industrielles africaines. Au terme du travail, le bilan des quatre objectifs spécifiques peut être dressé.</w:t>
-      </w:r>
-    </w:p>
-    <w:p>
-      <w:pPr>
-        <w:pStyle w:val="BodyText"/>
-      </w:pPr>
-      <w:r>
-        <w:t xml:space="preserve">OS1, Détection. La chaîne d’acquisition ER instrumentée (ESP32, HX711 24 bits, DS18B20) est fonctionnelle : elle suit en continu, au pas de 30 secondes, les variations de résistance d’un fil de fer en milieu acide concentré, et a permis de conduire sans interruption une série d’essais</w:t>
+        <w:t xml:space="preserve">leave-one-run-out</w:t>
+      </w:r>
+      <w:r>
+        <w:t xml:space="preserve"> </w:t>
+      </w:r>
+      <w:r>
+        <w:t xml:space="preserve">mesurant la généralisation à un essai jamais vu, un module de diagnostic classant les régimes de dégradation, et un module de gestion de maintenance générant automatiquement les ordres de travail. La campagne d’essais accélérés</w:t>
       </w:r>
       <w:r>
         <w:t xml:space="preserve"> </w:t>
@@ -22928,10 +22928,7 @@
         <w:t xml:space="preserve">run-to-failure</w:t>
       </w:r>
       <w:r>
-        <w:t xml:space="preserve"> </w:t>
-      </w:r>
-      <w:r>
-        <w:t xml:space="preserve">complets jusqu’à la rupture. Elle produit un format de données standardisé, exploitable indifféremment par le pipeline ML maison ou par l’export d’une sonde commerciale (QR1).</w:t>
+        <w:t xml:space="preserve">, fil de fer en milieu acide, reproduit en quelques heures un cycle de dégradation complet.</w:t>
       </w:r>
     </w:p>
     <w:p>
@@ -22939,23 +22936,7 @@
         <w:pStyle w:val="BodyText"/>
       </w:pPr>
       <w:r>
-        <w:t xml:space="preserve">OS2, Pronostic. Le modèle XGBoost prédit le taux de corrosion et surpasse les références (régression linéaire, prédiction par la moyenne). Sa validation inter-essais</w:t>
-      </w:r>
-      <w:r>
-        <w:t xml:space="preserve"> </w:t>
-      </w:r>
-      <w:r>
-        <w:rPr>
-          <w:i/>
-          <w:iCs/>
-        </w:rPr>
-        <w:t xml:space="preserve">leave-one-run-out</w:t>
-      </w:r>
-      <w:r>
-        <w:t xml:space="preserve"> </w:t>
-      </w:r>
-      <w:r>
-        <w:t xml:space="preserve">atteint un R² moyen positif (+0,29) sur la plage thermique couverte, mais ce résultat n’est pas automatique : il s’effondre (R² ≈ −1,77) lorsque les conditions de l’essai testé ne sont pas couvertes à l’entraînement. La durée de vie résiduelle est estimée par trois voies complémentaires (extrapolation physique, dérivé XGBoost, jumeau numérique). L’objectif de précision fixé a priori (RMSE &lt; 15 %) n’est pas encore atteint de façon stabilisée, le faible effectif d’essais rendant les métriques bruitées (QR2).</w:t>
+        <w:t xml:space="preserve">Le modèle XGBoost dépasse les méthodes de référence et atteint un R² moyen de +0,29 en validation inter-essais, à condition que les conditions testées aient été couvertes à l’entraînement ; sans cette couverture, la performance s’effondre à −1,77. La fiabilité se lit donc dans la structure de cette métrique, positive quand les conditions sont couvertes et répétées, négative sinon, plutôt que dans sa seule valeur absolue. La température se confirme comme variable dominante, la répétabilité des conditions expérimentales conditionnant cette fiabilité, ce que deux contre-exemples ont établi. Le module de gestion de maintenance génère les ordres de travail et calcule les indicateurs usuels de maintenance. Ces résultats restent à consolider : essais peu nombreux, une seule plage de température bien couverte, sans validation gravimétrique indépendante du taux de corrosion mesuré.</w:t>
       </w:r>
     </w:p>
     <w:p>
@@ -22963,47 +22944,7 @@
         <w:pStyle w:val="BodyText"/>
       </w:pPr>
       <w:r>
-        <w:t xml:space="preserve">OS3, Diagnostic et décision. Le module de diagnostic identifie correctement la succession des régimes (induction, croissance, emballement, pré-rupture). L’analyse a établi que la température est la variable dominante et, surtout, que la répétabilité des conditions, couverture thermique, qualité de régulation, constance de la concentration, conditionne la fiabilité de la prédiction ; deux contre-exemples (régulation dégradée, acide évaporé) l’ont démontré expérimentalement, auxquels s’ajoute une variabilité intrinsèque de la morphologie de dégradation. Un système d’alertes graduées (vert / orange / rouge) a été calibré sur les sorties CR et RUL (QR3).</w:t>
-      </w:r>
-    </w:p>
-    <w:p>
-      <w:pPr>
-        <w:pStyle w:val="BodyText"/>
-      </w:pPr>
-      <w:r>
-        <w:t xml:space="preserve">OS4, Action. L’application web Streamlit et le module GMAO maison sont opérationnels : ils génèrent et tracent automatiquement les ordres de travail à partir des alertes prédictives, et calculent les KPIs de maintenance (MTBF, MTTR, disponibilité). Le mapping prédiction → ordre de travail est défini de façon générique, transposable par API REST à un CMMS open-source ; cette intégration reste, à ce stade, au statut de spécification (QR4).</w:t>
-      </w:r>
-    </w:p>
-    <w:p>
-      <w:pPr>
-        <w:pStyle w:val="BodyText"/>
-      </w:pPr>
-      <w:r>
-        <w:t xml:space="preserve">Contributions. L’apport méthodologique central n’est pas la valeur absolue du R² mais la lecture de sa structure : la prédiction inter-essais est fiable là où les conditions sont couvertes et répétées, et échoue sinon, lecture rarement explicitée dans une littérature dominée par les validations intra-jeu. Le travail démontre par ailleurs qu’une couche prédictive I4.0 peut être ajoutée pour un coût marginal, en aval d’une instrumentation existante ou de façon autonome, et qu’une boucle décision → action structurée est accessible sans licence propriétaire.</w:t>
-      </w:r>
-    </w:p>
-    <w:p>
-      <w:pPr>
-        <w:pStyle w:val="BodyText"/>
-      </w:pPr>
-      <w:r>
-        <w:t xml:space="preserve">Limites. Le matériau retenu (fil de fer) n’est pas l’acier API 5L des pipelines : les valeurs absolues de CR ne sont pas directement transposables. Le nombre d’essais reste réduit (métriques bruitées), une seule plage thermique est aujourd’hui couverte par plusieurs répétitions, et l’absence de coupon gravimétrique parallèle prive le travail d’une validation indépendante du CR.</w:t>
-      </w:r>
-    </w:p>
-    <w:p>
-      <w:pPr>
-        <w:pStyle w:val="BodyText"/>
-      </w:pPr>
-      <w:r>
-        <w:t xml:space="preserve">Recommandations et perspectives. Pour COTCO, le pipeline ML est applicable directement aux flux des sondes ER déjà en place via export DCS, sans remplacement matériel, la chaîne d’acquisition autonome ESP32 constituant une option d’extension pour les sections non câblées. Pour les PME industrielles africaines, l’architecture module GMAO ↔ CMMS open-source ouvre une démocratisation effective de la maintenance assistée par ordinateur, sans licence propriétaire. Pour les travaux futurs, la campagne se poursuit selon quatre axes : compléter la couverture thermique par des essais répétés au sein d’une même morphologie, consolider les métriques sur un volume accru, adjoindre une validation gravimétrique, et finaliser l’automatisation de la boucle alerte → ticket CMMS. La transposition aux conditions industrielles réelles (acier API 5L, conditions de procédé) constitue l’objet du stage en entreprise prévu à la suite de ce mémoire.</w:t>
-      </w:r>
-    </w:p>
-    <w:p>
-      <w:pPr>
-        <w:pStyle w:val="BodyText"/>
-      </w:pPr>
-      <w:r>
-        <w:t xml:space="preserve">En définitive, les objectifs sont partiellement atteints et en voie de consolidation : le système intégré est fonctionnel de bout en bout, et le travail établit les conditions méthodologiques, couverture et répétabilité, sous lesquelles la maintenance prédictive de la corrosion devient fiable et transposable au contexte industriel africain.</w:t>
+        <w:t xml:space="preserve">La suite du travail porte sur quatre axes : compléter la couverture thermique par des essais répétés au sein d’une même morphologie, consolider les métriques sur un volume accru, adjoindre une validation gravimétrique, et automatiser la boucle alerte-ticket. Le pipeline s’applique aux sondes déjà en place chez la COTCO ; pour les PME africaines, il ouvre une maintenance assistée par ordinateur sans licence propriétaire. La transposition à l’acier API 5L reste l’objet du stage suivant ce mémoire.</w:t>
       </w:r>
     </w:p>
     <w:p>

</xml_diff>